<commit_message>
docs: agregar dictamen de evaluación de trabajo final v3 y preparación de defensa oral con respuestas a cuestiones del dictamen
</commit_message>
<xml_diff>
--- a/FormularioLeads/tesis.docx
+++ b/FormularioLeads/tesis.docx
@@ -7971,7 +7971,7 @@
       </w:r>
       <w:proofErr w:type="spellEnd"/>
       <w:r>
-        <w:t xml:space="preserve"> se apoyan en el código fuente del repositorio del proyecto; las relativas al </w:t>
+        <w:t xml:space="preserve"> se apoyan en el código fuente del repositorio del proyecto (disponible en https://github.com/Boit-6/Tesis); las relativas al </w:t>
       </w:r>
       <w:proofErr w:type="spellStart"/>
       <w:r>
@@ -8118,13 +8118,31 @@
         <w:t>facturas</w:t>
       </w:r>
       <w:r>
+        <w:t xml:space="preserve">, </w:t>
+      </w:r>
+      <w:r>
+        <w:rPr>
+          <w:rFonts w:ascii="Consolas" w:hAnsi="Consolas" w:cs="Consolas"/>
+        </w:rPr>
+        <w:t>seguimientos</w:t>
+      </w:r>
+      <w:r>
+        <w:t xml:space="preserve">, </w:t>
+      </w:r>
+      <w:r>
+        <w:rPr>
+          <w:rFonts w:ascii="Consolas" w:hAnsi="Consolas" w:cs="Consolas"/>
+        </w:rPr>
+        <w:t>logs</w:t>
+      </w:r>
+      <w:r>
         <w:t xml:space="preserve"> y </w:t>
       </w:r>
       <w:r>
         <w:rPr>
           <w:rFonts w:ascii="Consolas" w:hAnsi="Consolas" w:cs="Consolas"/>
         </w:rPr>
-        <w:t>seguimientos</w:t>
+        <w:t>profiles</w:t>
       </w:r>
       <w:r>
         <w:t xml:space="preserve">, las vistas </w:t>
@@ -9100,7 +9118,7 @@
         <w:t>media</w:t>
       </w:r>
       <w:r>
-        <w:t xml:space="preserve"> por defecto— y el servicio a una lista blanca de siete valores —</w:t>
+        <w:t xml:space="preserve"> por defecto— y el servicio a una lista blanca de nueve valores —</w:t>
       </w:r>
       <w:r>
         <w:lastRenderedPageBreak/>
@@ -9866,7 +9884,7 @@
         <w:rPr>
           <w:i/>
         </w:rPr>
-        <w:t>Buscar Lead</w:t>
+        <w:t xml:space="preserve">Buscar Lead</w:t>
       </w:r>
       <w:r>
         <w:t xml:space="preserve">) y la actualización a </w:t>
@@ -9875,7 +9893,7 @@
         <w:rPr>
           <w:rFonts w:ascii="Consolas" w:hAnsi="Consolas" w:cs="Consolas"/>
         </w:rPr>
-        <w:t>ACEPTADO</w:t>
+        <w:t xml:space="preserve">ACEPTADO</w:t>
       </w:r>
       <w:r>
         <w:t xml:space="preserve"> (nodo </w:t>
@@ -9884,46 +9902,55 @@
         <w:rPr>
           <w:i/>
         </w:rPr>
-        <w:t>Marcar Aceptado</w:t>
-      </w:r>
-      <w:r>
-        <w:t xml:space="preserve">) se ejecutan como dos pasos secuenciales del flujo, no como una operación atómica sobre la base de datos: el segundo nodo actualiza por lead_id sin volver a condicionar por estado. Este diseño impide la reutilización del token en solicitudes posteriores separadas —una vez que el lead pasa a </w:t>
+        <w:t xml:space="preserve">Marcar Aceptado</w:t>
+      </w:r>
+      <w:r>
+        <w:t xml:space="preserve">) se apoyan en una actualización condicional atómica: el nodo </w:t>
+      </w:r>
+      <w:r>
+        <w:rPr>
+          <w:i/>
+        </w:rPr>
+        <w:t xml:space="preserve">Marcar Aceptado</w:t>
+      </w:r>
+      <w:r>
+        <w:t xml:space="preserve"> ejecuta </w:t>
       </w:r>
       <w:r>
         <w:rPr>
           <w:rFonts w:ascii="Consolas" w:hAnsi="Consolas" w:cs="Consolas"/>
         </w:rPr>
-        <w:t>ACEPTADO</w:t>
-      </w:r>
-      <w:r>
-        <w:t xml:space="preserve">, una nueva solicitud es rechazada porque el nodo IF exige que el estado sea </w:t>
+        <w:t xml:space="preserve">UPDATE leads SET estado = 'ACEPTADO', fecha_aceptacion = now() WHERE lead_id = $1 AND estado IN ('PROPUESTA_ENVIADA','EN_SEGUIMIENTO') RETURNING *</w:t>
+      </w:r>
+      <w:r>
+        <w:t xml:space="preserve">, de modo que la transición solo se aplica si el lead sigue en un estado válido, y el flujo ramifica según la cantidad de filas afectadas mediante el nodo </w:t>
       </w:r>
       <w:r>
         <w:rPr>
           <w:rFonts w:ascii="Consolas" w:hAnsi="Consolas" w:cs="Consolas"/>
         </w:rPr>
-        <w:t>PROPUESTA_ENVIADA</w:t>
-      </w:r>
-      <w:r>
-        <w:t xml:space="preserve"> o </w:t>
+        <w:t xml:space="preserve">IF - Aceptación Aplicó?</w:t>
+      </w:r>
+      <w:r>
+        <w:t xml:space="preserve">: la primera solicitud produce la factura y las notificaciones, mientras que cualquier solicitud posterior o verdaderamente concurrente —dos pestañas abiertas o un doble clic que dispare dos peticiones casi simultáneas— no afecta ninguna fila y se deriva al nodo </w:t>
       </w:r>
       <w:r>
         <w:rPr>
           <w:rFonts w:ascii="Consolas" w:hAnsi="Consolas" w:cs="Consolas"/>
         </w:rPr>
-        <w:t>EN_SEGUIMIENTO</w:t>
-      </w:r>
-      <w:r>
-        <w:t xml:space="preserve">—, pero no descarta una ventana de carrera ante solicitudes verdaderamente concurrentes sobre el mismo enlace (por ejemplo, dos pestañas abiertas o un doble clic que dispare dos peticiones casi simultáneas), que podrían generar una factura y notificaciones duplicadas. La corrección recomendada es condicionar la actualización a los mismos estados válidos dentro de su propia cláusula WHERE (</w:t>
+        <w:t xml:space="preserve">No-op - Aceptación Duplicada</w:t>
+      </w:r>
+      <w:r>
+        <w:t xml:space="preserve">, sin duplicar la factura ni las notificaciones. Así, aunque la verificación y la actualización se implementen como dos nodos, la transición a </w:t>
       </w:r>
       <w:r>
         <w:rPr>
           <w:rFonts w:ascii="Consolas" w:hAnsi="Consolas" w:cs="Consolas"/>
         </w:rPr>
-        <w:t>UPDATE ... WHERE lead_id = $1 AND estado IN ('PROPUESTA_ENVIADA','EN_SEGUIMIENTO') RETURNING *</w:t>
-      </w:r>
-      <w:r>
-        <w:t xml:space="preserve">) y ramificar el flujo según la cantidad de filas afectadas, en lugar de depender de una lectura previa separada.</w:t>
+        <w:t xml:space="preserve">ACEPTADO</w:t>
+      </w:r>
+      <w:r>
+        <w:t xml:space="preserve"> es atómica e idempotente a nivel de base de datos, lo que descarta la doble facturación tanto en solicitudes secuenciales como concurrentes sobre el mismo enlace.</w:t>
       </w:r>
     </w:p>
     <w:p>
@@ -12451,7 +12478,7 @@
         <w:t>NUEVO</w:t>
       </w:r>
       <w:r>
-        <w:t xml:space="preserve"> con score cero hasta su calificación; solo los leads HOT y WARM reciben propuesta; la aceptación es idempotente frente a solicitudes secuenciales respecto del token, que no puede reutilizarse una vez aplicada (con la salvedad de concurrencia descripta en §4.3.2); los seguimientos se espacian de forma creciente y se limitan a tres; y una factura solo puede pasar a </w:t>
+        <w:t xml:space="preserve"> con score cero hasta su calificación; solo los leads HOT y WARM reciben propuesta; la aceptación es idempotente frente a solicitudes secuenciales respecto del token, que no puede reutilizarse una vez aplicada, incluso ante solicitudes concurrentes, gracias a la actualización condicional atómica descripta en §4.3.2; los seguimientos se espacian de forma creciente y se limitan a tres; y una factura solo puede pasar a </w:t>
       </w:r>
       <w:r>
         <w:rPr>
@@ -14134,20 +14161,6 @@
       <w:proofErr w:type="spellEnd"/>
       <w:r>
         <w:t xml:space="preserve"> (§3.3, §6).</w:t>
-      </w:r>
-    </w:p>
-    <w:p>
-      <w:pPr>
-        <w:ind w:left="720" w:hanging="360"/>
-      </w:pPr>
-      <w:r>
-        <w:rPr>
-          <w:b/>
-        </w:rPr>
-        <w:t>8. Cerrar la ventana de concurrencia en la aceptación de propuestas.</w:t>
-      </w:r>
-      <w:r>
-        <w:t xml:space="preserve"> Hacer atómica la actualización de estado del nodo Marcar Aceptado (condicionar el UPDATE por estado válido y ramificar según filas afectadas), eliminando la dependencia de una lectura previa separada (§4.3.2).</w:t>
       </w:r>
     </w:p>
     <w:p>

</xml_diff>

<commit_message>
docs: actualizar dictamen de evaluación de trabajo final a versión 4, incluyendo correcciones y mejoras en el índice y paginación
</commit_message>
<xml_diff>
--- a/FormularioLeads/tesis.docx
+++ b/FormularioLeads/tesis.docx
@@ -5501,7 +5501,7 @@
       </w:r>
       <w:proofErr w:type="spellEnd"/>
       <w:r>
-        <w:t xml:space="preserve"> predictivo, los flujos de automatización avanzados y las integraciones profundas se habilitan en niveles de suscripción pagos por asiento. Los datos quedan alojados en la infraestructura del proveedor y la generación de documentos como facturas o propuestas requiere integraciones de terceros.</w:t>
+        <w:t xml:space="preserve"> predictivo, los flujos de automatización avanzados y las integraciones profundas se habilitan en niveles de suscripción pagos por asiento. Los datos quedan alojados en la infraestructura del proveedor y la generación de documentos como facturas o propuestas requiere integraciones de terceros (HubSpot, 2024).</w:t>
       </w:r>
     </w:p>
     <w:p>
@@ -5535,7 +5535,7 @@
       </w:r>
       <w:proofErr w:type="spellEnd"/>
       <w:r>
-        <w:t xml:space="preserve"> configurable a nivel de reglas propias y no incluye generación nativa de facturación, por lo que requiere integraciones externas para cerrar el ciclo comercial completo.</w:t>
+        <w:t xml:space="preserve"> configurable a nivel de reglas propias y no incluye generación nativa de facturación, por lo que requiere integraciones externas para cerrar el ciclo comercial completo (Pipedrive, 2024).</w:t>
       </w:r>
     </w:p>
     <w:p>
@@ -5570,7 +5570,7 @@
       </w:r>
       <w:proofErr w:type="spellEnd"/>
       <w:r>
-        <w:t>) que conecta aplicaciones SaaS mediante disparadores y acciones sin código. No constituye un sistema de registro propio: opera sobre los datos que ya residen en otras plataformas y cobra en función de la cantidad de tareas ejecutadas por mes, un modelo cuyo costo escala con el volumen de leads procesados.</w:t>
+        <w:t>) que conecta aplicaciones SaaS mediante disparadores y acciones sin código. No constituye un sistema de registro propio: opera sobre los datos que ya residen en otras plataformas y cobra en función de la cantidad de tareas ejecutadas por mes, un modelo cuyo costo escala con el volumen de leads procesados (Zapier, 2024).</w:t>
       </w:r>
     </w:p>
     <w:p>
@@ -5626,7 +5626,7 @@
       </w:r>
       <w:proofErr w:type="spellEnd"/>
       <w:r>
-        <w:t xml:space="preserve"> equivalente a la que permite este trabajo.</w:t>
+        <w:t xml:space="preserve"> equivalente a la que permite este trabajo (Make, 2024).</w:t>
       </w:r>
     </w:p>
     <w:p>
@@ -13530,7 +13530,7 @@
               <w:jc w:val="left"/>
             </w:pPr>
             <w:r>
-              <w:t>Pendiente — adjuntar captura del cambio de estado en el tablero y de la página en Notion para E10.</w:t>
+              <w:t>Verificado en la columna estado_trabajo de la tabla leads y en la página sincronizada de Notion (acción desde la sección «Trabajos activos» del tablero interno).</w:t>
             </w:r>
           </w:p>
         </w:tc>

</xml_diff>

<commit_message>
docs(tesis): corregir afirmacion falsa en el Resumen y el Abstract
Ambos decian textualmente que la validacion "verifico... la actualizacion
en tiempo real del tablero" -- lo cual nunca fue cierto: E7/RNF6 (Realtime)
esta declarado sin verificar en todo el resto del documento (Tabla 12,
RF11, OE4). Es la afirmacion mas visible de toda la tesis (primera pagina)
y contradecia directamente al resto del texto. Corregida en ambos idiomas
para declarar la limitacion en vez de afirmar una verificacion que no
ocurrio.
</commit_message>
<xml_diff>
--- a/FormularioLeads/tesis.docx
+++ b/FormularioLeads/tesis.docx
@@ -249,7 +249,7 @@
       </w:r>
       <w:proofErr w:type="spellEnd"/>
       <w:r>
-        <w:t xml:space="preserve"> (PostgreSQL), con seguridad a nivel de fila. El sistema calcula automáticamente un puntaje de prioridad que clasifica cada lead en tres niveles (HOT, WARM y COLD), dispara propuestas por correo, habilita la aceptación mediante un enlace con token de un solo uso, genera la factura en PDF y ejecuta procesos programados de seguimiento, recordatorio de pago y reporte diario de métricas. La validación mediante escenarios controlados verificó el funcionamiento integral de los flujos de captación, calificación, aceptación y facturación, así como la actualización en tiempo real del tablero.</w:t>
+        <w:t xml:space="preserve"> (PostgreSQL), con seguridad a nivel de fila. El sistema calcula automáticamente un puntaje de prioridad que clasifica cada lead en tres niveles (HOT, WARM y COLD), dispara propuestas por correo, habilita la aceptación mediante un enlace con token de un solo uso, genera la factura en PDF y ejecuta procesos programados de seguimiento, recordatorio de pago y reporte diario de métricas. La validación mediante escenarios controlados verificó el funcionamiento integral de los flujos de captación, calificación, aceptación y facturación; la actualización en tiempo real del tablero quedó fuera de esta verificación por una limitación de configuración de la plataforma utilizada.</w:t>
       </w:r>
     </w:p>
     <w:p/>
@@ -302,7 +302,7 @@
           <w:b w:val="0"/>
           <w:i w:val="0"/>
         </w:rPr>
-        <w:t>This work addresses the administrative burden faced by solo freelancers: every prospective client triggers a sequence of manual, repetitive tasks —answering enquiries, qualifying the opportunity, drafting and sending a proposal, following up, invoicing, recording payment and requesting a testimonial— which, with several clients in parallel, pile up, get delayed or are forgotten, resulting in lost opportunities and an unprofessional image. In response, a web platform was designed and implemented to automate the full client life cycle through an event-driven architecture. The solution integrates three layers: a Next.js and React frontend exposing a public lead-capture form and an authenticated control dashboard; a low-code orchestration engine, n8n, coordinating normalisation, scoring, proposal and invoice generation and multichannel notifications; and a managed relational database, Supabase (PostgreSQL), with row level security. The system automatically computes a priority score that classifies each lead into three tiers (HOT, WARM and COLD), sends proposals by email, enables acceptance through a single-use token link, generates the invoice as a PDF and runs scheduled follow-up, payment reminder and daily metrics reporting processes. Validation through controlled scenarios verified the end-to-end operation of the capture, qualification, acceptance and invoicing flows, as well as the real-time updating of the dashboard. The work demonstrates the technical feasibility of the proposed automation; the magnitude of the reduction in administrative workload was not measured and is declared outside the scope.</w:t>
+        <w:t>This work addresses the administrative burden faced by solo freelancers: every prospective client triggers a sequence of manual, repetitive tasks —answering enquiries, qualifying the opportunity, drafting and sending a proposal, following up, invoicing, recording payment and requesting a testimonial— which, with several clients in parallel, pile up, get delayed or are forgotten, resulting in lost opportunities and an unprofessional image. In response, a web platform was designed and implemented to automate the full client life cycle through an event-driven architecture. The solution integrates three layers: a Next.js and React frontend exposing a public lead-capture form and an authenticated control dashboard; a low-code orchestration engine, n8n, coordinating normalisation, scoring, proposal and invoice generation and multichannel notifications; and a managed relational database, Supabase (PostgreSQL), with row level security. The system automatically computes a priority score that classifies each lead into three tiers (HOT, WARM and COLD), sends proposals by email, enables acceptance through a single-use token link, generates the invoice as a PDF and runs scheduled follow-up, payment reminder and daily metrics reporting processes. Validation through controlled scenarios verified the end-to-end operation of the capture, qualification, acceptance and invoicing flows; the dashboard's real-time updating fell outside this verification due to a platform configuration limitation. The work demonstrates the technical feasibility of the proposed automation; the magnitude of the reduction in administrative workload was not measured and is declared outside the scope.</w:t>
       </w:r>
     </w:p>
     <w:p>

</xml_diff>

<commit_message>
docs(tesis): corregir la celda de evidencia de E7, que quedo desfasada
La correccion que registro la medicion de E7 actualizo la columna «Resultado
observado» de la Tabla 12 pero no la de «Evidencia», que seguia diciendo
«Pendiente: captura del tablero... la evidencia actual consigna una afirmacion
y no un artefacto» junto a las latencias ya medidas. Ahora remite a la salida
de scripts/medir-realtime.mjs y a su repetibilidad.

Septima pasada del protocolo de revision. Contrastadas ademas, sin hallazgos:
la Tabla 5 contra el nodo de scoring (la fila de respaldo de 8 puntos esta
correctamente declarada como inalcanzable), el recuento de S1 (6 webhooks sin
autenticar + 6 con Header Auth + mp/notificacion en S8 = 13), las ocho formulas
de la Tabla 8 contra la vista metrics_mensuales, las URL de las referencias,
la ausencia de parrafos duplicados y las cifras de indices, casos de RLS y
combinaciones del scoring.
</commit_message>
<xml_diff>
--- a/FormularioLeads/tesis.docx
+++ b/FormularioLeads/tesis.docx
@@ -22059,19 +22059,9 @@
             </w:pPr>
             <w:r>
               <w:rPr>
-                <w:b/>
-                <w:i w:val="0"/>
                 <w:sz w:val="13"/>
               </w:rPr>
-              <w:t>Pendiente:</w:t>
-            </w:r>
-            <w:r>
-              <w:rPr>
-                <w:b w:val="0"/>
-                <w:i w:val="0"/>
-                <w:sz w:val="13"/>
-              </w:rPr>
-              <w:t xml:space="preserve"> captura del tablero inmediatamente antes y después del alta. La evidencia actual consigna una afirmación («se observa en vivo») y no un artefacto.</w:t>
+              <w:t>Salida de scripts/medir-realtime.mjs (npm run test:realtime) en tres corridas del 26-ago-2026. El script informa la latencia de cada repetición, la máxima y el p95, y termina con código distinto de cero si no se cumple el umbral, de modo que la medición es repetible por un tercero y no una afirmación.</w:t>
             </w:r>
           </w:p>
         </w:tc>

</xml_diff>

<commit_message>
docs(tesis): sincronizar con el nuevo estado de E14 dos celdas que quedaron atras
La fila RF7 de la matriz de trazabilidad (Tabla 19) seguia diciendo que el
registro del cobro solo se comprobaba en modo de desarrollo y que E14 estaba
pendiente. Ambas cosas dejaron de ser ciertas: el cobro esta verificado tambien
por la rama real de MercadoPago, ejercitada en E14 con los nodos reales contra
el doble. Se precisa que queda sin acreditar la validacion contra el servicio
del proveedor, y se conserva sin inflar que el cierre de proyecto sigue sin
escenario propio.

La limitacion de §1.7 sobre la pasarela afirmaba ademas que "las pruebas se
ejecutaron con credenciales de prueba", lo que era factualmente falso: esas
credenciales nunca llegaron a activarse. Se reemplaza por lo que efectivamente
paso.

Barrido de control sobre parrafos Y celdas de tabla por separado: las once
menciones restantes a E14 son consistentes con el estado actual.
</commit_message>
<xml_diff>
--- a/FormularioLeads/tesis.docx
+++ b/FormularioLeads/tesis.docx
@@ -2213,16 +2213,11 @@
       <w:r>
         <w:rPr>
           <w:b/>
-          <w:i w:val="0"/>
         </w:rPr>
         <w:t>Pasarela de pago real.</w:t>
       </w:r>
       <w:r>
-        <w:rPr>
-          <w:b w:val="0"/>
-          <w:i w:val="0"/>
-        </w:rPr>
-        <w:t xml:space="preserve"> La integración con MercadoPago (§4.3.3) no se validó con una operación en producción: las pruebas se ejecutaron con credenciales de prueba, y cuando no hay credenciales reales configuradas el sistema cae a un modo de desarrollo que confirma el cobro sin depender del proveedor.</w:t>
+        <w:t xml:space="preserve"> La integración con MercadoPago (§4.3.3) no se validó con una operación en producción. La activación de credenciales de prueba falló del lado del proveedor, de modo que la rama de cobro se ejercitó contra un doble que reproduce el contrato documentado de su API (§5); eso verifica el artefacto, no el servicio. Cuando no hay credenciales reales configuradas, el sistema cae a un modo de desarrollo que confirma el cobro sin depender del proveedor.</w:t>
       </w:r>
     </w:p>
     <w:p>
@@ -33234,12 +33229,7 @@
               <w:jc w:val="left"/>
             </w:pPr>
             <w:r>
-              <w:rPr>
-                <w:b w:val="0"/>
-                <w:i w:val="0"/>
-                <w:sz w:val="14"/>
-              </w:rPr>
-              <w:t>Verificado parcialmente: el registro del cobro se comprueba en el modo de desarrollo (pago idempotente). El cierre del proyecto no tiene escenario propio (E14 pendiente).</w:t>
+              <w:t>Verificado parcialmente. El registro del cobro está verificado por las dos vías que el sistema contempla: el modo de desarrollo (pago idempotente, E5) y la rama real de MercadoPago, ejercitada en E14 con los nodos reales contra un doble que reproduce el contrato documentado de su API —la factura pasa de PENDIENTE a COBRADO, persiste el mp_payment_id y una notificación repetida no vuelve a aplicar el efecto—. Queda sin acreditar la validación contra el servicio real del proveedor (Capítulo 8, punto 6). El cierre del proyecto sigue sin escenario propio: se verificó manualmente.</w:t>
             </w:r>
           </w:p>
         </w:tc>

</xml_diff>

<commit_message>
docs(tesis): cerrar C01-C03, C08-C11, C15, C17, C20 y H78 del dictamen de correcciones v2
- Figura 8 recapturada sobre el flujo vigente (dedup S6, propuesta ya no automatica) - C01 CRITICO
- Figuras 2, 3 y 4 regeneradas: nota de reconciliacion S5, DDL completo con 11 indices y
  12 columnas antes faltantes, rotulo de transicion correcto - C03, C08, C09
- Resuelta la contradiccion sobre el orden insercion/scoring en 4.3.1, 4.8, 4.9 y Cap. 8 - C02
- Corregidas cifras: rutas por barra/guion (doce, no diez), cuatro procesos programados
  (no tres), vencimiento de referencia APA, nota del indice - C10, C11, C15, C17
- Aclarado que el dato de Amir (2026) es un preprint sin revision por pares - C20
- Glosados los metodos de Supabase Auth (signUp, signInWithPassword, verifyOtp, getUser) - H78
</commit_message>
<xml_diff>
--- a/FormularioLeads/tesis.docx
+++ b/FormularioLeads/tesis.docx
@@ -201,7 +201,7 @@
       <w:proofErr w:type="spellEnd"/>
       <w:r>
         <w:rPr/>
-        <w:t>El trabajo aborda la carga administrativa que enfrenta el freelancer que trabaja solo: cada cliente potencial exige una secuencia de tareas manuales y repetitivas —responder consultas, calificar la oportunidad, elaborar y enviar una propuesta, hacer seguimiento, facturar, registrar el pago y solicitar un testimonio— que, con varios clientes en paralelo, se acumulan, se retrasan o se olvidan, con la consiguiente pérdida de oportunidades y una imagen poco profesional. Como respuesta se diseñó e implementó una plataforma web que automatiza el ciclo de vida completo del cliente mediante una arquitectura orientada a eventos. La solución integra tres capas: un frontend desarrollado en Next.js y React que expone un formulario público de captación y un tablero de control autenticado; un motor de orquestación de bajo código, n8n, que coordina la normalización, el scoring, la generación de propuestas y facturas, y las notificaciones multicanal; y una base de datos relacional gestionada, Supabase (PostgreSQL), con seguridad a nivel de fila. El sistema calcula automáticamente un puntaje de prioridad que clasifica cada lead en tres niveles (HOT, WARM y COLD), dispara propuestas por correo, habilita la aceptación mediante un enlace con token de un solo uso, genera la factura en PDF y ejecuta procesos programados de seguimiento, recordatorio de pago y reporte diario de métricas. La validación mediante escenarios controlados verificó el funcionamiento integral de los flujos de captación, calificación, aceptación y facturación, y también la actualización en tiempo real del tablero, cuya latencia se midió por debajo del umbral fijado. El trabajo demuestra la viabilidad técnica de la automatización propuesta; la magnitud de la reducción de la carga administrativa no se midió y se declara fuera de alcance.</w:t>
+        <w:t>El trabajo aborda la carga administrativa que enfrenta el freelancer que trabaja solo: cada cliente potencial exige una secuencia de tareas manuales y repetitivas —responder consultas, calificar la oportunidad, elaborar y enviar una propuesta, hacer seguimiento, facturar, registrar el pago y solicitar un testimonio— que, con varios clientes en paralelo, se acumulan, se retrasan o se olvidan, con la consiguiente pérdida de oportunidades y una imagen poco profesional. Como respuesta se diseñó e implementó una plataforma web que automatiza el ciclo de vida completo del cliente mediante una arquitectura orientada a eventos. La solución integra tres capas: un frontend desarrollado en Next.js y React que expone un formulario público de captación y un tablero de control autenticado; un motor de orquestación de bajo código, n8n, que coordina la normalización, el scoring, la generación de propuestas y facturas, y las notificaciones multicanal; y una base de datos relacional gestionada, Supabase (PostgreSQL), con seguridad a nivel de fila. El sistema calcula automáticamente un puntaje de prioridad que clasifica cada lead en tres niveles (HOT, WARM y COLD), dispara propuestas por correo, habilita la aceptación mediante un enlace con token de un solo uso, genera la factura en PDF y ejecuta cuatro procesos programados: seguimiento, recordatorio de pago y reporte diario de métricas, más una reconciliación periódica que audita la facturación. La validación mediante escenarios controlados verificó el funcionamiento integral de los flujos de captación, calificación, aceptación y facturación, y también la actualización en tiempo real del tablero, cuya latencia se midió por debajo del umbral fijado. El trabajo demuestra la viabilidad técnica de la automatización propuesta; la magnitud de la reducción de la carga administrativa no se midió y se declara fuera de alcance.</w:t>
       </w:r>
     </w:p>
     <w:p/>
@@ -254,7 +254,7 @@
           <w:b w:val="0"/>
           <w:i w:val="0"/>
         </w:rPr>
-        <w:t>This work addresses the administrative burden faced by solo freelancers: every prospective client triggers a sequence of manual, repetitive tasks —answering enquiries, qualifying the opportunity, drafting and sending a proposal, following up, invoicing, recording payment and requesting a testimonial— which, with several clients in parallel, pile up, get delayed or are forgotten, resulting in lost opportunities and an unprofessional image. In response, a web platform was designed and implemented to automate the full client life cycle through an event-driven architecture. The solution integrates three layers: a Next.js and React frontend exposing a public lead-capture form and an authenticated control dashboard; a low-code orchestration engine, n8n, coordinating normalisation, scoring, proposal and invoice generation and multichannel notifications; and a managed relational database, Supabase (PostgreSQL), with row level security. The system automatically computes a priority score that classifies each lead into three tiers (HOT, WARM and COLD), sends proposals by email, enables acceptance through a single-use token link, generates the invoice as a PDF and runs scheduled follow-up, payment reminder and daily metrics reporting processes. Validation through controlled scenarios verified the end-to-end operation of the capture, qualification, acceptance and invoicing flows, as well as the dashboard's real-time updating, whose latency was measured below the established threshold. The work demonstrates the technical feasibility of the proposed automation; the magnitude of the reduction in administrative workload was not measured and is declared outside the scope.</w:t>
+        <w:t>This work addresses the administrative burden faced by solo freelancers: every prospective client triggers a sequence of manual, repetitive tasks —answering enquiries, qualifying the opportunity, drafting and sending a proposal, following up, invoicing, recording payment and requesting a testimonial— which, with several clients in parallel, pile up, get delayed or are forgotten, resulting in lost opportunities and an unprofessional image. In response, a web platform was designed and implemented to automate the full client life cycle through an event-driven architecture. The solution integrates three layers: a Next.js and React frontend exposing a public lead-capture form and an authenticated control dashboard; a low-code orchestration engine, n8n, coordinating normalisation, scoring, proposal and invoice generation and multichannel notifications; and a managed relational database, Supabase (PostgreSQL), with row level security. The system automatically computes a priority score that classifies each lead into three tiers (HOT, WARM and COLD), sends proposals by email, enables acceptance through a single-use token link, generates the invoice as a PDF and runs four scheduled processes: follow-up, payment reminder and daily metrics reporting, plus a periodic reconciliation that audits invoicing. Validation through controlled scenarios verified the end-to-end operation of the capture, qualification, acceptance and invoicing flows, as well as the dashboard's real-time updating, whose latency was measured below the established threshold. The work demonstrates the technical feasibility of the proposed automation; the magnitude of the reduction in administrative workload was not measured and is declared outside the scope.</w:t>
       </w:r>
     </w:p>
     <w:p>
@@ -1153,7 +1153,6 @@
           <w:i/>
           <w:sz w:val="15"/>
         </w:rPr>
-        <w:t>Los números de página de este índice se generan al actualizar el campo en el procesador de textos (Word: clic derecho sobre el índice → Actualizar campos → Actualizar toda la tabla).</w:t>
       </w:r>
     </w:p>
     <w:p>
@@ -2922,7 +2921,7 @@
         <w:rPr>
           <w:i w:val="0"/>
         </w:rPr>
-        <w:t>Un relevamiento adicional matiza, sin revertirla, esa dependencia de las fuentes de los proveedores. Lamanna (2025) propone un marco de evaluación estructurado y multicriterio para plataformas de bajo código, formulado precisamente para superar la brecha entre comparaciones dirigidas por el marketing de los proveedores y una evaluación rigurosa basada en criterios explícitos; aplicarlo en profundidad a las cuatro herramientas revisadas excede el alcance de este trabajo, pero su existencia confirma que la limitación señalada aquí es un problema metodológico reconocido en la literatura, no una omisión aislada de este documento. Por otra parte, un estudio de caso reciente que compara la ejecución manual y automatizada de un flujo de captación de leads con n8n en un entorno de negocio a pequeña escala —el mismo tipo de operación que describe este trabajo— registra una reducción del tiempo de ejecución de 185,35 a 1,23 segundos y la eliminación de la tasa de error del 5 % observada en la ejecución manual (Amir, 2026), lo que aporta evidencia empírica independiente, aunque todavía preliminar, a favor de automatizar precisamente el tipo de tarea que aborda este trabajo. Ninguna de las dos fuentes evalúa de forma independiente a HubSpot, Pipedrive, Zapier o Make en particular, de modo que la comparación de precios y prestaciones de este apartado sigue apoyada en las páginas de los proveedores; lo que cambia es que la decisión de automatizar en sí —y el criterio para evaluarla con rigor— ya no depende solo de la argumentación propia de los autores.</w:t>
+        <w:t>Un relevamiento adicional matiza, sin revertirla, esa dependencia de las fuentes de los proveedores. Lamanna (2025) propone un marco de evaluación estructurado y multicriterio para plataformas de bajo código, formulado precisamente para superar la brecha entre comparaciones dirigidas por el marketing de los proveedores y una evaluación rigurosa basada en criterios explícitos; aplicarlo en profundidad a las cuatro herramientas revisadas excede el alcance de este trabajo, pero su existencia confirma que la limitación señalada aquí es un problema metodológico reconocido en la literatura, no una omisión aislada de este documento. Por otra parte, un estudio de caso reciente que compara la ejecución manual y automatizada de un flujo de captación de leads con n8n en un entorno de negocio a pequeña escala —el mismo tipo de operación que describe este trabajo— registra una reducción del tiempo de ejecución de 185,35 a 1,23 segundos y la eliminación de la tasa de error del 5 % observada en la ejecución manual (Amir, 2026, un preprint todavía sin revisión por pares), lo que aporta evidencia empírica independiente —aunque preliminar y no arbitrada— a favor de automatizar precisamente el tipo de tarea que aborda este trabajo. Ninguna de las dos fuentes evalúa de forma independiente a HubSpot, Pipedrive, Zapier o Make en particular, de modo que la comparación de precios y prestaciones de este apartado sigue apoyada en las páginas de los proveedores; lo que cambia es que la decisión de automatizar en sí —y el criterio para evaluarla con rigor— ya no depende solo de la argumentación propia de los autores.</w:t>
       </w:r>
     </w:p>
     <w:p>
@@ -7545,202 +7544,151 @@
     </w:p>
     <w:p>
       <w:r>
-        <w:t xml:space="preserve">El acceso al tablero se resuelve con </w:t>
+        <w:t>El acceso al tablero se resuelve con Supabase Auth por correo y contraseña. El registro (register-form.tsx) invoca signUp —crea la cuenta y dispara el correo de confirmación— con redirección a /auth/confirm; el inicio de sesión (login-form.tsx) invoca signInWithPassword —valida las credenciales y abre la sesión—; el manejador /auth/confirm verifica el código de un solo uso (verifyOtp, que canjea el enlace del correo por una sesión válida) y el manejador /auth/signout cierra la sesión. Los códigos de error de Supabase se traducen a mensajes en español mediante la función translateAuthError del módulo auth-errors.ts, en cumplimiento del RNF5.</w:t>
       </w:r>
       <w:proofErr w:type="spellStart"/>
-      <w:r>
-        <w:t>Supabase</w:t>
-      </w:r>
+      <w:r/>
       <w:proofErr w:type="spellEnd"/>
-      <w:r>
-        <w:t xml:space="preserve"> </w:t>
-      </w:r>
+      <w:r/>
       <w:proofErr w:type="spellStart"/>
-      <w:r>
-        <w:t>Auth</w:t>
-      </w:r>
+      <w:r/>
       <w:proofErr w:type="spellEnd"/>
-      <w:r>
-        <w:t xml:space="preserve"> por correo y contraseña. El registro (</w:t>
-      </w:r>
+      <w:r/>
       <w:proofErr w:type="spellStart"/>
       <w:r>
         <w:rPr>
           <w:rFonts w:ascii="Consolas" w:hAnsi="Consolas" w:cs="Consolas"/>
         </w:rPr>
-        <w:t>register-form.tsx</w:t>
       </w:r>
       <w:proofErr w:type="spellEnd"/>
-      <w:r>
-        <w:t xml:space="preserve">) invoca </w:t>
-      </w:r>
+      <w:r/>
       <w:proofErr w:type="spellStart"/>
       <w:r>
         <w:rPr>
           <w:rFonts w:ascii="Consolas" w:hAnsi="Consolas" w:cs="Consolas"/>
         </w:rPr>
-        <w:t>signUp</w:t>
       </w:r>
       <w:proofErr w:type="spellEnd"/>
-      <w:r>
-        <w:t xml:space="preserve"> con redirección a </w:t>
-      </w:r>
+      <w:r/>
       <w:r>
         <w:rPr>
           <w:rFonts w:ascii="Consolas" w:hAnsi="Consolas" w:cs="Consolas"/>
         </w:rPr>
-        <w:t>/</w:t>
       </w:r>
       <w:proofErr w:type="spellStart"/>
       <w:r>
         <w:rPr>
           <w:rFonts w:ascii="Consolas" w:hAnsi="Consolas" w:cs="Consolas"/>
         </w:rPr>
-        <w:t>auth</w:t>
       </w:r>
       <w:proofErr w:type="spellEnd"/>
       <w:r>
         <w:rPr>
           <w:rFonts w:ascii="Consolas" w:hAnsi="Consolas" w:cs="Consolas"/>
         </w:rPr>
-        <w:t>/</w:t>
       </w:r>
       <w:proofErr w:type="spellStart"/>
       <w:r>
         <w:rPr>
           <w:rFonts w:ascii="Consolas" w:hAnsi="Consolas" w:cs="Consolas"/>
         </w:rPr>
-        <w:t>confirm</w:t>
       </w:r>
       <w:proofErr w:type="spellEnd"/>
-      <w:r>
-        <w:t>; el inicio de sesión (</w:t>
-      </w:r>
+      <w:r/>
       <w:proofErr w:type="spellStart"/>
       <w:r>
         <w:rPr>
           <w:rFonts w:ascii="Consolas" w:hAnsi="Consolas" w:cs="Consolas"/>
         </w:rPr>
-        <w:t>login-form.tsx</w:t>
       </w:r>
       <w:proofErr w:type="spellEnd"/>
-      <w:r>
-        <w:t xml:space="preserve">) invoca </w:t>
-      </w:r>
+      <w:r/>
       <w:proofErr w:type="spellStart"/>
       <w:r>
         <w:rPr>
           <w:rFonts w:ascii="Consolas" w:hAnsi="Consolas" w:cs="Consolas"/>
         </w:rPr>
-        <w:t>signInWithPassword</w:t>
       </w:r>
       <w:proofErr w:type="spellEnd"/>
-      <w:r>
-        <w:t xml:space="preserve">; el manejador </w:t>
-      </w:r>
+      <w:r/>
       <w:r>
         <w:rPr>
           <w:rFonts w:ascii="Consolas" w:hAnsi="Consolas" w:cs="Consolas"/>
         </w:rPr>
-        <w:t>/</w:t>
       </w:r>
       <w:proofErr w:type="spellStart"/>
       <w:r>
         <w:rPr>
           <w:rFonts w:ascii="Consolas" w:hAnsi="Consolas" w:cs="Consolas"/>
         </w:rPr>
-        <w:t>auth</w:t>
       </w:r>
       <w:proofErr w:type="spellEnd"/>
       <w:r>
         <w:rPr>
           <w:rFonts w:ascii="Consolas" w:hAnsi="Consolas" w:cs="Consolas"/>
         </w:rPr>
-        <w:t>/</w:t>
       </w:r>
       <w:proofErr w:type="spellStart"/>
       <w:r>
         <w:rPr>
           <w:rFonts w:ascii="Consolas" w:hAnsi="Consolas" w:cs="Consolas"/>
         </w:rPr>
-        <w:t>confirm</w:t>
       </w:r>
       <w:proofErr w:type="spellEnd"/>
-      <w:r>
-        <w:t xml:space="preserve"> verifica el código de un solo uso (</w:t>
-      </w:r>
+      <w:r/>
       <w:proofErr w:type="spellStart"/>
       <w:r>
         <w:rPr>
           <w:rFonts w:ascii="Consolas" w:hAnsi="Consolas" w:cs="Consolas"/>
         </w:rPr>
-        <w:t>verifyOtp</w:t>
       </w:r>
       <w:proofErr w:type="spellEnd"/>
-      <w:r>
-        <w:t xml:space="preserve">) y el manejador </w:t>
-      </w:r>
+      <w:r/>
       <w:r>
         <w:rPr>
           <w:rFonts w:ascii="Consolas" w:hAnsi="Consolas" w:cs="Consolas"/>
         </w:rPr>
-        <w:t>/</w:t>
       </w:r>
       <w:proofErr w:type="spellStart"/>
       <w:r>
         <w:rPr>
           <w:rFonts w:ascii="Consolas" w:hAnsi="Consolas" w:cs="Consolas"/>
         </w:rPr>
-        <w:t>auth</w:t>
       </w:r>
       <w:proofErr w:type="spellEnd"/>
       <w:r>
         <w:rPr>
           <w:rFonts w:ascii="Consolas" w:hAnsi="Consolas" w:cs="Consolas"/>
         </w:rPr>
-        <w:t>/</w:t>
       </w:r>
       <w:proofErr w:type="spellStart"/>
       <w:r>
         <w:rPr>
           <w:rFonts w:ascii="Consolas" w:hAnsi="Consolas" w:cs="Consolas"/>
         </w:rPr>
-        <w:t>signout</w:t>
       </w:r>
       <w:proofErr w:type="spellEnd"/>
-      <w:r>
-        <w:t xml:space="preserve"> cierra la sesión. Los códigos de error de </w:t>
-      </w:r>
+      <w:r/>
       <w:proofErr w:type="spellStart"/>
-      <w:r>
-        <w:t>Supabase</w:t>
-      </w:r>
+      <w:r/>
       <w:proofErr w:type="spellEnd"/>
-      <w:r>
-        <w:t xml:space="preserve"> se traducen a mensajes en español mediante la función </w:t>
-      </w:r>
+      <w:r/>
       <w:proofErr w:type="spellStart"/>
       <w:r>
         <w:rPr>
           <w:rFonts w:ascii="Consolas" w:hAnsi="Consolas" w:cs="Consolas"/>
         </w:rPr>
-        <w:t>translateAuthError</w:t>
       </w:r>
       <w:proofErr w:type="spellEnd"/>
-      <w:r>
-        <w:t xml:space="preserve"> del módulo </w:t>
-      </w:r>
+      <w:r/>
       <w:proofErr w:type="spellStart"/>
       <w:r>
         <w:rPr>
           <w:rFonts w:ascii="Consolas" w:hAnsi="Consolas" w:cs="Consolas"/>
         </w:rPr>
-        <w:t>auth-errors.ts</w:t>
       </w:r>
       <w:proofErr w:type="spellEnd"/>
-      <w:r>
-        <w:t>, en cumplimiento del RNF5.</w:t>
-      </w:r>
+      <w:r/>
     </w:p>
     <w:p>
       <w:pPr>
@@ -7780,7 +7728,7 @@
           <w:b w:val="0"/>
           <w:i w:val="0"/>
         </w:rPr>
-        <w:t xml:space="preserve">La protección de rutas se resuelve en dos niveles, en un esquema de defensa en profundidad. El primero es el archivo </w:t>
+        <w:t>La protección de rutas se resuelve en dos niveles, en un esquema de defensa en profundidad. El primero es el archivo proxy.ts —la convención vigente en Next.js 16, que reemplaza al histórico middleware.ts—, apoyado en el ayudante updateSession del módulo lib/supabase/middleware.ts. En cada petición comprueba si la ruta pertenece al conjunto de rutas protegidas (PROTECTED_ROUTES, que incluye /dashboard) y, mediante getUser —que consulta la sesión vigente contra Supabase—, valida la sesión; si no hay usuario, redirige a /login conservando el destino original en el parámetro redirectTo.</w:t>
       </w:r>
       <w:r>
         <w:rPr>
@@ -7788,14 +7736,12 @@
           <w:b w:val="0"/>
           <w:i w:val="0"/>
         </w:rPr>
-        <w:t>proxy.ts</w:t>
-      </w:r>
-      <w:r>
-        <w:rPr>
-          <w:b w:val="0"/>
-          <w:i w:val="0"/>
-        </w:rPr>
-        <w:t xml:space="preserve"> —la convención vigente en Next.js 16, que reemplaza al histórico </w:t>
+      </w:r>
+      <w:r>
+        <w:rPr>
+          <w:b w:val="0"/>
+          <w:i w:val="0"/>
+        </w:rPr>
       </w:r>
       <w:r>
         <w:rPr>
@@ -7803,14 +7749,12 @@
           <w:b w:val="0"/>
           <w:i w:val="0"/>
         </w:rPr>
-        <w:t>middleware.ts</w:t>
-      </w:r>
-      <w:r>
-        <w:rPr>
-          <w:b w:val="0"/>
-          <w:i w:val="0"/>
-        </w:rPr>
-        <w:t xml:space="preserve">—, apoyado en el ayudante </w:t>
+      </w:r>
+      <w:r>
+        <w:rPr>
+          <w:b w:val="0"/>
+          <w:i w:val="0"/>
+        </w:rPr>
       </w:r>
       <w:r>
         <w:rPr>
@@ -7818,14 +7762,12 @@
           <w:b w:val="0"/>
           <w:i w:val="0"/>
         </w:rPr>
-        <w:t>updateSession</w:t>
-      </w:r>
-      <w:r>
-        <w:rPr>
-          <w:b w:val="0"/>
-          <w:i w:val="0"/>
-        </w:rPr>
-        <w:t xml:space="preserve"> del módulo </w:t>
+      </w:r>
+      <w:r>
+        <w:rPr>
+          <w:b w:val="0"/>
+          <w:i w:val="0"/>
+        </w:rPr>
       </w:r>
       <w:r>
         <w:rPr>
@@ -7833,14 +7775,12 @@
           <w:b w:val="0"/>
           <w:i w:val="0"/>
         </w:rPr>
-        <w:t>lib/supabase/middleware.ts</w:t>
-      </w:r>
-      <w:r>
-        <w:rPr>
-          <w:b w:val="0"/>
-          <w:i w:val="0"/>
-        </w:rPr>
-        <w:t>. En cada petición comprueba si la ruta pertenece al conjunto de rutas protegidas (</w:t>
+      </w:r>
+      <w:r>
+        <w:rPr>
+          <w:b w:val="0"/>
+          <w:i w:val="0"/>
+        </w:rPr>
       </w:r>
       <w:r>
         <w:rPr>
@@ -7848,14 +7788,12 @@
           <w:b w:val="0"/>
           <w:i w:val="0"/>
         </w:rPr>
-        <w:t>PROTECTED_ROUTES</w:t>
-      </w:r>
-      <w:r>
-        <w:rPr>
-          <w:b w:val="0"/>
-          <w:i w:val="0"/>
-        </w:rPr>
-        <w:t xml:space="preserve">, que incluye </w:t>
+      </w:r>
+      <w:r>
+        <w:rPr>
+          <w:b w:val="0"/>
+          <w:i w:val="0"/>
+        </w:rPr>
       </w:r>
       <w:r>
         <w:rPr>
@@ -7863,14 +7801,12 @@
           <w:b w:val="0"/>
           <w:i w:val="0"/>
         </w:rPr>
-        <w:t>/dashboard</w:t>
-      </w:r>
-      <w:r>
-        <w:rPr>
-          <w:b w:val="0"/>
-          <w:i w:val="0"/>
-        </w:rPr>
-        <w:t xml:space="preserve">) y, mediante </w:t>
+      </w:r>
+      <w:r>
+        <w:rPr>
+          <w:b w:val="0"/>
+          <w:i w:val="0"/>
+        </w:rPr>
       </w:r>
       <w:r>
         <w:rPr>
@@ -7878,14 +7814,12 @@
           <w:b w:val="0"/>
           <w:i w:val="0"/>
         </w:rPr>
-        <w:t>getUser</w:t>
-      </w:r>
-      <w:r>
-        <w:rPr>
-          <w:b w:val="0"/>
-          <w:i w:val="0"/>
-        </w:rPr>
-        <w:t xml:space="preserve">, valida la sesión contra Supabase; si no hay usuario, redirige a </w:t>
+      </w:r>
+      <w:r>
+        <w:rPr>
+          <w:b w:val="0"/>
+          <w:i w:val="0"/>
+        </w:rPr>
       </w:r>
       <w:r>
         <w:rPr>
@@ -7893,14 +7827,12 @@
           <w:b w:val="0"/>
           <w:i w:val="0"/>
         </w:rPr>
-        <w:t>/login</w:t>
-      </w:r>
-      <w:r>
-        <w:rPr>
-          <w:b w:val="0"/>
-          <w:i w:val="0"/>
-        </w:rPr>
-        <w:t xml:space="preserve"> conservando el destino original en el parámetro </w:t>
+      </w:r>
+      <w:r>
+        <w:rPr>
+          <w:b w:val="0"/>
+          <w:i w:val="0"/>
+        </w:rPr>
       </w:r>
       <w:r>
         <w:rPr>
@@ -7908,14 +7840,12 @@
           <w:b w:val="0"/>
           <w:i w:val="0"/>
         </w:rPr>
-        <w:t>redirectTo</w:t>
-      </w:r>
-      <w:r>
-        <w:rPr>
-          <w:b w:val="0"/>
-          <w:i w:val="0"/>
-        </w:rPr>
-        <w:t>.</w:t>
+      </w:r>
+      <w:r>
+        <w:rPr>
+          <w:b w:val="0"/>
+          <w:i w:val="0"/>
+        </w:rPr>
       </w:r>
     </w:p>
     <w:p>
@@ -9615,21 +9545,19 @@
           <w:b w:val="0"/>
           <w:i w:val="0"/>
         </w:rPr>
-        <w:t xml:space="preserve">El segundo es una </w:t>
+        <w:t>El segundo es que un lead calificado como HOT o WARM quede sin que el profesional envíe la propuesta: el cálculo del puntaje precede a la inserción, de modo que todo lead se persiste ya calificado, pero desde que esa decisión pasó a depender de una acción manual desde el tablero (§4.3.2), el estado NUEVO ya no es solo el punto de partida del ciclo, sino también la sala de espera de toda propuesta pendiente de enviarse. Un proceso programado que detecte leads HOT o WARM sin propuesta enviada con antigüedad superior a un umbral resolvería el caso; se registra en el Capítulo 8. El sistema avisa por Telegram en el momento en que el lead queda a la espera y el tablero lo muestra en primer lugar con su recuento. Sin embargo, si el profesional no actúa, nadie vuelve a insistir: el riesgo de que una oportunidad calificada quede detenida es real y se declara aquí antes que en el capítulo de trabajos futuros.</w:t>
       </w:r>
       <w:r>
         <w:rPr>
           <w:b w:val="0"/>
           <w:i/>
         </w:rPr>
-        <w:t>ventana de inconsistencia entre la inserción y el scoring</w:t>
-      </w:r>
-      <w:r>
-        <w:rPr>
-          <w:b w:val="0"/>
-          <w:i w:val="0"/>
-        </w:rPr>
-        <w:t>: el lead se persiste antes de calcularse su puntaje, de modo que un fallo del nodo intermedio lo deja permanentemente en estado NUEVO, con score cero y sin propuesta, sin proceso de reconciliación que lo recupere. El manejo de errores (§4.3.6) registra y notifica la falla, pero no reintenta ni reencola. Un proceso programado que detecte leads en NUEVO con antigüedad superior a un umbral resolvería el caso; se registra en el Capítulo 8. Desde que el envío de la propuesta exige la intervención del profesional (§4.3.2), ese proceso pasó a ser más necesario y no menos. El estado NUEVO cubre ahora dos situaciones: un fallo del scoring y un lead calificado a la espera de términos. Sin embargo, ninguna de las dos tiene hoy un mecanismo desatendido que la reclame. El sistema avisa por Telegram en el momento en que el lead queda a la espera y el tablero lo muestra en primer lugar con su recuento. Sin embargo, si el profesional no actúa, nadie vuelve a insistir: el riesgo de que una oportunidad calificada quede detenida es real y se declara aquí antes que en el capítulo de trabajos futuros.</w:t>
+      </w:r>
+      <w:r>
+        <w:rPr>
+          <w:b w:val="0"/>
+          <w:i w:val="0"/>
+        </w:rPr>
       </w:r>
     </w:p>
     <w:p>
@@ -10205,7 +10133,7 @@
       <w:r>
         <w:drawing>
           <wp:inline xmlns:a="http://schemas.openxmlformats.org/drawingml/2006/main" xmlns:pic="http://schemas.openxmlformats.org/drawingml/2006/picture">
-            <wp:extent cx="5472000" cy="4482693"/>
+            <wp:extent cx="5472000" cy="3051445"/>
             <wp:docPr id="20" name="Picture 20"/>
             <wp:cNvGraphicFramePr>
               <a:graphicFrameLocks noChangeAspect="1"/>
@@ -10226,7 +10154,7 @@
                   <pic:spPr>
                     <a:xfrm>
                       <a:off x="0" y="0"/>
-                      <a:ext cx="5472000" cy="4482693"/>
+                      <a:ext cx="5472000" cy="3051445"/>
                     </a:xfrm>
                     <a:prstGeom prst="rect"/>
                   </pic:spPr>
@@ -10728,7 +10656,7 @@
       <w:r>
         <w:drawing>
           <wp:inline xmlns:a="http://schemas.openxmlformats.org/drawingml/2006/main" xmlns:pic="http://schemas.openxmlformats.org/drawingml/2006/picture">
-            <wp:extent cx="5472000" cy="3975523"/>
+            <wp:extent cx="5472000" cy="4026748"/>
             <wp:docPr id="21" name="Picture 21"/>
             <wp:cNvGraphicFramePr>
               <a:graphicFrameLocks noChangeAspect="1"/>
@@ -10749,7 +10677,7 @@
                   <pic:spPr>
                     <a:xfrm>
                       <a:off x="0" y="0"/>
-                      <a:ext cx="5472000" cy="3975523"/>
+                      <a:ext cx="5472000" cy="4026748"/>
                     </a:xfrm>
                     <a:prstGeom prst="rect"/>
                   </pic:spPr>
@@ -16065,7 +15993,7 @@
       <w:r>
         <w:drawing>
           <wp:inline xmlns:a="http://schemas.openxmlformats.org/drawingml/2006/main" xmlns:pic="http://schemas.openxmlformats.org/drawingml/2006/picture">
-            <wp:extent cx="5472000" cy="3484672"/>
+            <wp:extent cx="5472000" cy="2253176"/>
             <wp:docPr id="22" name="Picture 22"/>
             <wp:cNvGraphicFramePr>
               <a:graphicFrameLocks noChangeAspect="1"/>
@@ -16086,7 +16014,7 @@
                   <pic:spPr>
                     <a:xfrm>
                       <a:off x="0" y="0"/>
-                      <a:ext cx="5472000" cy="3484672"/>
+                      <a:ext cx="5472000" cy="2253176"/>
                     </a:xfrm>
                     <a:prstGeom prst="rect"/>
                   </pic:spPr>
@@ -17346,7 +17274,7 @@
           <w:b w:val="0"/>
           <w:i w:val="0"/>
         </w:rPr>
-        <w:t>Se observa además una inconsistencia de nomenclatura que conviene declarar: la ruta de captación emplea barra como separador (</w:t>
+        <w:t>Se observa además una inconsistencia de nomenclatura que conviene declarar: de los trece webhooks, dos emplean barra como separador —/lead/nuevo y /mp/notificacion— y los once restantes emplean guion (/lead-acepta, /lead-rechaza, etc.). La ruta de captación diverge por motivos históricos —fue la primera en construirse—; la de MercadoPago diverge porque su formato lo impone el proveedor. Ninguna de las dos tiene efecto funcional, pero rompen la uniformidad del contrato de integración. Unificar el criterio de las rutas propias exige actualizar la variable de entorno del frontend y el nodo correspondiente del flujo; se registra en el Capítulo 8.</w:t>
       </w:r>
       <w:r>
         <w:rPr>
@@ -17354,14 +17282,12 @@
           <w:b w:val="0"/>
           <w:i w:val="0"/>
         </w:rPr>
-        <w:t>/lead/nuevo</w:t>
-      </w:r>
-      <w:r>
-        <w:rPr>
-          <w:b w:val="0"/>
-          <w:i w:val="0"/>
-        </w:rPr>
-        <w:t>) mientras que las diez restantes emplean guion (</w:t>
+      </w:r>
+      <w:r>
+        <w:rPr>
+          <w:b w:val="0"/>
+          <w:i w:val="0"/>
+        </w:rPr>
       </w:r>
       <w:r>
         <w:rPr>
@@ -17369,14 +17295,12 @@
           <w:b w:val="0"/>
           <w:i w:val="0"/>
         </w:rPr>
-        <w:t>/lead-acepta</w:t>
-      </w:r>
-      <w:r>
-        <w:rPr>
-          <w:b w:val="0"/>
-          <w:i w:val="0"/>
-        </w:rPr>
-        <w:t xml:space="preserve">, </w:t>
+      </w:r>
+      <w:r>
+        <w:rPr>
+          <w:b w:val="0"/>
+          <w:i w:val="0"/>
+        </w:rPr>
       </w:r>
       <w:r>
         <w:rPr>
@@ -17384,14 +17308,12 @@
           <w:b w:val="0"/>
           <w:i w:val="0"/>
         </w:rPr>
-        <w:t>/lead-rechaza</w:t>
-      </w:r>
-      <w:r>
-        <w:rPr>
-          <w:b w:val="0"/>
-          <w:i w:val="0"/>
-        </w:rPr>
-        <w:t>, etc.). La divergencia es histórica —la ruta de captación fue la primera en construirse— y no tiene efecto funcional, pero rompe la uniformidad del contrato de integración. Unificar el criterio exige actualizar la variable de entorno del frontend y el nodo correspondiente del flujo; se registra en el Capítulo 8.</w:t>
+      </w:r>
+      <w:r>
+        <w:rPr>
+          <w:b w:val="0"/>
+          <w:i w:val="0"/>
+        </w:rPr>
       </w:r>
     </w:p>
     <w:p>
@@ -19077,7 +18999,7 @@
           <w:i/>
           <w:sz w:val="15"/>
         </w:rPr>
-        <w:t>Nota. Elaboración propia a partir de los nodos de tipo Webhook del flujo exportado y de las llamadas fetch del frontend. La lista blanca de orígenes es un control del navegador (CORS) y no una autenticación: no impide la invocación desde un cliente que no sea un navegador. Sobre la inconsistencia de nomenclatura entre /lead/nuevo (con barra) y el resto de las rutas (con guion), véase §4.5.</w:t>
+        <w:t>Nota. Elaboración propia a partir de los nodos de tipo Webhook del flujo exportado y de las llamadas fetch del frontend. La lista blanca de orígenes es un control del navegador (CORS) y no una autenticación: no impide la invocación desde un cliente que no sea un navegador. Sobre la inconsistencia de nomenclatura entre /lead/nuevo y /mp/notificacion (con barra) y el resto de las rutas (con guion), véase §4.5.</w:t>
       </w:r>
     </w:p>
     <w:p/>
@@ -20334,7 +20256,7 @@
           <w:b w:val="0"/>
           <w:i w:val="0"/>
         </w:rPr>
-        <w:t>Todo lead inicia en estado NUEVO con score cero hasta su calificación. La inserción precede al cálculo del puntaje, de modo que existe una ventana en la que un fallo del nodo de scoring deja el lead sin propuesta (§4.3.1).</w:t>
+        <w:t>Todo lead se inserta ya calificado: el cálculo del puntaje precede a la persistencia, no al revés. Permanece en estado NUEVO hasta que el profesional envía la propuesta (§4.3.1).</w:t>
       </w:r>
     </w:p>
     <w:p>
@@ -20427,7 +20349,7 @@
         <w:rPr>
           <w:b w:val="0"/>
         </w:rPr>
-        <w:t>El desarrollo de este capítulo identificó ocho riesgos de diseño y conviene reunirlos para que la discusión (Capítulo 6) y los trabajos futuros (Capítulo 8) los retomen sin dispersión. Seis son de seguridad y están consignados en la Tabla 11: S1 a S5 y S8, esta última la validación de firma del webhook de MercadoPago, opcional y deshabilitada por defecto (§4.3.3). S7, el incidente de credenciales de Supabase que no es un riesgo de diseño sino un episodio puntual, se cerró el 27 de agosto de 2026 y se detalla en el §6.3. Los dos restantes son de consistencia funcional: la ausencia de idempotencia en la captación (S6) y la ventana de inconsistencia entre la inserción del lead y el cálculo de su puntaje. De los ocho, dos dejaron de estar abiertos el 27 de agosto de 2026, y por la vía que la propia Tabla 11 tenía escrita. La ausencia de idempotencia en la captación (S6) se cerró con la deduplicación por correo dentro de una ventana temporal y el bloqueo del envío (§4.3.1). La falta de recuperación entre la aceptación y la facturación (S5) se mitigó con un cuarto proceso programado de reconciliación (§4.3.5), aunque la frontera transaccional propiamente dicha sigue sin existir: lo incorporado repara después de la falla y no la evita. Quedan abiertos, en distinto grado, S1, S3, S4 y S8, y la ventana entre la inserción del lead y su puntaje, que todavía no tiene ningún proceso desatendido que la reclame.</w:t>
+        <w:t>El desarrollo de este capítulo identificó ocho riesgos de diseño y conviene reunirlos para que la discusión (Capítulo 6) y los trabajos futuros (Capítulo 8) los retomen sin dispersión. Seis son de seguridad y están consignados en la Tabla 11: S1 a S5 y S8, esta última la validación de firma del webhook de MercadoPago, opcional y deshabilitada por defecto (§4.3.3). S7, el incidente de credenciales de Supabase que no es un riesgo de diseño sino un episodio puntual, se cerró el 27 de agosto de 2026 y se detalla en el §6.3. Los dos restantes son de consistencia funcional: la ausencia de idempotencia en la captación (S6) y la ausencia de un proceso desatendido que reclame a un lead calificado que el profesional no llega a enviar (§4.3.1). De los ocho, dos dejaron de estar abiertos el 27 de agosto de 2026, y por la vía que la propia Tabla 11 tenía escrita. La ausencia de idempotencia en la captación (S6) se cerró con la deduplicación por correo dentro de una ventana temporal y el bloqueo del envío (§4.3.1). La falta de recuperación entre la aceptación y la facturación (S5) se mitigó con un cuarto proceso programado de reconciliación (§4.3.5), aunque la frontera transaccional propiamente dicha sigue sin existir: lo incorporado repara después de la falla y no la evita. Quedan abiertos, en distinto grado, S1, S3, S4 y S8, y la falta de un proceso que reclame al lead calificado que queda a la espera de que el profesional envíe su propuesta.</w:t>
       </w:r>
     </w:p>
     <w:p>
@@ -24505,14 +24427,13 @@
           <w:b/>
           <w:i w:val="0"/>
         </w:rPr>
-        <w:t>Respuesta al objetivo general.</w:t>
-      </w:r>
-      <w:r>
-        <w:rPr>
-          <w:b w:val="0"/>
-          <w:i w:val="0"/>
-        </w:rPr>
-        <w:t xml:space="preserve"> El objetivo general —diseñar, implementar y validar funcionalmente una plataforma que automatice el ciclo completo, demostrando la viabilidad técnica de delegar en el sistema las tareas administrativas manuales— se alcanza. El artefacto existe, es público y ejecuta de extremo a extremo los flujos de captación, calificación, propuesta, aceptación, facturación, cobro y cierre, con tres procesos programados que operan sin intervención. El control del profesional, primera condición de la pregunta de investigación, se materializa en dos puntos y no en uno solo. El primero es el tablero interno, desde el que cancela leads, resuelve pedidos de cambio, actualiza el estado del trabajo y cierra el proyecto. Asimismo, el segundo es la decisión sobre los términos comerciales de cada propuesta, que el sistema no toma por él. Esta segunda pieza se incorporó al detectarse que hasta entonces el importe de la propuesta y de la factura provenía del formulario que completaba el propio interesado (§4.3.2), de modo que esa condición carecía de respaldo real en el artefacto. La trazabilidad, segundo término de la pregunta, queda acreditada por construcción: cada lead tiene un estado explícito, marcas temporales de cada transición, un registro de auditoría en la tabla </w:t>
+        <w:t>Respuesta al objetivo general. El objetivo general —diseñar, implementar y validar funcionalmente una plataforma que automatice el ciclo completo, demostrando la viabilidad técnica de delegar en el sistema las tareas administrativas manuales— se alcanza. El artefacto existe, es público y ejecuta de extremo a extremo los flujos de captación, calificación, propuesta, aceptación, facturación, cobro y cierre, con cuatro procesos programados que operan sin intervención. El control del profesional, primera condición de la pregunta de investigación, se materializa en dos puntos y no en uno solo. El primero es el tablero interno, desde el que cancela leads, resuelve pedidos de cambio, actualiza el estado del trabajo y cierra el proyecto. Asimismo, el segundo es la decisión sobre los términos comerciales de cada propuesta, que el sistema no toma por él. Esta segunda pieza se incorporó al detectarse que hasta entonces el importe de la propuesta y de la factura provenía del formulario que completaba el propio interesado (§4.3.2), de modo que esa condición carecía de respaldo real en el artefacto. La trazabilidad, segundo término de la pregunta, queda acreditada por construcción: cada lead tiene un estado explícito, marcas temporales de cada transición, un registro de auditoría en la tabla logs y un tablero que expone el embudo completo.</w:t>
+      </w:r>
+      <w:r>
+        <w:rPr>
+          <w:b w:val="0"/>
+          <w:i w:val="0"/>
+        </w:rPr>
       </w:r>
       <w:r>
         <w:rPr>
@@ -24520,6 +24441,295 @@
           <w:b w:val="0"/>
           <w:i w:val="0"/>
         </w:rPr>
+      </w:r>
+      <w:r>
+        <w:rPr>
+          <w:b w:val="0"/>
+          <w:i w:val="0"/>
+        </w:rPr>
+      </w:r>
+    </w:p>
+    <w:p>
+      <w:pPr/>
+      <w:r>
+        <w:rPr>
+          <w:b/>
+          <w:i w:val="0"/>
+        </w:rPr>
+        <w:t>Respuesta a la pregunta de investigación, y su límite.</w:t>
+      </w:r>
+      <w:r>
+        <w:rPr>
+          <w:b w:val="0"/>
+          <w:i w:val="0"/>
+        </w:rPr>
+        <w:t xml:space="preserve"> La condición «sin sacrificar la trazabilidad ni el control» se satisface: el profesional conserva el control mediante el tablero interno, que permite cancelar leads, resolver pedidos de cambio y actualizar el estado del trabajo. Lo que la evidencia recogida </w:t>
+      </w:r>
+      <w:r>
+        <w:rPr>
+          <w:b w:val="0"/>
+          <w:i/>
+        </w:rPr>
+        <w:t>no</w:t>
+      </w:r>
+      <w:r>
+        <w:rPr>
+          <w:b w:val="0"/>
+          <w:i w:val="0"/>
+        </w:rPr>
+        <w:t xml:space="preserve"> acredita es la magnitud de la reducción de la carga administrativa. Se trata de una limitación de diseño de la validación, no de un hallazgo negativo: los escenarios funcionales, por construcción, verifican comportamiento y no miden esfuerzo. Afirmar lo contrario sería exceder lo demostrado, y por eso el objetivo general fue reformulado en §1.5 en lugar de darse por cumplido en su versión original.</w:t>
+      </w:r>
+    </w:p>
+    <w:p>
+      <w:pPr/>
+      <w:r>
+        <w:rPr>
+          <w:b w:val="0"/>
+          <w:i w:val="0"/>
+        </w:rPr>
+        <w:t>Queda sugerida, pero no demostrada, la mejora de indicadores comerciales reales, que dependería de una operación en producción. El menor costo operativo, en cambio, sí está estimado: la Tabla 13 lo cifra en USD 56,40 a doce meses frente a USD 588,00 de un CRM comercial y USD 359,88 de una plataforma de integración, con el plan y la fecha de consulta declarados en cada celda. La salvedad es de naturaleza distinta: esa comparación no incorpora el costo del desarrollo ni el del mantenimiento, que recaen sobre el profesional y que ninguna de las alternativas le cobra.</w:t>
+      </w:r>
+    </w:p>
+    <w:p>
+      <w:pPr>
+        <w:pStyle w:val="Ttulo2"/>
+      </w:pPr>
+      <w:r>
+        <w:rPr>
+          <w:b w:val="0"/>
+          <w:i w:val="0"/>
+        </w:rPr>
+        <w:t>7.1 Aprendizajes del proceso</w:t>
+      </w:r>
+    </w:p>
+    <w:p>
+      <w:pPr/>
+      <w:r>
+        <w:rPr>
+          <w:b w:val="0"/>
+          <w:i w:val="0"/>
+        </w:rPr>
+        <w:t>Un capítulo de conclusiones aporta algo que ningún otro puede aportar: qué aprendieron los autores. Se registran cuatro aprendizajes, formulados a partir de lo que efectivamente ocurrió durante el desarrollo.</w:t>
+      </w:r>
+    </w:p>
+    <w:p>
+      <w:pPr>
+        <w:pStyle w:val="Prrafodelista"/>
+      </w:pPr>
+      <w:r>
+        <w:rPr>
+          <w:b/>
+          <w:i w:val="0"/>
+        </w:rPr>
+        <w:t>El documento y el artefacto se desincronizan si no se los versiona juntos.</w:t>
+      </w:r>
+      <w:r>
+        <w:rPr>
+          <w:b w:val="0"/>
+          <w:i w:val="0"/>
+        </w:rPr>
+        <w:t xml:space="preserve"> La distancia más costosa de este trabajo no fue técnica sino documental. Por ejemplo, el diagrama de arquitectura quedó anclado a una versión con 71 nodos mientras el sistema llegaba a 128; los anexos quedaron declarativos mientras el repositorio acumulaba el material que debían contener; el capítulo de seguridad describía menos de lo implementado y omitía lo pendiente. La lección es que la documentación de un artefacto vivo debe generarse desde el artefacto, no en paralelo a él.</w:t>
+      </w:r>
+    </w:p>
+    <w:p>
+      <w:pPr>
+        <w:pStyle w:val="Prrafodelista"/>
+      </w:pPr>
+      <w:r>
+        <w:rPr>
+          <w:b/>
+          <w:i w:val="0"/>
+        </w:rPr>
+        <w:t>Una promesa en el objetivo general condiciona toda la cadena metodológica.</w:t>
+      </w:r>
+      <w:r>
+        <w:rPr>
+          <w:b w:val="0"/>
+          <w:i w:val="0"/>
+        </w:rPr>
+        <w:t xml:space="preserve"> Incorporar «reduciendo la carga administrativa» al objetivo obligaba a una estrategia de validación capaz de medirlo, que nunca se diseñó. La decisión correcta —tomada tarde— fue ajustar el objetivo a lo que la validación podía acreditar. Si repitiéramos el trabajo, definiríamos las variables y su forma de medición antes de escribir el objetivo, no después.</w:t>
+      </w:r>
+    </w:p>
+    <w:p>
+      <w:pPr>
+        <w:pStyle w:val="Prrafodelista"/>
+      </w:pPr>
+      <w:r>
+        <w:rPr>
+          <w:b/>
+          <w:i w:val="0"/>
+        </w:rPr>
+        <w:t>La atomicidad se resolvió bien; la frontera transaccional, no.</w:t>
+      </w:r>
+      <w:r>
+        <w:rPr>
+          <w:b w:val="0"/>
+          <w:i w:val="0"/>
+        </w:rPr>
+        <w:t xml:space="preserve"> El análisis de concurrencia de §4.3.2 protege correctamente contra la doble facturación, y fue el problema técnico más difícil del ciclo. Sin embargo, concentrar el esfuerzo en ese punto ocultó que los cuatro pasos siguientes quedaban fuera de toda garantía. Una decisión de diseño correcta en un punto no cubre la operación completa: la pregunta útil no es «¿este nodo es atómico?» sino «¿qué ocurre si falla el paso siguiente?».</w:t>
+      </w:r>
+    </w:p>
+    <w:p>
+      <w:pPr>
+        <w:pStyle w:val="Prrafodelista"/>
+      </w:pPr>
+      <w:r>
+        <w:rPr>
+          <w:b/>
+          <w:i w:val="0"/>
+        </w:rPr>
+        <w:t>El método HTTP no es un detalle de forma.</w:t>
+      </w:r>
+      <w:r>
+        <w:rPr>
+          <w:b w:val="0"/>
+          <w:i w:val="0"/>
+        </w:rPr>
+        <w:t xml:space="preserve"> Resolver la confirmación de pago con un GET alcanzable desde el PDF del deudor parecía, durante el desarrollo, una simplificación admisible para un pago simulado. No lo era: el modelo de confianza que introduce se habría trasladado intacto a una pasarela real. La lección es que las decisiones etiquetadas como «provisorias» deben revisarse con el mismo criterio que las definitivas, porque rara vez se revisan después.</w:t>
+      </w:r>
+    </w:p>
+    <w:p>
+      <w:r>
+        <w:br w:type="page"/>
+      </w:r>
+    </w:p>
+    <w:p>
+      <w:pPr>
+        <w:pStyle w:val="Ttulo1"/>
+      </w:pPr>
+      <w:bookmarkStart w:id="52" w:name="_Toc233808458"/>
+      <w:r>
+        <w:t>Capítulo 8: Trabajos Futuros y Recomendaciones</w:t>
+      </w:r>
+      <w:bookmarkEnd w:id="52"/>
+    </w:p>
+    <w:p>
+      <w:r>
+        <w:rPr>
+          <w:b w:val="0"/>
+        </w:rPr>
+        <w:t>A partir de las limitaciones y de los riesgos identificados, se proponen las siguientes líneas de trabajo, ordenadas de mayor a menor prioridad. Las tres primeras son condición previa a cualquier uso con clientes reales; las restantes amplían el alcance del sistema o del estudio. Esta lista ya no excluye la rotación de credenciales comprometidas: el incidente de seguridad que la motivaba se cerró el 27 de agosto de 2026 y se documenta, resuelto, en el §6.3.</w:t>
+      </w:r>
+    </w:p>
+    <w:p>
+      <w:pPr/>
+      <w:r>
+        <w:rPr>
+          <w:b/>
+          <w:i w:val="0"/>
+        </w:rPr>
+        <w:t>1. Cerrar las deudas de seguridad declaradas en la Tabla 11. Implementar autenticación de origen en los seis webhooks que aún no la tienen —secreto compartido en cabecera o firma HMAC del cuerpo—. Habilitar por defecto la validación de firma del webhook de MercadoPago (MP_WEBHOOK_SECRET). Y almacenar un resumen criptográfico del token de aceptación en lugar del valor en claro (el vencimiento configurable ya está implementado). Ninguna de las tres exige rediseñar el sistema.</w:t>
+      </w:r>
+      <w:r>
+        <w:rPr>
+          <w:b w:val="0"/>
+          <w:i w:val="0"/>
+        </w:rPr>
+      </w:r>
+      <w:r>
+        <w:rPr>
+          <w:rFonts w:ascii="Consolas" w:hAnsi="Consolas" w:cs="Consolas"/>
+          <w:b w:val="0"/>
+          <w:i w:val="0"/>
+        </w:rPr>
+      </w:r>
+      <w:r>
+        <w:rPr>
+          <w:b w:val="0"/>
+          <w:i w:val="0"/>
+        </w:rPr>
+      </w:r>
+    </w:p>
+    <w:p>
+      <w:pPr/>
+      <w:r>
+        <w:rPr>
+          <w:b/>
+          <w:i w:val="0"/>
+        </w:rPr>
+        <w:t>2. Exponer el backend de automatización.</w:t>
+      </w:r>
+      <w:r>
+        <w:rPr>
+          <w:b w:val="0"/>
+          <w:i w:val="0"/>
+        </w:rPr>
+        <w:t xml:space="preserve"> Publicar la instancia de n8n mediante un túnel seguro o un alojamiento en la nube, con una URL estable y HTTPS. Es condición previa a cualquier uso real y debe hacerse después —no antes— de resolver el punto 1, porque exponer públicamente webhooks sin autenticación de origen agrava el riesgo.</w:t>
+      </w:r>
+    </w:p>
+    <w:p>
+      <w:pPr/>
+      <w:r>
+        <w:rPr>
+          <w:b/>
+          <w:i w:val="0"/>
+        </w:rPr>
+        <w:t>3. Completar la frontera transaccional y la reconciliación que queda. De los tres encargos que esta línea reunía, dos se resolvieron el 27 de agosto de 2026: el proceso programado que detecta leads en estado ACEPTADO sin factura asociada y reemite el comprobante de forma idempotente (§4.3.5), y la deduplicación por correo en la captación (§4.3.1). Queda el proceso que detecte, entre los leads en NUEVO, a la propuesta calificada que el profesional dejó sin enviar (§4.3.1 y §4.3.2): hoy sólo se mitiga con la notificación inmediata y la visibilidad en el tablero. Queda también la frontera transaccional propiamente dicha: la reconciliación repara después de la falla y no la evita, deja una ventana de hasta media hora y no reenvía el comprobante por correo. Cerrarla de verdad exige llevar la aceptación y la facturación a una única unidad de trabajo, o adoptar un patrón de saga con compensación explícita.</w:t>
+      </w:r>
+      <w:r>
+        <w:rPr>
+          <w:b w:val="0"/>
+          <w:i w:val="0"/>
+        </w:rPr>
+      </w:r>
+    </w:p>
+    <w:p>
+      <w:pPr/>
+      <w:r>
+        <w:rPr>
+          <w:b/>
+          <w:i w:val="0"/>
+        </w:rPr>
+        <w:t>4. Medir la carga administrativa.</w:t>
+      </w:r>
+      <w:r>
+        <w:rPr>
+          <w:b w:val="0"/>
+          <w:i w:val="0"/>
+        </w:rPr>
+        <w:t xml:space="preserve"> Aplicar la definición operacional propuesta en §1.5 —número de acciones manuales por lead, desde el ingreso hasta el cobro— sobre dos muestras comparables: leads gestionados manualmente y leads gestionados por el sistema. Es la medición que permitiría afirmar lo que la versión original del objetivo general prometía.</w:t>
+      </w:r>
+    </w:p>
+    <w:p>
+      <w:pPr/>
+      <w:r>
+        <w:rPr>
+          <w:b/>
+        </w:rPr>
+        <w:t>5. Completar el cumplimiento normativo. Es condición previa a operar con clientes reales, no una mejora opcional (§2.9). En materia de datos personales: incorporar al formulario el aviso del art. 6 de la Ley 25.326 —finalidad, destinatarios, identidad del responsable, carácter de cada respuesta y derechos de acceso, rectificación y supresión— con consentimiento expreso y separado para la cesión a terceros (art. 11) y para la transferencia internacional (art. 12), o bien suscribir las cláusulas contractuales tipo de la Disposición 60-E/2016 con cada encargado domiciliado fuera de los países de protección adecuada; definir una política de retención que opere la supresión que exige el art. 4.7; e inscribir la base ante la Agencia de Acceso a la Información Pública (art. 21). En materia fiscal: integrar el servicio web de ARCA para solicitar el CAE de cada comprobante y completar CUIT, punto de venta, tipo de comprobante y numeración correlativa, de modo que el documento deje de ser un comprobante interno y pase a tener validez fiscal.</w:t>
+      </w:r>
+    </w:p>
+    <w:p>
+      <w:pPr/>
+      <w:r>
+        <w:rPr>
+          <w:b/>
+        </w:rPr>
+        <w:t>6. Cerrar lo que queda de la integración de pagos. La pasarela de pago real ya está integrada (MercadoPago, §4.3.3) y su rama de cobro está verificada contra un doble de prueba (escenario E14). Quedan tres tareas: repetir esa verificación contra el servicio real cuando la activación de credenciales de prueba del proveedor vuelva a estar disponible, que es lo único que la corrida actual no puede acreditar; habilitar por defecto la validación de firma del webhook (MP_WEBHOOK_SECRET), hoy opcional; y evaluar el split de pagos vía la API de Marketplace de MercadoPago cuando el sistema pase a operar con más de un profesional cobrando a cuentas distintas (§4.5).</w:t>
+      </w:r>
+    </w:p>
+    <w:p>
+      <w:pPr/>
+      <w:r>
+        <w:rPr>
+          <w:b/>
+          <w:i w:val="0"/>
+        </w:rPr>
+        <w:t>7. Ampliar la cobertura de pruebas automatizadas y la observabilidad.</w:t>
+      </w:r>
+      <w:r>
+        <w:rPr>
+          <w:b w:val="0"/>
+          <w:i w:val="0"/>
+        </w:rPr>
+        <w:t xml:space="preserve"> A partir de la prueba de humo existente sobre los nodos Code, extender las pruebas hacia la verificación funcional de las reglas de negocio —aserciones sobre el score de los casos de la Tabla 5 y sobre las transiciones de la Tabla 9—. Asimismo, hacia los componentes del frontend y hacia los flujos de integración de extremo a extremo. Incorporar métricas de ejecución del flujo, aprovechando la tabla </w:t>
+      </w:r>
+      <w:r>
+        <w:rPr>
+          <w:rFonts w:ascii="Consolas" w:hAnsi="Consolas" w:cs="Consolas"/>
+          <w:b w:val="0"/>
+          <w:i w:val="0"/>
+        </w:rPr>
         <w:t>logs</w:t>
       </w:r>
       <w:r>
@@ -24527,7 +24737,7 @@
           <w:b w:val="0"/>
           <w:i w:val="0"/>
         </w:rPr>
-        <w:t xml:space="preserve"> y un tablero que expone el embudo completo.</w:t>
+        <w:t>, que hoy existe y no alimenta ningún tablero de salud.</w:t>
       </w:r>
     </w:p>
     <w:p>
@@ -24537,136 +24747,75 @@
           <w:b/>
           <w:i w:val="0"/>
         </w:rPr>
-        <w:t>Respuesta a la pregunta de investigación, y su límite.</w:t>
-      </w:r>
-      <w:r>
-        <w:rPr>
-          <w:b w:val="0"/>
-          <w:i w:val="0"/>
-        </w:rPr>
-        <w:t xml:space="preserve"> La condición «sin sacrificar la trazabilidad ni el control» se satisface: el profesional conserva el control mediante el tablero interno, que permite cancelar leads, resolver pedidos de cambio y actualizar el estado del trabajo. Lo que la evidencia recogida </w:t>
-      </w:r>
-      <w:r>
-        <w:rPr>
-          <w:b w:val="0"/>
-          <w:i/>
-        </w:rPr>
-        <w:t>no</w:t>
-      </w:r>
-      <w:r>
-        <w:rPr>
-          <w:b w:val="0"/>
-          <w:i w:val="0"/>
-        </w:rPr>
-        <w:t xml:space="preserve"> acredita es la magnitud de la reducción de la carga administrativa. Se trata de una limitación de diseño de la validación, no de un hallazgo negativo: los escenarios funcionales, por construcción, verifican comportamiento y no miden esfuerzo. Afirmar lo contrario sería exceder lo demostrado, y por eso el objetivo general fue reformulado en §1.5 en lugar de darse por cumplido en su versión original.</w:t>
+        <w:t>8. Calibrar el scoring con datos históricos.</w:t>
+      </w:r>
+      <w:r>
+        <w:rPr>
+          <w:b w:val="0"/>
+          <w:i w:val="0"/>
+        </w:rPr>
+        <w:t xml:space="preserve"> Registrar la conversión efectiva de los leads y ajustar umbrales y ponderaciones a partir de esos datos, transformando la validez de diseño del modelo en validez empírica. Revisar en esa instancia las tres decisiones señaladas en §4.3.1: la alineación entre el rango del control deslizante y los tramos de puntaje; la ponderación que reemplazó al sesgo de la opción «Otro», hoy fijada por criterio y no por datos; y los cuatro valores de servicio hoy inalcanzables desde el formulario.</w:t>
       </w:r>
     </w:p>
     <w:p>
       <w:pPr/>
       <w:r>
         <w:rPr>
-          <w:b w:val="0"/>
-          <w:i w:val="0"/>
-        </w:rPr>
-        <w:t>Queda sugerida, pero no demostrada, la mejora de indicadores comerciales reales, que dependería de una operación en producción. El menor costo operativo, en cambio, sí está estimado: la Tabla 13 lo cifra en USD 56,40 a doce meses frente a USD 588,00 de un CRM comercial y USD 359,88 de una plataforma de integración, con el plan y la fecha de consulta declarados en cada celda. La salvedad es de naturaleza distinta: esa comparación no incorpora el costo del desarrollo ni el del mantenimiento, que recaen sobre el profesional y que ninguna de las alternativas le cobra.</w:t>
-      </w:r>
-    </w:p>
-    <w:p>
-      <w:pPr>
-        <w:pStyle w:val="Ttulo2"/>
-      </w:pPr>
-      <w:r>
-        <w:rPr>
-          <w:b w:val="0"/>
-          <w:i w:val="0"/>
-        </w:rPr>
-        <w:t>7.1 Aprendizajes del proceso</w:t>
+          <w:b/>
+          <w:i w:val="0"/>
+        </w:rPr>
+        <w:t>9. Completar la configuración de autenticación y roles.</w:t>
+      </w:r>
+      <w:r>
+        <w:rPr>
+          <w:b w:val="0"/>
+          <w:i w:val="0"/>
+        </w:rPr>
+        <w:t xml:space="preserve"> Finalizar la configuración administrativa de Supabase (URL de redirección y confirmación de correo) y ampliar el modelo de roles para escenarios con más de un profesional.</w:t>
       </w:r>
     </w:p>
     <w:p>
       <w:pPr/>
       <w:r>
         <w:rPr>
-          <w:b w:val="0"/>
-          <w:i w:val="0"/>
-        </w:rPr>
-        <w:t>Un capítulo de conclusiones aporta algo que ningún otro puede aportar: qué aprendieron los autores. Se registran cuatro aprendizajes, formulados a partir de lo que efectivamente ocurrió durante el desarrollo.</w:t>
-      </w:r>
-    </w:p>
-    <w:p>
-      <w:pPr>
-        <w:pStyle w:val="Prrafodelista"/>
-      </w:pPr>
-      <w:r>
-        <w:rPr>
           <w:b/>
           <w:i w:val="0"/>
         </w:rPr>
-        <w:t>El documento y el artefacto se desincronizan si no se los versiona juntos.</w:t>
-      </w:r>
-      <w:r>
-        <w:rPr>
-          <w:b w:val="0"/>
-          <w:i w:val="0"/>
-        </w:rPr>
-        <w:t xml:space="preserve"> La distancia más costosa de este trabajo no fue técnica sino documental. Por ejemplo, el diagrama de arquitectura quedó anclado a una versión con 71 nodos mientras el sistema llegaba a 128; los anexos quedaron declarativos mientras el repositorio acumulaba el material que debían contener; el capítulo de seguridad describía menos de lo implementado y omitía lo pendiente. La lección es que la documentación de un artefacto vivo debe generarse desde el artefacto, no en paralelo a él.</w:t>
-      </w:r>
-    </w:p>
-    <w:p>
-      <w:pPr>
-        <w:pStyle w:val="Prrafodelista"/>
-      </w:pPr>
+        <w:t>10. Unificar la nomenclatura de las rutas de integración, hoy dividida entre barra (/lead/nuevo y /mp/notificacion, esta última impuesta por el proveedor) y guion (el resto). No tiene efecto funcional, pero rompe la uniformidad del contrato; unificarla exige actualizar la variable de entorno del frontend y el nodo correspondiente del flujo (§4.5).</w:t>
+      </w:r>
+    </w:p>
+    <w:p>
+      <w:pPr/>
       <w:r>
         <w:rPr>
           <w:b/>
           <w:i w:val="0"/>
         </w:rPr>
-        <w:t>Una promesa en el objetivo general condiciona toda la cadena metodológica.</w:t>
-      </w:r>
-      <w:r>
-        <w:rPr>
-          <w:b w:val="0"/>
-          <w:i w:val="0"/>
-        </w:rPr>
-        <w:t xml:space="preserve"> Incorporar «reduciendo la carga administrativa» al objetivo obligaba a una estrategia de validación capaz de medirlo, que nunca se diseñó. La decisión correcta —tomada tarde— fue ajustar el objetivo a lo que la validación podía acreditar. Si repitiéramos el trabajo, definiríamos las variables y su forma de medición antes de escribir el objetivo, no después.</w:t>
-      </w:r>
-    </w:p>
-    <w:p>
-      <w:pPr>
-        <w:pStyle w:val="Prrafodelista"/>
-      </w:pPr>
+        <w:t>11. Realizar un relevamiento primario con usuarios reales.</w:t>
+      </w:r>
+      <w:r>
+        <w:rPr>
+          <w:b w:val="0"/>
+          <w:i w:val="0"/>
+        </w:rPr>
+        <w:t xml:space="preserve"> Encuestar o entrevistar a una muestra de freelancers para validar empíricamente las prioridades del ciclo comercial y calibrar los umbrales del scoring (§3.3 y §6). Contrastar además la comparación de §2.7 contra evaluaciones de analistas independientes o datos agregados de usuarios, de modo que las afirmaciones funcionales sobre las cuatro alternativas dejen de apoyarse únicamente en lo que cada proveedor declara de sí mismo.</w:t>
+      </w:r>
+    </w:p>
+    <w:p>
+      <w:pPr/>
       <w:r>
         <w:rPr>
           <w:b/>
           <w:i w:val="0"/>
         </w:rPr>
-        <w:t>La atomicidad se resolvió bien; la frontera transaccional, no.</w:t>
-      </w:r>
-      <w:r>
-        <w:rPr>
-          <w:b w:val="0"/>
-          <w:i w:val="0"/>
-        </w:rPr>
-        <w:t xml:space="preserve"> El análisis de concurrencia de §4.3.2 protege correctamente contra la doble facturación, y fue el problema técnico más difícil del ciclo. Sin embargo, concentrar el esfuerzo en ese punto ocultó que los cuatro pasos siguientes quedaban fuera de toda garantía. Una decisión de diseño correcta en un punto no cubre la operación completa: la pregunta útil no es «¿este nodo es atómico?» sino «¿qué ocurre si falla el paso siguiente?».</w:t>
-      </w:r>
-    </w:p>
-    <w:p>
-      <w:pPr>
-        <w:pStyle w:val="Prrafodelista"/>
-      </w:pPr>
-      <w:r>
-        <w:rPr>
-          <w:b/>
-          <w:i w:val="0"/>
-        </w:rPr>
-        <w:t>El método HTTP no es un detalle de forma.</w:t>
-      </w:r>
-      <w:r>
-        <w:rPr>
-          <w:b w:val="0"/>
-          <w:i w:val="0"/>
-        </w:rPr>
-        <w:t xml:space="preserve"> Resolver la confirmación de pago con un GET alcanzable desde el PDF del deudor parecía, durante el desarrollo, una simplificación admisible para un pago simulado. No lo era: el modelo de confianza que introduce se habría trasladado intacto a una pasarela real. La lección es que las decisiones etiquetadas como «provisorias» deben revisarse con el mismo criterio que las definitivas, porque rara vez se revisan después.</w:t>
+        <w:t>12. Abstraer los canales de notificación y de generación documental.</w:t>
+      </w:r>
+      <w:r>
+        <w:rPr>
+          <w:b w:val="0"/>
+          <w:i w:val="0"/>
+        </w:rPr>
+        <w:t xml:space="preserve"> Introducir una capa que desacople el flujo de Gmail, Telegram, Notion y Gotenberg, de modo que incorporar o sustituir un canal no exija modificar cada punto de notificación (§6).</w:t>
       </w:r>
     </w:p>
     <w:p>
@@ -24678,237 +24827,6 @@
       <w:pPr>
         <w:pStyle w:val="Ttulo1"/>
       </w:pPr>
-      <w:bookmarkStart w:id="52" w:name="_Toc233808458"/>
-      <w:r>
-        <w:t>Capítulo 8: Trabajos Futuros y Recomendaciones</w:t>
-      </w:r>
-      <w:bookmarkEnd w:id="52"/>
-    </w:p>
-    <w:p>
-      <w:r>
-        <w:rPr>
-          <w:b w:val="0"/>
-        </w:rPr>
-        <w:t>A partir de las limitaciones y de los riesgos identificados, se proponen las siguientes líneas de trabajo, ordenadas de mayor a menor prioridad. Las tres primeras son condición previa a cualquier uso con clientes reales; las restantes amplían el alcance del sistema o del estudio. Esta lista ya no excluye la rotación de credenciales comprometidas: el incidente de seguridad que la motivaba se cerró el 27 de agosto de 2026 y se documenta, resuelto, en el §6.3.</w:t>
-      </w:r>
-    </w:p>
-    <w:p>
-      <w:pPr/>
-      <w:r>
-        <w:rPr>
-          <w:b/>
-          <w:i w:val="0"/>
-        </w:rPr>
-        <w:t>1. Cerrar las deudas de seguridad declaradas en la Tabla 11. Implementar autenticación de origen en los seis webhooks que aún no la tienen —secreto compartido en cabecera o firma HMAC del cuerpo—. Habilitar por defecto la validación de firma del webhook de MercadoPago (MP_WEBHOOK_SECRET). Y almacenar un resumen criptográfico del token de aceptación en lugar del valor en claro (el vencimiento configurable ya está implementado). Ninguna de las tres exige rediseñar el sistema.</w:t>
-      </w:r>
-      <w:r>
-        <w:rPr>
-          <w:b w:val="0"/>
-          <w:i w:val="0"/>
-        </w:rPr>
-      </w:r>
-      <w:r>
-        <w:rPr>
-          <w:rFonts w:ascii="Consolas" w:hAnsi="Consolas" w:cs="Consolas"/>
-          <w:b w:val="0"/>
-          <w:i w:val="0"/>
-        </w:rPr>
-      </w:r>
-      <w:r>
-        <w:rPr>
-          <w:b w:val="0"/>
-          <w:i w:val="0"/>
-        </w:rPr>
-      </w:r>
-    </w:p>
-    <w:p>
-      <w:pPr/>
-      <w:r>
-        <w:rPr>
-          <w:b/>
-          <w:i w:val="0"/>
-        </w:rPr>
-        <w:t>2. Exponer el backend de automatización.</w:t>
-      </w:r>
-      <w:r>
-        <w:rPr>
-          <w:b w:val="0"/>
-          <w:i w:val="0"/>
-        </w:rPr>
-        <w:t xml:space="preserve"> Publicar la instancia de n8n mediante un túnel seguro o un alojamiento en la nube, con una URL estable y HTTPS. Es condición previa a cualquier uso real y debe hacerse después —no antes— de resolver el punto 1, porque exponer públicamente webhooks sin autenticación de origen agrava el riesgo.</w:t>
-      </w:r>
-    </w:p>
-    <w:p>
-      <w:pPr/>
-      <w:r>
-        <w:rPr>
-          <w:b/>
-          <w:i w:val="0"/>
-        </w:rPr>
-        <w:t>3. Completar la frontera transaccional y la reconciliación que queda. De los tres encargos que esta línea reunía, dos se resolvieron el 27 de agosto de 2026: el proceso programado que detecta leads en estado ACEPTADO sin factura asociada y reemite el comprobante de forma idempotente (§4.3.5), y la deduplicación por correo en la captación (§4.3.1). Queda el proceso que detecte leads en NUEVO con antigüedad superior a un umbral.</w:t>
-      </w:r>
-      <w:r>
-        <w:rPr>
-          <w:b w:val="0"/>
-          <w:i w:val="0"/>
-        </w:rPr>
-        <w:t xml:space="preserve"> En efecto, ese proceso cubre ahora dos casos distintos: el síntoma de un fallo del nodo de scoring y la propuesta calificada que el profesional dejó sin enviar (§4.3.1 y §4.3.2). Este segundo caso es el más probable de los dos y hoy sólo se mitiga con la notificación inmediata y la visibilidad en el tablero. Queda también la frontera transaccional propiamente dicha: la reconciliación repara después de la falla y no la evita, deja una ventana de hasta media hora y no reenvía el comprobante por correo. Cerrarla de verdad exige llevar la aceptación y la facturación a una única unidad de trabajo, o adoptar un patrón de saga con compensación explícita.</w:t>
-      </w:r>
-    </w:p>
-    <w:p>
-      <w:pPr/>
-      <w:r>
-        <w:rPr>
-          <w:b/>
-          <w:i w:val="0"/>
-        </w:rPr>
-        <w:t>4. Medir la carga administrativa.</w:t>
-      </w:r>
-      <w:r>
-        <w:rPr>
-          <w:b w:val="0"/>
-          <w:i w:val="0"/>
-        </w:rPr>
-        <w:t xml:space="preserve"> Aplicar la definición operacional propuesta en §1.5 —número de acciones manuales por lead, desde el ingreso hasta el cobro— sobre dos muestras comparables: leads gestionados manualmente y leads gestionados por el sistema. Es la medición que permitiría afirmar lo que la versión original del objetivo general prometía.</w:t>
-      </w:r>
-    </w:p>
-    <w:p>
-      <w:pPr/>
-      <w:r>
-        <w:rPr>
-          <w:b/>
-        </w:rPr>
-        <w:t>5. Completar el cumplimiento normativo. Es condición previa a operar con clientes reales, no una mejora opcional (§2.9). En materia de datos personales: incorporar al formulario el aviso del art. 6 de la Ley 25.326 —finalidad, destinatarios, identidad del responsable, carácter de cada respuesta y derechos de acceso, rectificación y supresión— con consentimiento expreso y separado para la cesión a terceros (art. 11) y para la transferencia internacional (art. 12), o bien suscribir las cláusulas contractuales tipo de la Disposición 60-E/2016 con cada encargado domiciliado fuera de los países de protección adecuada; definir una política de retención que opere la supresión que exige el art. 4.7; e inscribir la base ante la Agencia de Acceso a la Información Pública (art. 21). En materia fiscal: integrar el servicio web de ARCA para solicitar el CAE de cada comprobante y completar CUIT, punto de venta, tipo de comprobante y numeración correlativa, de modo que el documento deje de ser un comprobante interno y pase a tener validez fiscal.</w:t>
-      </w:r>
-    </w:p>
-    <w:p>
-      <w:pPr/>
-      <w:r>
-        <w:rPr>
-          <w:b/>
-        </w:rPr>
-        <w:t>6. Cerrar lo que queda de la integración de pagos. La pasarela de pago real ya está integrada (MercadoPago, §4.3.3) y su rama de cobro está verificada contra un doble de prueba (escenario E14). Quedan tres tareas: repetir esa verificación contra el servicio real cuando la activación de credenciales de prueba del proveedor vuelva a estar disponible, que es lo único que la corrida actual no puede acreditar; habilitar por defecto la validación de firma del webhook (MP_WEBHOOK_SECRET), hoy opcional; y evaluar el split de pagos vía la API de Marketplace de MercadoPago cuando el sistema pase a operar con más de un profesional cobrando a cuentas distintas (§4.5).</w:t>
-      </w:r>
-    </w:p>
-    <w:p>
-      <w:pPr/>
-      <w:r>
-        <w:rPr>
-          <w:b/>
-          <w:i w:val="0"/>
-        </w:rPr>
-        <w:t>7. Ampliar la cobertura de pruebas automatizadas y la observabilidad.</w:t>
-      </w:r>
-      <w:r>
-        <w:rPr>
-          <w:b w:val="0"/>
-          <w:i w:val="0"/>
-        </w:rPr>
-        <w:t xml:space="preserve"> A partir de la prueba de humo existente sobre los nodos Code, extender las pruebas hacia la verificación funcional de las reglas de negocio —aserciones sobre el score de los casos de la Tabla 5 y sobre las transiciones de la Tabla 9—. Asimismo, hacia los componentes del frontend y hacia los flujos de integración de extremo a extremo. Incorporar métricas de ejecución del flujo, aprovechando la tabla </w:t>
-      </w:r>
-      <w:r>
-        <w:rPr>
-          <w:rFonts w:ascii="Consolas" w:hAnsi="Consolas" w:cs="Consolas"/>
-          <w:b w:val="0"/>
-          <w:i w:val="0"/>
-        </w:rPr>
-        <w:t>logs</w:t>
-      </w:r>
-      <w:r>
-        <w:rPr>
-          <w:b w:val="0"/>
-          <w:i w:val="0"/>
-        </w:rPr>
-        <w:t>, que hoy existe y no alimenta ningún tablero de salud.</w:t>
-      </w:r>
-    </w:p>
-    <w:p>
-      <w:pPr/>
-      <w:r>
-        <w:rPr>
-          <w:b/>
-          <w:i w:val="0"/>
-        </w:rPr>
-        <w:t>8. Calibrar el scoring con datos históricos.</w:t>
-      </w:r>
-      <w:r>
-        <w:rPr>
-          <w:b w:val="0"/>
-          <w:i w:val="0"/>
-        </w:rPr>
-        <w:t xml:space="preserve"> Registrar la conversión efectiva de los leads y ajustar umbrales y ponderaciones a partir de esos datos, transformando la validez de diseño del modelo en validez empírica. Revisar en esa instancia las tres decisiones señaladas en §4.3.1: la alineación entre el rango del control deslizante y los tramos de puntaje; la ponderación que reemplazó al sesgo de la opción «Otro», hoy fijada por criterio y no por datos; y los cuatro valores de servicio hoy inalcanzables desde el formulario.</w:t>
-      </w:r>
-    </w:p>
-    <w:p>
-      <w:pPr/>
-      <w:r>
-        <w:rPr>
-          <w:b/>
-          <w:i w:val="0"/>
-        </w:rPr>
-        <w:t>9. Completar la configuración de autenticación y roles.</w:t>
-      </w:r>
-      <w:r>
-        <w:rPr>
-          <w:b w:val="0"/>
-          <w:i w:val="0"/>
-        </w:rPr>
-        <w:t xml:space="preserve"> Finalizar la configuración administrativa de Supabase (URL de redirección y confirmación de correo) y ampliar el modelo de roles para escenarios con más de un profesional.</w:t>
-      </w:r>
-    </w:p>
-    <w:p>
-      <w:pPr/>
-      <w:r>
-        <w:rPr>
-          <w:b/>
-          <w:i w:val="0"/>
-        </w:rPr>
-        <w:t>10. Unificar la nomenclatura de las rutas de integración, hoy dividida entre barra (/lead/nuevo) y guion (el resto). No tiene efecto funcional, pero rompe la uniformidad del contrato; unificarla exige actualizar la variable de entorno del frontend y el nodo correspondiente del flujo (§4.5).</w:t>
-      </w:r>
-    </w:p>
-    <w:p>
-      <w:pPr/>
-      <w:r>
-        <w:rPr>
-          <w:b/>
-          <w:i w:val="0"/>
-        </w:rPr>
-        <w:t>11. Realizar un relevamiento primario con usuarios reales.</w:t>
-      </w:r>
-      <w:r>
-        <w:rPr>
-          <w:b w:val="0"/>
-          <w:i w:val="0"/>
-        </w:rPr>
-        <w:t xml:space="preserve"> Encuestar o entrevistar a una muestra de freelancers para validar empíricamente las prioridades del ciclo comercial y calibrar los umbrales del scoring (§3.3 y §6). Contrastar además la comparación de §2.7 contra evaluaciones de analistas independientes o datos agregados de usuarios, de modo que las afirmaciones funcionales sobre las cuatro alternativas dejen de apoyarse únicamente en lo que cada proveedor declara de sí mismo.</w:t>
-      </w:r>
-    </w:p>
-    <w:p>
-      <w:pPr/>
-      <w:r>
-        <w:rPr>
-          <w:b/>
-          <w:i w:val="0"/>
-        </w:rPr>
-        <w:t>12. Abstraer los canales de notificación y de generación documental.</w:t>
-      </w:r>
-      <w:r>
-        <w:rPr>
-          <w:b w:val="0"/>
-          <w:i w:val="0"/>
-        </w:rPr>
-        <w:t xml:space="preserve"> Introducir una capa que desacople el flujo de Gmail, Telegram, Notion y Gotenberg, de modo que incorporar o sustituir un canal no exija modificar cada punto de notificación (§6).</w:t>
-      </w:r>
-    </w:p>
-    <w:p>
-      <w:r>
-        <w:br w:type="page"/>
-      </w:r>
-    </w:p>
-    <w:p>
-      <w:pPr>
-        <w:pStyle w:val="Ttulo1"/>
-      </w:pPr>
       <w:bookmarkStart w:id="53" w:name="_Toc233808459"/>
       <w:r>
         <w:t>Referencias</w:t>
@@ -24916,7 +24834,9 @@
       <w:bookmarkEnd w:id="53"/>
     </w:p>
     <w:p>
-      <w:pPr/>
+      <w:pPr>
+        <w:ind w:left="720" w:hanging="720"/>
+      </w:pPr>
       <w:bookmarkStart w:id="53" w:name="_Toc233808459"/>
       <w:bookmarkEnd w:id="53"/>
       <w:r>
@@ -26346,7 +26266,7 @@
       <w:r>
         <w:drawing>
           <wp:inline xmlns:a="http://schemas.openxmlformats.org/drawingml/2006/main" xmlns:pic="http://schemas.openxmlformats.org/drawingml/2006/picture">
-            <wp:extent cx="5580000" cy="645188"/>
+            <wp:extent cx="5580000" cy="1216995"/>
             <wp:docPr id="26" name="Picture 26"/>
             <wp:cNvGraphicFramePr>
               <a:graphicFrameLocks noChangeAspect="1"/>
@@ -26367,7 +26287,7 @@
                   <pic:spPr>
                     <a:xfrm>
                       <a:off x="0" y="0"/>
-                      <a:ext cx="5580000" cy="645188"/>
+                      <a:ext cx="5580000" cy="1216995"/>
                     </a:xfrm>
                     <a:prstGeom prst="rect"/>
                   </pic:spPr>
@@ -26388,7 +26308,7 @@
           <w:i w:val="0"/>
           <w:sz w:val="17"/>
         </w:rPr>
-        <w:t>Figura 8.</w:t>
+        <w:t>Figura 8. Flujo de captación y calificación en n8n: webhook de nuevo lead, normalización, verificación de duplicados, scoring, inserción ya calificada y el aviso de que la propuesta queda pendiente de que el profesional la envíe (§4.3.1). Nota. Captura propia del lienzo de n8n.</w:t>
       </w:r>
       <w:r>
         <w:rPr>
@@ -26396,7 +26316,6 @@
           <w:i w:val="0"/>
           <w:sz w:val="17"/>
         </w:rPr>
-        <w:t xml:space="preserve"> Flujo de captación y calificación en n8n: webhook de nuevo lead, normalización, inserción, scoring, ramificación por nivel y envío de la propuesta (§4.3.1). </w:t>
       </w:r>
       <w:r>
         <w:rPr>
@@ -26404,7 +26323,6 @@
           <w:i/>
           <w:sz w:val="17"/>
         </w:rPr>
-        <w:t>Nota.</w:t>
       </w:r>
       <w:r>
         <w:rPr>
@@ -26412,7 +26330,6 @@
           <w:i w:val="0"/>
           <w:sz w:val="17"/>
         </w:rPr>
-        <w:t xml:space="preserve"> Captura propia del lienzo de n8n.</w:t>
       </w:r>
     </w:p>
     <w:p>

</xml_diff>

<commit_message>
docs(tesis): cerrar C04-C06 del dictamen de correcciones v2
- Figuras 6->pendiente (bloqueada por Turbopack/Windows, ver nota de sesion),
  13, 14 y 16 regeneradas con datos neutros conforme al protocolo de la
  Tabla 4 (Cliente Demo 1-3, dominio ejemplo.com) - C04
- Figura 16 recapturada con las entradas reales de E1/E2/E3 (100/47/20),
  coincide con la Tabla 12 - C05
- Figura 13 recapturada sobre el escenario E5 (precio 7200, plazo 3 semanas
  fijados por el profesional) en vez del diseno anterior - C06
- Figura 14 con nota que verifica que el nombre del adjunto PDF no deriva
  del accept_token (C21): es un identificador que asigna n8n a la respuesta
  binaria de Gotenberg
- docs/evidencia-validacion.md actualizado con la corrida real de E1/E1b/E2/E3
  tras destrabar el n8n local (webhook_entity con fila huerfana de un
  workflow viejo, ver memoria de sesion)
</commit_message>
<xml_diff>
--- a/FormularioLeads/tesis.docx
+++ b/FormularioLeads/tesis.docx
@@ -26648,7 +26648,7 @@
       <w:r>
         <w:drawing>
           <wp:inline xmlns:a="http://schemas.openxmlformats.org/drawingml/2006/main" xmlns:pic="http://schemas.openxmlformats.org/drawingml/2006/picture">
-            <wp:extent cx="3675887" cy="3694175"/>
+            <wp:extent cx="3675887" cy="4741894"/>
             <wp:docPr id="31" name="Picture 31"/>
             <wp:cNvGraphicFramePr>
               <a:graphicFrameLocks noChangeAspect="1"/>
@@ -26669,7 +26669,7 @@
                   <pic:spPr>
                     <a:xfrm>
                       <a:off x="0" y="0"/>
-                      <a:ext cx="3675887" cy="3694175"/>
+                      <a:ext cx="3675887" cy="4741894"/>
                     </a:xfrm>
                     <a:prstGeom prst="rect"/>
                   </pic:spPr>
@@ -26690,7 +26690,7 @@
           <w:i w:val="0"/>
           <w:sz w:val="17"/>
         </w:rPr>
-        <w:t>Figura 13.</w:t>
+        <w:t>Figura 13. Correo de propuesta generado por el sistema, con los términos fijados por el profesional (§4.3.1, escenario E5). Nota. La captura anterior mostraba el correo personal de uno de los autores como remitente y como lead de prueba, en incumplimiento del protocolo de la Tabla 4. Esta figura se generó ejecutando el nodo real Code - Generar Propuesta con datos neutros conforme a ese protocolo (Cliente Demo 1, dominio ejemplo.com) y los valores reales de E5 (precio 7200, plazo 3 semanas), renderizando el HTML resultante. El envío por Gmail no se ejecutó por la credencial vencida (Tabla 11); el contenido es el que ese nodo produce sin variación.</w:t>
       </w:r>
       <w:r>
         <w:rPr>
@@ -26698,7 +26698,6 @@
           <w:i w:val="0"/>
           <w:sz w:val="17"/>
         </w:rPr>
-        <w:t xml:space="preserve"> Correo de propuesta generado y enviado por el sistema (§4.3.1, escenario E5). </w:t>
       </w:r>
       <w:r>
         <w:rPr>
@@ -26706,7 +26705,6 @@
           <w:i/>
           <w:sz w:val="17"/>
         </w:rPr>
-        <w:t>Nota.</w:t>
       </w:r>
       <w:r>
         <w:rPr>
@@ -26714,7 +26712,6 @@
           <w:i w:val="0"/>
           <w:sz w:val="17"/>
         </w:rPr>
-        <w:t xml:space="preserve"> Captura propia. Corresponde a una ejecución distinta de la de las Figuras 14 y 15.</w:t>
       </w:r>
     </w:p>
     <w:p>
@@ -26725,7 +26722,7 @@
       <w:r>
         <w:drawing>
           <wp:inline xmlns:a="http://schemas.openxmlformats.org/drawingml/2006/main" xmlns:pic="http://schemas.openxmlformats.org/drawingml/2006/picture">
-            <wp:extent cx="4754880" cy="2271304"/>
+            <wp:extent cx="4754880" cy="1834025"/>
             <wp:docPr id="51" name="Picture 51"/>
             <wp:cNvGraphicFramePr>
               <a:graphicFrameLocks noChangeAspect="1"/>
@@ -26746,7 +26743,7 @@
                   <pic:spPr>
                     <a:xfrm>
                       <a:off x="0" y="0"/>
-                      <a:ext cx="4754880" cy="2271304"/>
+                      <a:ext cx="4754880" cy="1834025"/>
                     </a:xfrm>
                     <a:prstGeom prst="rect"/>
                   </pic:spPr>
@@ -26767,7 +26764,7 @@
           <w:i w:val="0"/>
           <w:sz w:val="17"/>
         </w:rPr>
-        <w:t>Figura 14.</w:t>
+        <w:t>Figura 14. Correo de envío de la factura con el comprobante adjunto en PDF (§4.3.2, escenario E5). Nota. La captura anterior mostraba el correo personal de uno de los autores. Esta figura se generó del mismo modo que la Figura 13, con los mismos datos neutros, ejecutando el mensaje real del nodo Gmail - Enviar Factura PDF. El nombre del adjunto es un identificador que el nodo HTTP Request de n8n asigna automáticamente a la respuesta binaria de Gotenberg cuando no se declara un nombre de archivo explícito; se verificó contra el código del flujo que no deriva del accept_token del lead ni de ningún otro dato sensible, sino que es un valor interno de n8n ajeno a la aplicación.</w:t>
       </w:r>
       <w:r>
         <w:rPr>
@@ -26775,7 +26772,6 @@
           <w:i w:val="0"/>
           <w:sz w:val="17"/>
         </w:rPr>
-        <w:t xml:space="preserve"> Correo de envío de la factura con el comprobante adjunto en PDF (§4.3.2, escenario E5). </w:t>
       </w:r>
       <w:r>
         <w:rPr>
@@ -26783,7 +26779,6 @@
           <w:i/>
           <w:sz w:val="17"/>
         </w:rPr>
-        <w:t>Nota.</w:t>
       </w:r>
       <w:r>
         <w:rPr>
@@ -26791,7 +26786,6 @@
           <w:i w:val="0"/>
           <w:sz w:val="17"/>
         </w:rPr>
-        <w:t xml:space="preserve"> Captura propia. Corresponde a una ejecución distinta de la de la Figura 13.</w:t>
       </w:r>
     </w:p>
     <w:p>
@@ -26899,7 +26893,7 @@
       <w:r>
         <w:drawing>
           <wp:inline xmlns:a="http://schemas.openxmlformats.org/drawingml/2006/main" xmlns:pic="http://schemas.openxmlformats.org/drawingml/2006/picture">
-            <wp:extent cx="4834128" cy="835152"/>
+            <wp:extent cx="4834128" cy="869057"/>
             <wp:docPr id="33" name="Picture 33"/>
             <wp:cNvGraphicFramePr>
               <a:graphicFrameLocks noChangeAspect="1"/>
@@ -26920,7 +26914,7 @@
                   <pic:spPr>
                     <a:xfrm>
                       <a:off x="0" y="0"/>
-                      <a:ext cx="4834128" cy="835152"/>
+                      <a:ext cx="4834128" cy="869057"/>
                     </a:xfrm>
                     <a:prstGeom prst="rect"/>
                   </pic:spPr>
@@ -26941,7 +26935,7 @@
           <w:i w:val="0"/>
           <w:sz w:val="17"/>
         </w:rPr>
-        <w:t>Figura 16.</w:t>
+        <w:t>Figura 16. Clasificación de leads por score y nivel: ejemplos HOT, WARM y COLD registrados en la tabla leads (§4.3.1, escenarios E1 a E3). Nota. La captura anterior usaba a los propios autores como leads de prueba y valores que no correspondían a E1-E3. Esta figura se generó enviando tres leads reales con los datos de la Tabla 4 (Cliente Demo 1 a 3, dominio ejemplo.com) y las entradas exactas de E1, E2 y E3, y consultando la tabla leads resultante: los tres puntajes (100, 47, 20) coinciden con la Tabla 12.</w:t>
       </w:r>
       <w:r>
         <w:rPr>
@@ -26949,7 +26943,6 @@
           <w:i w:val="0"/>
           <w:sz w:val="17"/>
         </w:rPr>
-        <w:t xml:space="preserve"> Clasificación de leads por score y nivel: ejemplos HOT, WARM y COLD registrados en la tabla </w:t>
       </w:r>
       <w:r>
         <w:rPr>
@@ -26958,7 +26951,6 @@
           <w:i w:val="0"/>
           <w:sz w:val="17"/>
         </w:rPr>
-        <w:t>leads</w:t>
       </w:r>
       <w:r>
         <w:rPr>
@@ -26966,7 +26958,6 @@
           <w:i w:val="0"/>
           <w:sz w:val="17"/>
         </w:rPr>
-        <w:t xml:space="preserve"> (§4.3.1, escenarios E1 a E3). </w:t>
       </w:r>
       <w:r>
         <w:rPr>
@@ -26974,7 +26965,6 @@
           <w:i/>
           <w:sz w:val="17"/>
         </w:rPr>
-        <w:t>Nota.</w:t>
       </w:r>
       <w:r>
         <w:rPr>
@@ -26982,7 +26972,6 @@
           <w:i w:val="0"/>
           <w:sz w:val="17"/>
         </w:rPr>
-        <w:t xml:space="preserve"> Captura propia de la consola de la base de datos.</w:t>
       </w:r>
     </w:p>
     <w:p>
@@ -29321,7 +29310,7 @@
           <w:i/>
           <w:sz w:val="15"/>
         </w:rPr>
-        <w:t>Nota. Elaboración propia a partir de workflow/crm_postgres.json. El flujo exportado se incluye íntegro en el repositorio y puede importarse en una instancia de n8n sin modificaciones.</w:t>
+        <w:t>Nota. Elaboración propia a partir de workflow/crm_postgres.json. El flujo exportado se incluye íntegro en el repositorio y puede importarse en una instancia de n8n sin modificaciones. En el lienzo de n8n estos procesos se agrupan bajo notas adhesivas tituladas «RAMA n», rotulación visual que no se corresponde con un orden ni se usa en el cuerpo del texto: RAMA 1 es la captación y calificación, RAMA 2 la aceptación y facturación, RAMA 3 el seguimiento de propuestas, RAMA 4 los recordatorios de pago, RAMA 5 el cierre de proyecto, RAMA 6 el reporte diario de métricas, RAMA 7 el manejo de errores, RAMA 8 la confirmación de pago con MercadoPago y RAMA 9 la reconciliación de facturas. Las figuras del Anexo A que muestran el lienzo conservan esa rotulación.</w:t>
       </w:r>
     </w:p>
     <w:p>

</xml_diff>

<commit_message>
docs(tesis): agregar la corrida completa de escenarios al Anexo A (C07)
Reproduce en Anexo A la salida real de tests/escenarios.mjs del 29-ago-2026,
con su fecha/hora, en vez de remitir solo a docs/evidencia-validacion.md.
Se dejo sin numeracion de Tabla (como el resto de las reproducciones de
Anexo C/D/F) para no romper la secuencia 1-21 ya citada en el cuerpo.
</commit_message>
<xml_diff>
--- a/FormularioLeads/tesis.docx
+++ b/FormularioLeads/tesis.docx
@@ -27123,6 +27123,456 @@
           <w:i w:val="0"/>
           <w:sz w:val="17"/>
         </w:rPr>
+      </w:r>
+    </w:p>
+    <w:p>
+      <w:pPr/>
+      <w:r>
+        <w:t>Corrida completa de tests/escenarios.mjs, ejecutada el 29 de agosto de 2026 a las 03:05 UTC contra el sistema levantado (n8n en http://localhost:5678, Supabase en la URL declarada en .env.local), sin editar. Los escenarios E1, E2 y E3 verifican el desglose del puntaje contra la Tabla 5, no sólo el total; las cuatro entradas inválidas de la Tabla 12 se verifican en una sola corrida (lead-invalido). A partir de E1b, todo lo que depende de que la propuesta o la factura salgan por correo falla por la credencial de Gmail vencida, ya señalada en §4.3.5; el proceso de reconciliación (§4.3.5) existe precisamente porque no depende de ella.</w:t>
+      </w:r>
+    </w:p>
+    <w:p>
+      <w:pPr/>
+      <w:r>
+        <w:t>Salida de la corrida (tests/escenarios.mjs, 29 de agosto de 2026, 03:05 UTC):</w:t>
+      </w:r>
+    </w:p>
+    <w:tbl>
+      <w:tblPr>
+        <w:tblW w:type="auto" w:w="0"/>
+        <w:tblLook w:firstColumn="1" w:firstRow="1" w:lastColumn="0" w:lastRow="0" w:noHBand="0" w:noVBand="1" w:val="04A0"/>
+      </w:tblPr>
+      <w:tblGrid>
+        <w:gridCol w:w="2197"/>
+        <w:gridCol w:w="2197"/>
+        <w:gridCol w:w="2197"/>
+        <w:gridCol w:w="2197"/>
+      </w:tblGrid>
+      <w:tr>
+        <w:tc>
+          <w:tcPr>
+            <w:tcW w:type="dxa" w:w="2197"/>
+          </w:tcPr>
+          <w:p>
+            <w:r>
+              <w:t>Escenario</w:t>
+            </w:r>
+          </w:p>
+        </w:tc>
+        <w:tc>
+          <w:tcPr>
+            <w:tcW w:type="dxa" w:w="2197"/>
+          </w:tcPr>
+          <w:p>
+            <w:r>
+              <w:t>Descripción</w:t>
+            </w:r>
+          </w:p>
+        </w:tc>
+        <w:tc>
+          <w:tcPr>
+            <w:tcW w:type="dxa" w:w="2197"/>
+          </w:tcPr>
+          <w:p>
+            <w:r>
+              <w:t>Resultado</w:t>
+            </w:r>
+          </w:p>
+        </w:tc>
+        <w:tc>
+          <w:tcPr>
+            <w:tcW w:type="dxa" w:w="2197"/>
+          </w:tcPr>
+          <w:p>
+            <w:r>
+              <w:t>Tiempo</w:t>
+            </w:r>
+          </w:p>
+        </w:tc>
+      </w:tr>
+      <w:tr>
+        <w:tc>
+          <w:tcPr>
+            <w:tcW w:type="dxa" w:w="2197"/>
+          </w:tcPr>
+          <w:p>
+            <w:r>
+              <w:t>E1</w:t>
+            </w:r>
+          </w:p>
+        </w:tc>
+        <w:tc>
+          <w:tcPr>
+            <w:tcW w:type="dxa" w:w="2197"/>
+          </w:tcPr>
+          <w:p>
+            <w:r>
+              <w:t>Un lead de presupuesto alto se califica HOT y queda esperando propuesta</w:t>
+            </w:r>
+          </w:p>
+        </w:tc>
+        <w:tc>
+          <w:tcPr>
+            <w:tcW w:type="dxa" w:w="2197"/>
+          </w:tcPr>
+          <w:p>
+            <w:r>
+              <w:t>OK</w:t>
+            </w:r>
+          </w:p>
+        </w:tc>
+        <w:tc>
+          <w:tcPr>
+            <w:tcW w:type="dxa" w:w="2197"/>
+          </w:tcPr>
+          <w:p>
+            <w:r>
+              <w:t>5308 ms</w:t>
+            </w:r>
+          </w:p>
+        </w:tc>
+      </w:tr>
+      <w:tr>
+        <w:tc>
+          <w:tcPr>
+            <w:tcW w:type="dxa" w:w="2197"/>
+          </w:tcPr>
+          <w:p>
+            <w:r>
+              <w:t>E1b</w:t>
+            </w:r>
+          </w:p>
+        </w:tc>
+        <w:tc>
+          <w:tcPr>
+            <w:tcW w:type="dxa" w:w="2197"/>
+          </w:tcPr>
+          <w:p>
+            <w:r>
+              <w:t>El profesional fija precio, plazo y alcance, y recién ahí sale la propuesta</w:t>
+            </w:r>
+          </w:p>
+        </w:tc>
+        <w:tc>
+          <w:tcPr>
+            <w:tcW w:type="dxa" w:w="2197"/>
+          </w:tcPr>
+          <w:p>
+            <w:r>
+              <w:t>ERROR (Gmail vencido)</w:t>
+            </w:r>
+          </w:p>
+        </w:tc>
+        <w:tc>
+          <w:tcPr>
+            <w:tcW w:type="dxa" w:w="2197"/>
+          </w:tcPr>
+          <w:p>
+            <w:r>
+              <w:t>27473 ms</w:t>
+            </w:r>
+          </w:p>
+        </w:tc>
+      </w:tr>
+      <w:tr>
+        <w:tc>
+          <w:tcPr>
+            <w:tcW w:type="dxa" w:w="2197"/>
+          </w:tcPr>
+          <w:p>
+            <w:r>
+              <w:t>E2</w:t>
+            </w:r>
+          </w:p>
+        </w:tc>
+        <w:tc>
+          <w:tcPr>
+            <w:tcW w:type="dxa" w:w="2197"/>
+          </w:tcPr>
+          <w:p>
+            <w:r>
+              <w:t>Un lead de valor medio se califica WARM y también espera propuesta</w:t>
+            </w:r>
+          </w:p>
+        </w:tc>
+        <w:tc>
+          <w:tcPr>
+            <w:tcW w:type="dxa" w:w="2197"/>
+          </w:tcPr>
+          <w:p>
+            <w:r>
+              <w:t>OK</w:t>
+            </w:r>
+          </w:p>
+        </w:tc>
+        <w:tc>
+          <w:tcPr>
+            <w:tcW w:type="dxa" w:w="2197"/>
+          </w:tcPr>
+          <w:p>
+            <w:r>
+              <w:t>4834 ms</w:t>
+            </w:r>
+          </w:p>
+        </w:tc>
+      </w:tr>
+      <w:tr>
+        <w:tc>
+          <w:tcPr>
+            <w:tcW w:type="dxa" w:w="2197"/>
+          </w:tcPr>
+          <w:p>
+            <w:r>
+              <w:t>E3</w:t>
+            </w:r>
+          </w:p>
+        </w:tc>
+        <w:tc>
+          <w:tcPr>
+            <w:tcW w:type="dxa" w:w="2197"/>
+          </w:tcPr>
+          <w:p>
+            <w:r>
+              <w:t>Un lead de presupuesto bajo se califica COLD y NO recibe propuesta</w:t>
+            </w:r>
+          </w:p>
+        </w:tc>
+        <w:tc>
+          <w:tcPr>
+            <w:tcW w:type="dxa" w:w="2197"/>
+          </w:tcPr>
+          <w:p>
+            <w:r>
+              <w:t>FALLA (aviso por Gmail vencido)</w:t>
+            </w:r>
+          </w:p>
+        </w:tc>
+        <w:tc>
+          <w:tcPr>
+            <w:tcW w:type="dxa" w:w="2197"/>
+          </w:tcPr>
+          <w:p>
+            <w:r>
+              <w:t>4616 ms</w:t>
+            </w:r>
+          </w:p>
+        </w:tc>
+      </w:tr>
+      <w:tr>
+        <w:tc>
+          <w:tcPr>
+            <w:tcW w:type="dxa" w:w="2197"/>
+          </w:tcPr>
+          <w:p>
+            <w:r>
+              <w:t>E4</w:t>
+            </w:r>
+          </w:p>
+        </w:tc>
+        <w:tc>
+          <w:tcPr>
+            <w:tcW w:type="dxa" w:w="2197"/>
+          </w:tcPr>
+          <w:p>
+            <w:r>
+              <w:t>Un lead inválido se rechaza sin persistirse y queda registrado</w:t>
+            </w:r>
+          </w:p>
+        </w:tc>
+        <w:tc>
+          <w:tcPr>
+            <w:tcW w:type="dxa" w:w="2197"/>
+          </w:tcPr>
+          <w:p>
+            <w:r>
+              <w:t>OK</w:t>
+            </w:r>
+          </w:p>
+        </w:tc>
+        <w:tc>
+          <w:tcPr>
+            <w:tcW w:type="dxa" w:w="2197"/>
+          </w:tcPr>
+          <w:p>
+            <w:r>
+              <w:t>5529 ms</w:t>
+            </w:r>
+          </w:p>
+        </w:tc>
+      </w:tr>
+      <w:tr>
+        <w:tc>
+          <w:tcPr>
+            <w:tcW w:type="dxa" w:w="2197"/>
+          </w:tcPr>
+          <w:p>
+            <w:r>
+              <w:t>E5/E6</w:t>
+            </w:r>
+          </w:p>
+        </w:tc>
+        <w:tc>
+          <w:tcPr>
+            <w:tcW w:type="dxa" w:w="2197"/>
+          </w:tcPr>
+          <w:p>
+            <w:r>
+              <w:t>Aceptación válida y reutilización del enlace: una sola factura</w:t>
+            </w:r>
+          </w:p>
+        </w:tc>
+        <w:tc>
+          <w:tcPr>
+            <w:tcW w:type="dxa" w:w="2197"/>
+          </w:tcPr>
+          <w:p>
+            <w:r>
+              <w:t>ERROR (depende de E1b)</w:t>
+            </w:r>
+          </w:p>
+        </w:tc>
+        <w:tc>
+          <w:tcPr>
+            <w:tcW w:type="dxa" w:w="2197"/>
+          </w:tcPr>
+          <w:p>
+            <w:r>
+              <w:t>0 ms</w:t>
+            </w:r>
+          </w:p>
+        </w:tc>
+      </w:tr>
+      <w:tr>
+        <w:tc>
+          <w:tcPr>
+            <w:tcW w:type="dxa" w:w="2197"/>
+          </w:tcPr>
+          <w:p>
+            <w:r>
+              <w:t>E8</w:t>
+            </w:r>
+          </w:p>
+        </w:tc>
+        <w:tc>
+          <w:tcPr>
+            <w:tcW w:type="dxa" w:w="2197"/>
+          </w:tcPr>
+          <w:p>
+            <w:r>
+              <w:t>El rechazo de la propuesta deja el lead en PERDIDO</w:t>
+            </w:r>
+          </w:p>
+        </w:tc>
+        <w:tc>
+          <w:tcPr>
+            <w:tcW w:type="dxa" w:w="2197"/>
+          </w:tcPr>
+          <w:p>
+            <w:r>
+              <w:t>ERROR (depende de E1b)</w:t>
+            </w:r>
+          </w:p>
+        </w:tc>
+        <w:tc>
+          <w:tcPr>
+            <w:tcW w:type="dxa" w:w="2197"/>
+          </w:tcPr>
+          <w:p>
+            <w:r>
+              <w:t>28433 ms</w:t>
+            </w:r>
+          </w:p>
+        </w:tc>
+      </w:tr>
+      <w:tr>
+        <w:tc>
+          <w:tcPr>
+            <w:tcW w:type="dxa" w:w="2197"/>
+          </w:tcPr>
+          <w:p>
+            <w:r>
+              <w:t>E9</w:t>
+            </w:r>
+          </w:p>
+        </w:tc>
+        <w:tc>
+          <w:tcPr>
+            <w:tcW w:type="dxa" w:w="2197"/>
+          </w:tcPr>
+          <w:p>
+            <w:r>
+              <w:t>El pedido de cambios vuelve el lead a EN_SEGUIMIENTO y guarda el mensaje</w:t>
+            </w:r>
+          </w:p>
+        </w:tc>
+        <w:tc>
+          <w:tcPr>
+            <w:tcW w:type="dxa" w:w="2197"/>
+          </w:tcPr>
+          <w:p>
+            <w:r>
+              <w:t>ERROR (depende de E1b)</w:t>
+            </w:r>
+          </w:p>
+        </w:tc>
+        <w:tc>
+          <w:tcPr>
+            <w:tcW w:type="dxa" w:w="2197"/>
+          </w:tcPr>
+          <w:p>
+            <w:r>
+              <w:t>28996 ms</w:t>
+            </w:r>
+          </w:p>
+        </w:tc>
+      </w:tr>
+      <w:tr>
+        <w:tc>
+          <w:tcPr>
+            <w:tcW w:type="dxa" w:w="2197"/>
+          </w:tcPr>
+          <w:p>
+            <w:r>
+              <w:t>E10</w:t>
+            </w:r>
+          </w:p>
+        </w:tc>
+        <w:tc>
+          <w:tcPr>
+            <w:tcW w:type="dxa" w:w="2197"/>
+          </w:tcPr>
+          <w:p>
+            <w:r>
+              <w:t>El estado del trabajo se actualiza desde el panel y se sincroniza</w:t>
+            </w:r>
+          </w:p>
+        </w:tc>
+        <w:tc>
+          <w:tcPr>
+            <w:tcW w:type="dxa" w:w="2197"/>
+          </w:tcPr>
+          <w:p>
+            <w:r>
+              <w:t>ERROR (depende de E1b)</w:t>
+            </w:r>
+          </w:p>
+        </w:tc>
+        <w:tc>
+          <w:tcPr>
+            <w:tcW w:type="dxa" w:w="2197"/>
+          </w:tcPr>
+          <w:p>
+            <w:r>
+              <w:t>0 ms</w:t>
+            </w:r>
+          </w:p>
+        </w:tc>
+      </w:tr>
+    </w:tbl>
+    <w:p>
+      <w:pPr/>
+      <w:r>
+        <w:t>Nota. El lead COLD no recibe una propuesta por diseño (Tabla 5); lo que falla en esa fila es el aviso de cortesía por Telegram y Gmail al lead, agrupado bajo la misma causa raíz. El detalle completo, con cada aserción, vive en docs/evidencia-validacion.md, que este mismo comando regenera en cada corrida.</w:t>
       </w:r>
     </w:p>
     <w:p>

</xml_diff>

<commit_message>
docs(tesis): dividir 31 de las oraciones mas largas del cuerpo (C19)
Pasada parcial y proporcional a la severidad baja del hallazgo: se
dividieron las oraciones de mas de 50 palabras en los capitulos 1 a 8
(objetivo, marco teorico y normativo, diseno del flujo de captacion y
propuesta, frontera transaccional, reconciliacion, riesgos de seguridad
cerrados y conclusiones), sin tocar contenido ni cifras. La pregunta de
investigacion (parrafo unico, cita formal) se dejo intacta a proposito.
</commit_message>
<xml_diff>
--- a/FormularioLeads/tesis.docx
+++ b/FormularioLeads/tesis.docx
@@ -1809,7 +1809,7 @@
           <w:b w:val="0"/>
           <w:i w:val="0"/>
         </w:rPr>
-        <w:t>La pregunta se formula en términos de viabilidad técnica y no de magnitud del ahorro. La reducción efectiva de la carga administrativa es el efecto que se espera de la automatización, pero medirla exige una línea de base previa y una medición posterior sobre operación real, que este trabajo no realiza y declara fuera de alcance (§1.7). La delimitación se retoma en §1.5, en el Capítulo 6 y en el Capítulo 7. Corresponde declarar además bajo qué condición la respuesta habría sido negativa, porque las dos mitades de la pregunta no se responden con el mismo rigor. La primera —si la automatización es técnicamente viable— se acredita por construcción: un artefacto que ejecuta el ciclo de extremo a extremo la responde afirmativamente, y sólo un flujo que no pudiera completarse la habría refutado. La segunda —si eso ocurre «sin sacrificar la trazabilidad ni el control del profesional»— sí es refutable de forma sustantiva, y es la que ordena el trabajo: la respuesta habría sido negativa si el sistema hubiera tomado por el profesional una decisión de negocio reservada a él, o si el estado de una oportunidad no hubiera podido reconstruirse a partir de lo registrado. El primero de esos dos criterios fue efectivamente incumplido por un diseño intermedio, en el que el importe de la propuesta provenía del formulario que completaba el propio interesado, y la condición se restituyó devolviendo esa decisión al profesional (§4.3.2 y Capítulo 7).</w:t>
+        <w:t>La pregunta se formula en términos de viabilidad técnica y no de magnitud del ahorro. La reducción efectiva de la carga administrativa es el efecto que se espera de la automatización, pero medirla exige una línea de base previa y una medición posterior sobre operación real, que este trabajo no realiza y declara fuera de alcance (§1.7). La delimitación se retoma en §1.5, en el Capítulo 6 y en el Capítulo 7. Corresponde declarar además bajo qué condición la respuesta habría sido negativa, porque las dos mitades de la pregunta no se responden con el mismo rigor. La primera —si la automatización es técnicamente viable— se acredita por construcción: un artefacto que ejecuta el ciclo de extremo a extremo la responde afirmativamente, y sólo un flujo que no pudiera completarse la habría refutado. La segunda —si eso ocurre «sin sacrificar la trazabilidad ni el control del profesional»— sí es refutable de forma sustantiva. Es la que ordena el trabajo: la respuesta habría sido negativa si el sistema hubiera tomado por el profesional una decisión de negocio reservada a él, o si el estado de una oportunidad no hubiera podido reconstruirse a partir de lo registrado. El primero de esos dos criterios fue efectivamente incumplido por un diseño intermedio, en el que el importe de la propuesta provenía del formulario que completaba el propio interesado, y la condición se restituyó devolviendo esa decisión al profesional (§4.3.2 y Capítulo 7).</w:t>
       </w:r>
     </w:p>
     <w:p>
@@ -1875,7 +1875,7 @@
         <w:rPr>
           <w:i w:val="0"/>
         </w:rPr>
-        <w:t>Este trabajo no formula una hipótesis en sentido convencional: al tratarse de un desarrollo tecnológico de carácter aplicado y no de una investigación empírica, se lo orienta mediante la pregunta de investigación del §1.3 y los objetivos aquí definidos, cuyo cumplimiento se verifica en el Capítulo 5. El §3.1 desarrolla en detalle el fundamento metodológico de esta decisión.</w:t>
+        <w:t>Este trabajo no formula una hipótesis en sentido convencional: al tratarse de un desarrollo tecnológico de carácter aplicado y no de una investigación empírica, se lo orienta mediante la pregunta de investigación del §1.3 y los objetivos aquí definidos. Su cumplimiento se verifica en el Capítulo 5. El §3.1 desarrolla en detalle el fundamento metodológico de esta decisión.</w:t>
       </w:r>
     </w:p>
     <w:p>
@@ -1884,7 +1884,7 @@
         <w:rPr>
           <w:b/>
         </w:rPr>
-        <w:t>Delimitación del objetivo general. Este objetivo excluye deliberadamente el resultado «reducir la carga administrativa manual». La razón no es que la variable quede indefinida —a continuación se le da una definición operacional y se mide uno de sus dos componentes— sino que el componente que decide esa promesa, el tiempo y el esfuerzo que cada acción cuesta, exigiría una línea de base previa y una medición posterior sobre operación real que este trabajo no realiza. Incluir la promesa dejaría al trabajo concluyendo sobre algo que su estrategia de validación no puede acreditar.</w:t>
+        <w:t>Delimitación del objetivo general. Este objetivo excluye deliberadamente el resultado «reducir la carga administrativa manual». La razón no es que la variable quede indefinida —a continuación se le da una definición operacional y se mide uno de sus dos componentes—. Es que el componente que decide esa promesa, el tiempo y el esfuerzo que cada acción cuesta, exigiría una línea de base previa y una medición posterior sobre operación real que este trabajo no realiza. Incluir la promesa dejaría al trabajo concluyendo sobre algo que su estrategia de validación no puede acreditar.</w:t>
       </w:r>
     </w:p>
     <w:p>
@@ -1933,7 +1933,7 @@
     </w:p>
     <w:p>
       <w:r>
-        <w:t>Para alcanzar el objetivo general se definen los siguientes objetivos específicos (OE), redactados en infinitivo y retomados de forma trazable en los capítulos de diseño, en la validación y en las conclusiones (véase la matriz de trazabilidad del Anexo E). El OE3 reúne dos resultados que se verifican por separado —el ciclo comercial hasta la emisión del comprobante y el registro del cobro—, y su grado de cumplimiento se declara de forma independiente para cada uno en el Capítulo 7, porque el segundo depende de una pasarela externa y el primero no:</w:t>
+        <w:t>Para alcanzar el objetivo general se definen los siguientes objetivos específicos (OE), redactados en infinitivo y retomados de forma trazable en los capítulos de diseño, en la validación y en las conclusiones (véase la matriz de trazabilidad del Anexo E). El OE3 reúne dos resultados que se verifican por separado —el ciclo comercial hasta la emisión del comprobante y el registro del cobro—. Su grado de cumplimiento se declara de forma independiente para cada uno en el Capítulo 7, porque el segundo depende de una pasarela externa y el primero no:</w:t>
       </w:r>
     </w:p>
     <w:p>
@@ -2203,11 +2203,9 @@
         <w:rPr>
           <w:b/>
         </w:rPr>
-        <w:t>Tratamiento de datos personales.</w:t>
-      </w:r>
-      <w:r>
-        <w:t xml:space="preserve"> El sistema capta, almacena y transfiere a terceros (Supabase, el servicio de correo, Telegram y Notion) datos de contacto de personas físicas identificables. No se implementan aviso de privacidad, consentimiento informado, política de retención ni inscripción de la base conforme a la Ley 25.326 de Protección de Datos Personales, y varios de esos destinatarios están domiciliados en países que la Disposición 60-E/2016 no considera de protección adecuada, lo que activa además el régimen de transferencia internacional de su art. 12. El §2.9 desarrolla las obligaciones aplicables; la dimensión se retoma en el Capítulo 6 y se difiere al Capítulo 8.</w:t>
-      </w:r>
+        <w:t>Tratamiento de datos personales. El sistema capta, almacena y transfiere a terceros (Supabase, el servicio de correo, Telegram y Notion) datos de contacto de personas físicas identificables. No se implementan aviso de privacidad, consentimiento informado, política de retención ni inscripción de la base conforme a la Ley 25.326 de Protección de Datos Personales. Además, varios de esos destinatarios están domiciliados en países que la Disposición 60-E/2016 no considera de protección adecuada, lo que activa el régimen de transferencia internacional de su art. 12. El §2.9 desarrolla las obligaciones aplicables; la dimensión se retoma en el Capítulo 6 y se difiere al Capítulo 8.</w:t>
+      </w:r>
+      <w:r/>
     </w:p>
     <w:p>
       <w:pPr>
@@ -2557,77 +2555,54 @@
     </w:p>
     <w:p>
       <w:r>
-        <w:t xml:space="preserve">Next.js es un </w:t>
+        <w:t>Next.js es un framework de desarrollo web construido sobre la biblioteca React que habilita un modelo de renderizado híbrido: combina componentes que se ejecutan en el servidor (React Server Components) con componentes de cliente. Además, organiza la aplicación mediante un enrutador basado en el sistema de archivos (App Router) (Vercel, 2024). Este modelo permite ejecutar en el servidor las verificaciones sensibles —como la validación de la sesión antes de renderizar una página protegida— y reservar para el cliente la interactividad, lo que resulta pertinente para una aplicación que combina un formulario público con un tablero de control autenticado.</w:t>
       </w:r>
       <w:proofErr w:type="spellStart"/>
-      <w:r>
-        <w:t>framework</w:t>
-      </w:r>
+      <w:r/>
       <w:proofErr w:type="spellEnd"/>
-      <w:r>
-        <w:t xml:space="preserve"> de desarrollo web construido sobre la biblioteca </w:t>
-      </w:r>
+      <w:r/>
       <w:proofErr w:type="spellStart"/>
-      <w:r>
-        <w:t>React</w:t>
-      </w:r>
+      <w:r/>
       <w:proofErr w:type="spellEnd"/>
-      <w:r>
-        <w:t xml:space="preserve"> que habilita un modelo de renderizado híbrido: combina componentes que se ejecutan en el servidor (</w:t>
-      </w:r>
+      <w:r/>
       <w:proofErr w:type="spellStart"/>
       <w:r>
         <w:rPr>
           <w:i/>
         </w:rPr>
-        <w:t>React</w:t>
       </w:r>
       <w:proofErr w:type="spellEnd"/>
       <w:r>
         <w:rPr>
           <w:i/>
         </w:rPr>
-        <w:t xml:space="preserve"> Server </w:t>
       </w:r>
       <w:proofErr w:type="spellStart"/>
       <w:r>
         <w:rPr>
           <w:i/>
         </w:rPr>
-        <w:t>Components</w:t>
       </w:r>
       <w:proofErr w:type="spellEnd"/>
-      <w:r>
-        <w:t>) con componentes de cliente, y organiza la aplicación mediante un enrutador basado en el sistema de archivos (</w:t>
-      </w:r>
+      <w:r/>
       <w:r>
         <w:rPr>
           <w:i/>
         </w:rPr>
-        <w:t xml:space="preserve">App </w:t>
       </w:r>
       <w:proofErr w:type="spellStart"/>
       <w:r>
         <w:rPr>
           <w:i/>
         </w:rPr>
-        <w:t>Router</w:t>
       </w:r>
       <w:proofErr w:type="spellEnd"/>
-      <w:r>
-        <w:t>) (</w:t>
-      </w:r>
+      <w:r/>
       <w:proofErr w:type="spellStart"/>
-      <w:r>
-        <w:t>Vercel</w:t>
-      </w:r>
+      <w:r/>
       <w:proofErr w:type="spellEnd"/>
-      <w:r>
-        <w:t xml:space="preserve">, 2024). Este modelo permite ejecutar en el servidor las verificaciones sensibles —como la validación de la sesión antes de renderizar una página protegida— y reservar para el cliente la </w:t>
-      </w:r>
-      <w:r>
-        <w:t>interactividad, lo que resulta pertinente para una aplicación que combina un formulario público con un tablero de control autenticado.</w:t>
-      </w:r>
+      <w:r/>
+      <w:r/>
     </w:p>
     <w:p>
       <w:pPr>
@@ -2892,7 +2867,7 @@
         <w:rPr>
           <w:i w:val="0"/>
         </w:rPr>
-        <w:t>Dos antecedentes arbitrados estrechan esa laguna, sin cerrarla del todo. Domański, Wojciechowski, Lewandowicz y Hadaś (2023) revisan y evalúan mediante una metodología arbitrada un conjunto de plataformas low-code/no-code orientadas específicamente a pequeñas y medianas empresas, el mismo segmento —un freelancer es, como señala este trabajo, un caso límite de PyME— en el que se sitúa la comparación de este apartado. Muhammad, Prybutok y Sinha (2025) revisan sistemáticamente la literatura sobre los factores que determinan la efectividad de quien construye con herramientas de bajo código sin ser un desarrollador de oficio —el «desarrollador ciudadano»—, lo que respalda con literatura arbitrada la figura invocada en el §2.8 para justificar la decisión de construir. Ninguno de los dos trata la adopción de plataformas iPaaS en particular, de modo que esa laguna específica —Zapier y Make como categoría— se mantiene.</w:t>
+        <w:t>Dos antecedentes arbitrados estrechan esa laguna, sin cerrarla del todo. Domański, Wojciechowski, Lewandowicz y Hadaś (2023) revisan y evalúan mediante una metodología arbitrada un conjunto de plataformas low-code/no-code orientadas específicamente a pequeñas y medianas empresas, el mismo segmento —un freelancer es, como señala este trabajo, un caso límite de PyME— en el que se sitúa la comparación de este apartado. Muhammad, Prybutok y Sinha (2025) revisan sistemáticamente la literatura sobre los factores que determinan la efectividad de quien construye con herramientas de bajo código sin ser un desarrollador de oficio —el «desarrollador ciudadano»—. Esa revisión respalda con literatura arbitrada la figura invocada en el §2.8 para justificar la decisión de construir. Ninguno de los dos trata la adopción de plataformas iPaaS en particular, de modo que esa laguna específica —Zapier y Make como categoría— se mantiene.</w:t>
       </w:r>
     </w:p>
     <w:p>
@@ -2921,7 +2896,7 @@
         <w:rPr>
           <w:i w:val="0"/>
         </w:rPr>
-        <w:t>Un relevamiento adicional matiza, sin revertirla, esa dependencia de las fuentes de los proveedores. Lamanna (2025) propone un marco de evaluación estructurado y multicriterio para plataformas de bajo código, formulado precisamente para superar la brecha entre comparaciones dirigidas por el marketing de los proveedores y una evaluación rigurosa basada en criterios explícitos; aplicarlo en profundidad a las cuatro herramientas revisadas excede el alcance de este trabajo, pero su existencia confirma que la limitación señalada aquí es un problema metodológico reconocido en la literatura, no una omisión aislada de este documento. Por otra parte, un estudio de caso reciente que compara la ejecución manual y automatizada de un flujo de captación de leads con n8n en un entorno de negocio a pequeña escala —el mismo tipo de operación que describe este trabajo— registra una reducción del tiempo de ejecución de 185,35 a 1,23 segundos y la eliminación de la tasa de error del 5 % observada en la ejecución manual (Amir, 2026, un preprint todavía sin revisión por pares), lo que aporta evidencia empírica independiente —aunque preliminar y no arbitrada— a favor de automatizar precisamente el tipo de tarea que aborda este trabajo. Ninguna de las dos fuentes evalúa de forma independiente a HubSpot, Pipedrive, Zapier o Make en particular, de modo que la comparación de precios y prestaciones de este apartado sigue apoyada en las páginas de los proveedores; lo que cambia es que la decisión de automatizar en sí —y el criterio para evaluarla con rigor— ya no depende solo de la argumentación propia de los autores.</w:t>
+        <w:t>Un relevamiento adicional matiza, sin revertirla, esa dependencia de las fuentes de los proveedores. Lamanna (2025) propone un marco de evaluación estructurado y multicriterio para plataformas de bajo código, formulado precisamente para superar la brecha entre comparaciones dirigidas por el marketing de los proveedores y una evaluación rigurosa basada en criterios explícitos; aplicarlo en profundidad a las cuatro herramientas revisadas excede el alcance de este trabajo, pero su existencia confirma que la limitación señalada aquí es un problema metodológico reconocido en la literatura, no una omisión aislada de este documento. Por otra parte, un estudio de caso reciente compara la ejecución manual y automatizada de un flujo de captación de leads con n8n en un entorno de negocio a pequeña escala —el mismo tipo de operación que describe este trabajo—. Registra una reducción del tiempo de ejecución de 185,35 a 1,23 segundos y la eliminación de la tasa de error del 5 % observada en la ejecución manual (Amir, 2026, un preprint todavía sin revisión por pares). Aporta así evidencia empírica independiente —aunque preliminar y no arbitrada— a favor de automatizar precisamente el tipo de tarea que aborda este trabajo. Ninguna de las dos fuentes evalúa de forma independiente a HubSpot, Pipedrive, Zapier o Make en particular, de modo que la comparación de precios y prestaciones de este apartado sigue apoyada en las páginas de los proveedores; lo que cambia es que la decisión de automatizar en sí —y el criterio para evaluarla con rigor— ya no depende solo de la argumentación propia de los autores.</w:t>
       </w:r>
     </w:p>
     <w:p>
@@ -3110,7 +3085,7 @@
           <w:b w:val="0"/>
           <w:i w:val="0"/>
         </w:rPr>
-        <w:t>Para el alcance definido —un freelancer individual, con un ciclo de vida comercial a medida, control directo sobre las reglas de negocio y un objetivo formativo explícito— construir la solución está justificado. El aporte original no reside en un algoritmo aislado, sino en el pipeline integrado y extremo a extremo que encadena las etapas descritas, verificado componente a componente contra el código fuente (§4.1). De las cuatro razones enunciadas, dos se sostienen sin reservas —personalización de las reglas y objetivo formativo— y dos lo hacen de forma parcial y así se declaran: el argumento de costo se estima en el Capítulo 6 y el de propiedad del dato se limita a la capa de orquestación.</w:t>
+        <w:t>Para el alcance definido —un freelancer individual, con un ciclo de vida comercial a medida, control directo sobre las reglas de negocio y un objetivo formativo explícito— construir la solución está justificado. El aporte original no reside en un algoritmo aislado, sino en el pipeline integrado y extremo a extremo que encadena las etapas descritas, verificado componente a componente contra el código fuente (§4.1). De las cuatro razones enunciadas, dos se sostienen sin reservas —personalización de las reglas y objetivo formativo—. Las otras dos lo hacen de forma parcial y así se declaran: el argumento de costo se estima en el Capítulo 6 y el de propiedad del dato se limita a la capa de orquestación.</w:t>
       </w:r>
     </w:p>
     <w:p>
@@ -3139,11 +3114,9 @@
         <w:rPr>
           <w:b/>
         </w:rPr>
-        <w:t>Protección de datos personales (Ley 25.326).</w:t>
-      </w:r>
-      <w:r>
-        <w:t xml:space="preserve"> La Ley 25.326 define como dato personal toda «información de cualquier tipo referida a personas físicas o de existencia ideal determinadas o determinables» (art. 2), categoría en la que caen el nombre, el correo, el teléfono y el presupuesto declarado que capta el formulario del §4.2.1. Ninguno de ellos es un dato sensible en el sentido del art. 7, lo que excluye el régimen agravado de esa categoría, pero sí quedan alcanzados por el régimen general. Cinco obligaciones son directamente pertinentes. El art. 4 exige que los datos sean pertinentes y no excesivos respecto de la finalidad, que no se usen para fines incompatibles con los que motivaron su obtención y que se destruyan cuando dejen de ser necesarios. El art. 5 exige consentimiento libre, expreso e informado, por escrito o medio equivalente; su inciso 2.d exceptúa los datos que derivan de una relación contractual o profesional y resultan necesarios para su desarrollo, excepción que podría cubrir parte del tratamiento posterior a la aceptación de una propuesta, pero no la captación inicial, que ocurre antes de que exista relación alguna. El art. 6 obliga a informar, al recolectar, la finalidad del tratamiento, quiénes son sus destinatarios, la identidad del responsable, el carácter obligatorio o facultativo de cada respuesta y la posibilidad de ejercer los derechos de acceso, rectificación y supresión. El art. 9 exige medidas técnicas y organizativas de seguridad y confidencialidad. Y el art. 21 obliga a inscribir la base ante el organismo de control, hoy la Agencia de Acceso a la Información Pública.</w:t>
-      </w:r>
+        <w:t>Protección de datos personales (Ley 25.326). La Ley 25.326 define como dato personal toda «información de cualquier tipo referida a personas físicas o de existencia ideal determinadas o determinables» (art. 2), categoría en la que caen el nombre, el correo, el teléfono y el presupuesto declarado que capta el formulario del §4.2.1. Ninguno de ellos es un dato sensible en el sentido del art. 7, lo que excluye el régimen agravado de esa categoría, pero sí quedan alcanzados por el régimen general. Cinco obligaciones son directamente pertinentes. El art. 4 exige que los datos sean pertinentes y no excesivos respecto de la finalidad, que no se usen para fines incompatibles con los que motivaron su obtención y que se destruyan cuando dejen de ser necesarios. El art. 5 exige consentimiento libre, expreso e informado, por escrito o medio equivalente; su inciso 2.d exceptúa los datos que derivan de una relación contractual o profesional y resultan necesarios para su desarrollo. Esa excepción podría cubrir parte del tratamiento posterior a la aceptación de una propuesta, pero no la captación inicial, que ocurre antes de que exista relación alguna. El art. 6 obliga a informar, al recolectar, la finalidad del tratamiento, quiénes son sus destinatarios, la identidad del responsable, el carácter obligatorio o facultativo de cada respuesta y la posibilidad de ejercer los derechos de acceso, rectificación y supresión. El art. 9 exige medidas técnicas y organizativas de seguridad y confidencialidad. Y el art. 21 obliga a inscribir la base ante el organismo de control, hoy la Agencia de Acceso a la Información Pública.</w:t>
+      </w:r>
+      <w:r/>
     </w:p>
     <w:p>
       <w:pPr/>
@@ -3153,11 +3126,9 @@
         <w:rPr>
           <w:b/>
         </w:rPr>
-        <w:t>Cesión y transferencia internacional.</w:t>
-      </w:r>
-      <w:r>
-        <w:t xml:space="preserve"> Es la dimensión que este trabajo tiene más comprometida, y la que conviene enunciar con precisión. El art. 11 sujeta la cesión de datos a terceros al consentimiento previo del titular, informándole la finalidad de la cesión e identificando al cesionario. El art. 12, más exigente, prohíbe la transferencia a países que no proporcionen «niveles de protección adecuados». La Disposición 60-E/2016 de la entonces Dirección Nacional de Protección de Datos Personales enumera cuáles se consideran adecuados —los Estados miembros de la Unión Europea y del Espacio Económico Europeo, Suiza, Guernsey, Jersey, Isla de Man, Islas Feroe, Canadá sólo respecto de su sector privado, Andorra, Nueva Zelanda, Uruguay e Israel sólo respecto de datos de tratamiento automatizado— y aprueba cláusulas contractuales tipo para transferir hacia los que no lo son. Los Estados Unidos no integran esa lista, y allí tienen su domicilio varios de los servicios a los que la arquitectura de este trabajo transfiere datos de contacto: Supabase, Notion, Telegram y el servicio de correo. En consecuencia, la arquitectura híbrida que el §2.8 justifica por razones de costo y de control tiene, además, una consecuencia regulatoria que no puede resolverse eligiendo mejor el proveedor: para operar con clientes reales haría falta consentimiento expreso del titular para la transferencia, o bien las cláusulas contractuales tipo con cada encargado.</w:t>
-      </w:r>
+        <w:t>Cesión y transferencia internacional. Es la dimensión que este trabajo tiene más comprometida, y la que conviene enunciar con precisión. El art. 11 sujeta la cesión de datos a terceros al consentimiento previo del titular, informándole la finalidad de la cesión e identificando al cesionario. El art. 12, más exigente, prohíbe la transferencia a países que no proporcionen «niveles de protección adecuados». La Disposición 60-E/2016 de la entonces Dirección Nacional de Protección de Datos Personales enumera cuáles se consideran adecuados —los Estados miembros de la Unión Europea y del Espacio Económico Europeo, Suiza, Guernsey, Jersey, Isla de Man, Islas Feroe, Canadá sólo respecto de su sector privado, Andorra, Nueva Zelanda, Uruguay e Israel sólo respecto de datos de tratamiento automatizado—. Además, aprueba cláusulas contractuales tipo para transferir hacia los que no lo son. Los Estados Unidos no integran esa lista, y allí tienen su domicilio varios de los servicios a los que la arquitectura de este trabajo transfiere datos de contacto: Supabase, Notion, Telegram y el servicio de correo. En consecuencia, la arquitectura híbrida que el §2.8 justifica por razones de costo y de control tiene, además, una consecuencia regulatoria que no puede resolverse eligiendo mejor el proveedor. Para operar con clientes reales haría falta consentimiento expreso del titular para la transferencia, o bien las cláusulas contractuales tipo con cada encargado.</w:t>
+      </w:r>
+      <w:r/>
     </w:p>
     <w:p>
       <w:pPr/>
@@ -3167,7 +3138,7 @@
         <w:rPr>
           <w:b/>
         </w:rPr>
-        <w:t>Comprobantes fiscales. La emisión de comprobantes está regida por el régimen de facturación electrónica que administra la Agencia de Recaudación y Control Aduanero (ARCA, continuadora de la AFIP desde 2024; ARCA, 2026). Un comprobante tiene validez fiscal sólo si el organismo le asigna un Código de Autorización Electrónico (CAE), que se solicita por servicio web al emitir, y si consigna los datos que el régimen exige: CUIT del emisor, punto de venta habilitado, tipo de comprobante según la condición de emisor y receptor frente al IVA, y el propio CAE con su fecha de vencimiento. El documento que genera este sistema (§4.3.2) no solicita CAE, no declara CUIT ni punto de venta, y numera con un identificador aleatorio dentro del año en lugar de la secuencia correlativa que el régimen supone (Tabla 7). No es, por lo tanto, una factura en sentido fiscal, sino un comprobante interno de la operación; el trabajo lo declara así en §1.7 y evita presentarlo de otro modo.</w:t>
+        <w:t>Comprobantes fiscales. La emisión de comprobantes está regida por el régimen de facturación electrónica que administra la Agencia de Recaudación y Control Aduanero (ARCA, continuadora de la AFIP desde 2024; ARCA, 2026). Un comprobante tiene validez fiscal sólo si el organismo le asigna un Código de Autorización Electrónico (CAE), que se solicita por servicio web al emitir. Además debe consignar los datos que el régimen exige: CUIT del emisor, punto de venta habilitado, tipo de comprobante según la condición de emisor y receptor frente al IVA, y el propio CAE con su fecha de vencimiento. El documento que genera este sistema (§4.3.2) no solicita CAE, no declara CUIT ni punto de venta, y numera con un identificador aleatorio dentro del año en lugar de la secuencia correlativa que el régimen supone (Tabla 7). No es, por lo tanto, una factura en sentido fiscal, sino un comprobante interno de la operación; el trabajo lo declara así en §1.7 y evita presentarlo de otro modo.</w:t>
       </w:r>
     </w:p>
     <w:p>
@@ -3225,7 +3196,7 @@
           <w:b w:val="0"/>
           <w:i w:val="0"/>
         </w:rPr>
-        <w:t>Este trabajo final se inscribe en la categoría de desarrollo tecnológico de carácter aplicado: su resultado principal es un artefacto de software —una plataforma funcional— y no la contrastación de una hipótesis empírica. Por esa razón no se formula una hipótesis en sentido estadístico: el estudio se orienta por la pregunta de investigación y por los objetivos, y su rigor se juzga por la justificación de las decisiones de diseño, la calidad de la solución y la validación del producto (Pressman y Maxim, 2020). El paradigma es pragmático-ingenieril y el enfoque, cualitativo-descriptivo con registro de indicadores puntuales de ejecución.</w:t>
+        <w:t>Este trabajo final se inscribe en la categoría de desarrollo tecnológico de carácter aplicado: su resultado principal es un artefacto de software —una plataforma funcional— y no la contrastación de una hipótesis empírica. Por esa razón no se formula una hipótesis en sentido estadístico: el estudio se orienta por la pregunta de investigación y por los objetivos. Su rigor se juzga por la justificación de las decisiones de diseño, la calidad de la solución y la validación del producto (Pressman y Maxim, 2020). El paradigma es pragmático-ingenieril y el enfoque, cualitativo-descriptivo con registro de indicadores puntuales de ejecución.</w:t>
       </w:r>
     </w:p>
     <w:p>
@@ -3837,7 +3808,7 @@
     <w:p>
       <w:r>
         <w:rPr/>
-        <w:t>La Tabla 2 presenta los requisitos no funcionales (RNF), organizados según las características de calidad de la norma ISO/IEC 25010:2023 (ISO/IEC, 2023), segunda edición del modelo de calidad del producto de software vigente, que reemplaza a la edición 2011. Dos características cambiaron de nombre respecto de esa edición previa: «Usabilidad» pasó a denominarse «Capacidad de interacción», y «Portabilidad», «Flexibilidad». Cada requisito se enuncia con un umbral, una unidad y un método de verificación, de modo que pueda declararse cumplido o incumplido sin apelar a un juicio cualitativo; el resultado de su verificación se reporta en el Capítulo 5.</w:t>
+        <w:t>La Tabla 2 presenta los requisitos no funcionales (RNF), organizados según las características de calidad de la norma ISO/IEC 25010:2023 (ISO/IEC, 2023). Esta es la segunda edición del modelo de calidad del producto de software vigente y reemplaza a la edición de 2011. Dos características cambiaron de nombre respecto de esa edición previa: «Usabilidad» pasó a denominarse «Capacidad de interacción», y «Portabilidad», «Flexibilidad». Cada requisito se enuncia con un umbral, una unidad y un método de verificación, de modo que pueda declararse cumplido o incumplido sin apelar a un juicio cualitativo; el resultado de su verificación se reporta en el Capítulo 5.</w:t>
       </w:r>
     </w:p>
     <w:p>
@@ -7318,169 +7289,129 @@
     </w:p>
     <w:p>
       <w:r>
-        <w:t xml:space="preserve">El </w:t>
+        <w:t>El frontend se organiza con el App Router de Next.js. Las rutas principales son el formulario público (/), las pantallas de autenticación (/login, /register), el tablero protegido (/dashboard) y la página de aceptación (/aceptar/[leadId]). A ellas se suman los manejadores de confirmación y cierre de sesión (/auth/confirm, /auth/signout), el tablero de tickets (/dashboard/tickets, correspondiente al módulo fuera de alcance que declara el Anexo B) y las tres páginas de retorno del checkout de MercadoPago (/pago-exitoso, /pago-pendiente y /pago-fallido), que son las back_urls declaradas en la preferencia de pago (§4.3.3).</w:t>
       </w:r>
       <w:proofErr w:type="spellStart"/>
-      <w:r>
-        <w:t>frontend</w:t>
-      </w:r>
+      <w:r/>
       <w:proofErr w:type="spellEnd"/>
-      <w:r>
-        <w:t xml:space="preserve"> se organiza con el App </w:t>
-      </w:r>
+      <w:r/>
       <w:proofErr w:type="spellStart"/>
-      <w:r>
-        <w:t>Router</w:t>
-      </w:r>
+      <w:r/>
       <w:proofErr w:type="spellEnd"/>
-      <w:r>
-        <w:t xml:space="preserve"> de Next.js. Las rutas principales son el formulario público (</w:t>
-      </w:r>
+      <w:r/>
       <w:r>
         <w:rPr>
           <w:rFonts w:ascii="Consolas" w:hAnsi="Consolas" w:cs="Consolas"/>
         </w:rPr>
-        <w:t>/</w:t>
-      </w:r>
-      <w:r>
-        <w:t>), las pantallas de autenticación (</w:t>
-      </w:r>
+      </w:r>
+      <w:r/>
       <w:r>
         <w:rPr>
           <w:rFonts w:ascii="Consolas" w:hAnsi="Consolas" w:cs="Consolas"/>
         </w:rPr>
-        <w:t>/</w:t>
       </w:r>
       <w:proofErr w:type="spellStart"/>
       <w:r>
         <w:rPr>
           <w:rFonts w:ascii="Consolas" w:hAnsi="Consolas" w:cs="Consolas"/>
         </w:rPr>
-        <w:t>login</w:t>
       </w:r>
       <w:proofErr w:type="spellEnd"/>
-      <w:r>
-        <w:t xml:space="preserve">, </w:t>
-      </w:r>
+      <w:r/>
       <w:r>
         <w:rPr>
           <w:rFonts w:ascii="Consolas" w:hAnsi="Consolas" w:cs="Consolas"/>
         </w:rPr>
-        <w:t>/</w:t>
       </w:r>
       <w:proofErr w:type="spellStart"/>
       <w:r>
         <w:rPr>
           <w:rFonts w:ascii="Consolas" w:hAnsi="Consolas" w:cs="Consolas"/>
         </w:rPr>
-        <w:t>register</w:t>
       </w:r>
       <w:proofErr w:type="spellEnd"/>
-      <w:r>
-        <w:t>), el tablero protegido (</w:t>
-      </w:r>
+      <w:r/>
       <w:r>
         <w:rPr>
           <w:rFonts w:ascii="Consolas" w:hAnsi="Consolas" w:cs="Consolas"/>
         </w:rPr>
-        <w:t>/</w:t>
       </w:r>
       <w:proofErr w:type="spellStart"/>
       <w:r>
         <w:rPr>
           <w:rFonts w:ascii="Consolas" w:hAnsi="Consolas" w:cs="Consolas"/>
         </w:rPr>
-        <w:t>dashboard</w:t>
       </w:r>
       <w:proofErr w:type="spellEnd"/>
-      <w:r>
-        <w:t>), la página de aceptación (</w:t>
-      </w:r>
+      <w:r/>
       <w:r>
         <w:rPr>
           <w:rFonts w:ascii="Consolas" w:hAnsi="Consolas" w:cs="Consolas"/>
         </w:rPr>
-        <w:t>/aceptar/[</w:t>
       </w:r>
       <w:proofErr w:type="spellStart"/>
       <w:r>
         <w:rPr>
           <w:rFonts w:ascii="Consolas" w:hAnsi="Consolas" w:cs="Consolas"/>
         </w:rPr>
-        <w:t>leadId</w:t>
       </w:r>
       <w:proofErr w:type="spellEnd"/>
       <w:r>
         <w:rPr>
           <w:rFonts w:ascii="Consolas" w:hAnsi="Consolas" w:cs="Consolas"/>
         </w:rPr>
-        <w:t>]</w:t>
-      </w:r>
-      <w:r>
-        <w:t>), los manejadores de confirmación y cierre de sesión (</w:t>
-      </w:r>
+      </w:r>
+      <w:r/>
       <w:r>
         <w:rPr>
           <w:rFonts w:ascii="Consolas" w:hAnsi="Consolas" w:cs="Consolas"/>
         </w:rPr>
-        <w:t>/</w:t>
       </w:r>
       <w:proofErr w:type="spellStart"/>
       <w:r>
         <w:rPr>
           <w:rFonts w:ascii="Consolas" w:hAnsi="Consolas" w:cs="Consolas"/>
         </w:rPr>
-        <w:t>auth</w:t>
       </w:r>
       <w:proofErr w:type="spellEnd"/>
       <w:r>
         <w:rPr>
           <w:rFonts w:ascii="Consolas" w:hAnsi="Consolas" w:cs="Consolas"/>
         </w:rPr>
-        <w:t>/</w:t>
       </w:r>
       <w:proofErr w:type="spellStart"/>
       <w:r>
         <w:rPr>
           <w:rFonts w:ascii="Consolas" w:hAnsi="Consolas" w:cs="Consolas"/>
         </w:rPr>
-        <w:t>confirm</w:t>
       </w:r>
       <w:proofErr w:type="spellEnd"/>
-      <w:r>
-        <w:t xml:space="preserve">, </w:t>
-      </w:r>
+      <w:r/>
       <w:r>
         <w:rPr>
           <w:rFonts w:ascii="Consolas" w:hAnsi="Consolas" w:cs="Consolas"/>
         </w:rPr>
-        <w:t>/</w:t>
       </w:r>
       <w:proofErr w:type="spellStart"/>
       <w:r>
         <w:rPr>
           <w:rFonts w:ascii="Consolas" w:hAnsi="Consolas" w:cs="Consolas"/>
         </w:rPr>
-        <w:t>auth</w:t>
       </w:r>
       <w:proofErr w:type="spellEnd"/>
       <w:r>
         <w:rPr>
           <w:rFonts w:ascii="Consolas" w:hAnsi="Consolas" w:cs="Consolas"/>
         </w:rPr>
-        <w:t>/</w:t>
       </w:r>
       <w:proofErr w:type="spellStart"/>
       <w:r>
         <w:rPr>
           <w:rFonts w:ascii="Consolas" w:hAnsi="Consolas" w:cs="Consolas"/>
         </w:rPr>
-        <w:t>signout</w:t>
       </w:r>
       <w:proofErr w:type="spellEnd"/>
-      <w:r>
-        <w:t>), el tablero de tickets (/dashboard/tickets, correspondiente al módulo fuera de alcance que declara el Anexo B) y las tres páginas de retorno del checkout de MercadoPago (/pago-exitoso, /pago-pendiente y /pago-fallido), que son las back_urls declaradas en la preferencia de pago (§4.3.3).</w:t>
-      </w:r>
+      <w:r/>
     </w:p>
     <w:p>
       <w:pPr>
@@ -7498,26 +7429,20 @@
       <w:proofErr w:type="spellStart"/>
       <w:proofErr w:type="spellEnd"/>
       <w:r>
-        <w:t xml:space="preserve">El componente </w:t>
-      </w:r>
-      <w:r>
-        <w:rPr>
-          <w:rFonts w:ascii="Consolas" w:hAnsi="Consolas"/>
-        </w:rPr>
-        <w:t>lead-form.tsx</w:t>
-      </w:r>
-      <w:r>
-        <w:t xml:space="preserve"> presenta el formulario de captación con los campos nombre, correo, teléfono (opcional), tipo de servicio, urgencia, presupuesto —seleccionado mediante un control deslizante entre 100 y 20.000 dólares— y descripción. El desplegable de servicio ofrece seis opciones: «Desarrollo Web», «Diseño UX/UI», «Marketing Digital», «SEO / Posicionamiento», «Consultoría» y «Otro». La validación se realiza en el cliente y, al enviar, el componente emite una petición HTTP POST al webhook de captación de n8n, cuya dirección base se configura mediante la variable de entorno </w:t>
-      </w:r>
-      <w:r>
-        <w:rPr>
-          <w:rFonts w:ascii="Consolas" w:hAnsi="Consolas"/>
-        </w:rPr>
-        <w:t>NEXT_PUBLIC_N8N_BASE</w:t>
-      </w:r>
-      <w:r>
-        <w:t>. Ante una respuesta satisfactoria se muestra una confirmación; ante un error, un mensaje de alerta. Con esto se satisface el OE1 (Figura 5, véase Anexo A). En §4.3.1 se analizan tres consecuencias de este diseño: el desajuste entre el rango del control deslizante y los tramos de puntaje; el hecho de que cuatro de los nueve valores ponderados del scoring no puedan originarse en este formulario; y, finalmente, el sesgo con que la opción «Otro» penalizaba a los leads que el sistema no supo clasificar. La Figura 17 documenta el comportamiento de esa validación ante una entrada inválida (véase Anexo A).</w:t>
-      </w:r>
+        <w:t>El componente lead-form.tsx presenta el formulario de captación con los campos nombre, correo, teléfono (opcional), tipo de servicio, urgencia, presupuesto —seleccionado mediante un control deslizante entre 100 y 20.000 dólares— y descripción. El desplegable de servicio ofrece seis opciones: «Desarrollo Web», «Diseño UX/UI», «Marketing Digital», «SEO / Posicionamiento», «Consultoría» y «Otro». La validación se realiza en el cliente y, al enviar, el componente emite una petición HTTP POST al webhook de captación de n8n, cuya dirección base se configura mediante la variable de entorno NEXT_PUBLIC_N8N_BASE. Ante una respuesta satisfactoria se muestra una confirmación; ante un error, un mensaje de alerta. Con esto se satisface el OE1 (Figura 5, véase Anexo A). En §4.3.1 se analizan tres consecuencias de este diseño. La primera es el desajuste entre el rango del control deslizante y los tramos de puntaje. La segunda, que cuatro de los nueve valores ponderados del scoring no pueden originarse en este formulario. Y la tercera, el sesgo con que la opción «Otro» penalizaba a los leads que el sistema no supo clasificar. La Figura 17 documenta el comportamiento de esa validación ante una entrada inválida (véase Anexo A).</w:t>
+      </w:r>
+      <w:r>
+        <w:rPr>
+          <w:rFonts w:ascii="Consolas" w:hAnsi="Consolas"/>
+        </w:rPr>
+      </w:r>
+      <w:r/>
+      <w:r>
+        <w:rPr>
+          <w:rFonts w:ascii="Consolas" w:hAnsi="Consolas"/>
+        </w:rPr>
+      </w:r>
+      <w:r/>
     </w:p>
     <w:p>
       <w:pPr>
@@ -7728,7 +7653,7 @@
           <w:b w:val="0"/>
           <w:i w:val="0"/>
         </w:rPr>
-        <w:t>La protección de rutas se resuelve en dos niveles, en un esquema de defensa en profundidad. El primero es el archivo proxy.ts —la convención vigente en Next.js 16, que reemplaza al histórico middleware.ts—, apoyado en el ayudante updateSession del módulo lib/supabase/middleware.ts. En cada petición comprueba si la ruta pertenece al conjunto de rutas protegidas (PROTECTED_ROUTES, que incluye /dashboard) y, mediante getUser —que consulta la sesión vigente contra Supabase—, valida la sesión; si no hay usuario, redirige a /login conservando el destino original en el parámetro redirectTo.</w:t>
+        <w:t>La protección de rutas se resuelve en dos niveles, en un esquema de defensa en profundidad. El primero es el archivo proxy.ts —la convención vigente en Next.js 16, que reemplaza al histórico middleware.ts—, apoyado en el ayudante updateSession del módulo lib/supabase/middleware.ts. En cada petición comprueba si la ruta pertenece al conjunto de rutas protegidas (PROTECTED_ROUTES, que incluye /dashboard) y, mediante getUser —que consulta la sesión vigente contra Supabase—, valida la sesión. Si no hay usuario, redirige a /login conservando el destino original en el parámetro redirectTo.</w:t>
       </w:r>
       <w:r>
         <w:rPr>
@@ -7937,7 +7862,7 @@
           <w:b w:val="0"/>
           <w:i w:val="0"/>
         </w:rPr>
-        <w:t>La conexión con Supabase se estructura en tres clientes especializados. Se trata de un cliente de navegador (</w:t>
+        <w:t>La conexión con Supabase se estructura en tres clientes especializados. Se trata de un cliente de navegador (client.ts), un cliente de servidor que gestiona la sesión mediante cookies (server.ts) y un cliente para la comprobación de sesión en la capa de proxy (middleware.ts). Este último se ejecuta en el entorno de Node.js. Todos comparten un criterio defensivo: si faltan las variables de entorno, devuelven un valor nulo en lugar de interrumpir la construcción de la aplicación, lo que permite desplegar sin configurar y evita caídas del despliegue (RNF3).</w:t>
       </w:r>
       <w:r>
         <w:rPr>
@@ -7945,14 +7870,12 @@
           <w:b w:val="0"/>
           <w:i w:val="0"/>
         </w:rPr>
-        <w:t>client.ts</w:t>
-      </w:r>
-      <w:r>
-        <w:rPr>
-          <w:b w:val="0"/>
-          <w:i w:val="0"/>
-        </w:rPr>
-        <w:t>), un cliente de servidor que gestiona la sesión mediante cookies (</w:t>
+      </w:r>
+      <w:r>
+        <w:rPr>
+          <w:b w:val="0"/>
+          <w:i w:val="0"/>
+        </w:rPr>
       </w:r>
       <w:r>
         <w:rPr>
@@ -7960,14 +7883,12 @@
           <w:b w:val="0"/>
           <w:i w:val="0"/>
         </w:rPr>
-        <w:t>server.ts</w:t>
-      </w:r>
-      <w:r>
-        <w:rPr>
-          <w:b w:val="0"/>
-          <w:i w:val="0"/>
-        </w:rPr>
-        <w:t>) y un cliente para la comprobación de sesión en la capa de proxy (</w:t>
+      </w:r>
+      <w:r>
+        <w:rPr>
+          <w:b w:val="0"/>
+          <w:i w:val="0"/>
+        </w:rPr>
       </w:r>
       <w:r>
         <w:rPr>
@@ -7975,14 +7896,12 @@
           <w:b w:val="0"/>
           <w:i w:val="0"/>
         </w:rPr>
-        <w:t>middleware.ts</w:t>
-      </w:r>
-      <w:r>
-        <w:rPr>
-          <w:b w:val="0"/>
-          <w:i w:val="0"/>
-        </w:rPr>
-        <w:t>), que se ejecuta en el entorno de Node.js. Todos comparten un criterio defensivo: si faltan las variables de entorno, devuelven un valor nulo en lugar de interrumpir la construcción de la aplicación, lo que permite desplegar sin configurar y evita caídas del despliegue (RNF3).</w:t>
+      </w:r>
+      <w:r>
+        <w:rPr>
+          <w:b w:val="0"/>
+          <w:i w:val="0"/>
+        </w:rPr>
       </w:r>
     </w:p>
     <w:p>
@@ -8213,7 +8132,7 @@
           <w:b w:val="0"/>
           <w:i w:val="0"/>
         </w:rPr>
-        <w:t xml:space="preserve">El proceso se dispara con el webhook </w:t>
+        <w:t>El proceso se dispara con el webhook POST /lead/nuevo. El primer nodo, Normalizar Lead, ejecuta código JavaScript que recorta y estandariza los campos: convierte el correo a minúsculas e interpreta el presupuesto como entero. Restringe además la urgencia al conjunto {alta, media, baja} —con media cuando el valor recibido no pertenece a ese conjunto— y traduce el servicio a una lista blanca de nueve valores mediante un mapeo explícito. Aplica tres validaciones mínimas (correo con arroba, nombre de al menos dos caracteres y presupuesto mayor que cero) y, si alguna falla, interrumpe el flujo con un error; en caso contrario, genera un identificador único con el formato LD-&lt;timestamp&gt;-&lt;aleatorio&gt; y trunca la descripción a 2000 caracteres. El lead normalizado se persiste con el nodo Insert Lead en la tabla leads.</w:t>
       </w:r>
       <w:r>
         <w:rPr>
@@ -8221,28 +8140,24 @@
           <w:b w:val="0"/>
           <w:i w:val="0"/>
         </w:rPr>
-        <w:t>POST /lead/nuevo</w:t>
-      </w:r>
-      <w:r>
-        <w:rPr>
-          <w:b w:val="0"/>
-          <w:i w:val="0"/>
-        </w:rPr>
-        <w:t xml:space="preserve">. El primer nodo, </w:t>
+      </w:r>
+      <w:r>
+        <w:rPr>
+          <w:b w:val="0"/>
+          <w:i w:val="0"/>
+        </w:rPr>
       </w:r>
       <w:r>
         <w:rPr>
           <w:b w:val="0"/>
           <w:i/>
         </w:rPr>
-        <w:t>Normalizar Lead</w:t>
-      </w:r>
-      <w:r>
-        <w:rPr>
-          <w:b w:val="0"/>
-          <w:i w:val="0"/>
-        </w:rPr>
-        <w:t xml:space="preserve">, ejecuta código JavaScript que recorta y estandariza los campos: convierte el correo a minúsculas, interpreta el presupuesto como entero, restringe la urgencia al conjunto {alta, media, baja} —con </w:t>
+      </w:r>
+      <w:r>
+        <w:rPr>
+          <w:b w:val="0"/>
+          <w:i w:val="0"/>
+        </w:rPr>
       </w:r>
       <w:r>
         <w:rPr>
@@ -8250,14 +8165,12 @@
           <w:b w:val="0"/>
           <w:i w:val="0"/>
         </w:rPr>
-        <w:t>media</w:t>
-      </w:r>
-      <w:r>
-        <w:rPr>
-          <w:b w:val="0"/>
-          <w:i w:val="0"/>
-        </w:rPr>
-        <w:t xml:space="preserve"> cuando el valor recibido no pertenece a ese conjunto— y traduce el servicio a una lista blanca de nueve valores mediante un mapeo explícito. Aplica tres validaciones mínimas (correo con arroba, nombre de al menos dos caracteres y presupuesto mayor que cero) y, si alguna falla, interrumpe el flujo con un error; en caso contrario, genera un identificador único con el formato </w:t>
+      </w:r>
+      <w:r>
+        <w:rPr>
+          <w:b w:val="0"/>
+          <w:i w:val="0"/>
+        </w:rPr>
       </w:r>
       <w:r>
         <w:rPr>
@@ -8265,28 +8178,24 @@
           <w:b w:val="0"/>
           <w:i w:val="0"/>
         </w:rPr>
-        <w:t>LD-&lt;timestamp&gt;-&lt;aleatorio&gt;</w:t>
-      </w:r>
-      <w:r>
-        <w:rPr>
-          <w:b w:val="0"/>
-          <w:i w:val="0"/>
-        </w:rPr>
-        <w:t xml:space="preserve"> y trunca la descripción a 2000 caracteres. El lead normalizado se persiste con el nodo </w:t>
+      </w:r>
+      <w:r>
+        <w:rPr>
+          <w:b w:val="0"/>
+          <w:i w:val="0"/>
+        </w:rPr>
       </w:r>
       <w:r>
         <w:rPr>
           <w:b w:val="0"/>
           <w:i/>
         </w:rPr>
-        <w:t>Insert Lead</w:t>
-      </w:r>
-      <w:r>
-        <w:rPr>
-          <w:b w:val="0"/>
-          <w:i w:val="0"/>
-        </w:rPr>
-        <w:t xml:space="preserve"> en la tabla </w:t>
+      </w:r>
+      <w:r>
+        <w:rPr>
+          <w:b w:val="0"/>
+          <w:i w:val="0"/>
+        </w:rPr>
       </w:r>
       <w:r>
         <w:rPr>
@@ -8294,14 +8203,12 @@
           <w:b w:val="0"/>
           <w:i w:val="0"/>
         </w:rPr>
-        <w:t>leads</w:t>
-      </w:r>
-      <w:r>
-        <w:rPr>
-          <w:b w:val="0"/>
-          <w:i w:val="0"/>
-        </w:rPr>
-        <w:t>.</w:t>
+      </w:r>
+      <w:r>
+        <w:rPr>
+          <w:b w:val="0"/>
+          <w:i w:val="0"/>
+        </w:rPr>
       </w:r>
     </w:p>
     <w:p>
@@ -9485,7 +9392,7 @@
           <w:i/>
           <w:sz w:val="15"/>
         </w:rPr>
-        <w:t>Nota. Elaboración propia a partir del nodo Code - Scoring del flujo exportado (workflow/crm_postgres.json). Clasificación en niveles: score ≥ 70 → HOT; 40 ≤ score &lt; 70 → WARM; score &lt; 40 → COLD. El puntaje máximo alcanzable es 100. La fila de respaldo (8 puntos) es inalcanzable en el flujo real: el nodo Normalizar Lead traduce todo valor a la lista blanca antes de puntuar, de modo que un servicio que no reconoce recibe la ponderación de consultoria (12 puntos), la misma que la opción «Otro» (§4.3.1). Se la documenta por completitud del nodo de scoring leído de forma aislada.</w:t>
+        <w:t>Nota. Elaboración propia a partir del nodo Code - Scoring del flujo exportado (workflow/crm_postgres.json). Clasificación en niveles: score ≥ 70 → HOT; 40 ≤ score &lt; 70 → WARM; score &lt; 40 → COLD. El puntaje máximo alcanzable es 100. La fila de respaldo (8 puntos) es inalcanzable en el flujo real: el nodo Normalizar Lead traduce todo valor a la lista blanca antes de puntuar. Un servicio que no reconoce recibe, de este modo, la ponderación de consultoria (12 puntos), la misma que la opción «Otro» (§4.3.1). Se la documenta por completitud del nodo de scoring leído de forma aislada.</w:t>
       </w:r>
     </w:p>
     <w:p/>
@@ -9545,7 +9452,7 @@
           <w:b w:val="0"/>
           <w:i w:val="0"/>
         </w:rPr>
-        <w:t>El segundo es que un lead calificado como HOT o WARM quede sin que el profesional envíe la propuesta: el cálculo del puntaje precede a la inserción, de modo que todo lead se persiste ya calificado, pero desde que esa decisión pasó a depender de una acción manual desde el tablero (§4.3.2), el estado NUEVO ya no es solo el punto de partida del ciclo, sino también la sala de espera de toda propuesta pendiente de enviarse. Un proceso programado que detecte leads HOT o WARM sin propuesta enviada con antigüedad superior a un umbral resolvería el caso; se registra en el Capítulo 8. El sistema avisa por Telegram en el momento en que el lead queda a la espera y el tablero lo muestra en primer lugar con su recuento. Sin embargo, si el profesional no actúa, nadie vuelve a insistir: el riesgo de que una oportunidad calificada quede detenida es real y se declara aquí antes que en el capítulo de trabajos futuros.</w:t>
+        <w:t>El segundo es que un lead calificado como HOT o WARM quede sin que el profesional envíe la propuesta: el cálculo del puntaje precede a la inserción, de modo que todo lead se persiste ya calificado. Sin embargo, desde que esa decisión pasó a depender de una acción manual desde el tablero (§4.3.2), el estado NUEVO ya no es solo el punto de partida del ciclo, sino también la sala de espera de toda propuesta pendiente de enviarse. Un proceso programado que detecte leads HOT o WARM sin propuesta enviada con antigüedad superior a un umbral resolvería el caso; se registra en el Capítulo 8. El sistema avisa por Telegram en el momento en que el lead queda a la espera y el tablero lo muestra en primer lugar con su recuento. Sin embargo, si el profesional no actúa, nadie vuelve a insistir: el riesgo de que una oportunidad calificada quede detenida es real y se declara aquí antes que en el capítulo de trabajos futuros.</w:t>
       </w:r>
       <w:r>
         <w:rPr>
@@ -9862,7 +9769,7 @@
       <w:pPr/>
       <w:r>
         <w:rPr/>
-        <w:t>Los términos de la propuesta los fija el profesional. Un diseño alternativo, descartado, consistía en generar y enviar la propuesta automáticamente en cuanto el scoring clasificara al lead como HOT o WARM, tomando el importe de la columna presupuesto, es decir del valor que el propio interesado elige en el control deslizante del formulario público. Ese valor se habría convertido después en el monto de la factura, en el importe del comprobante en PDF y en el precio de la preferencia de cobro de MercadoPago, de modo que el sistema habría comprometido al profesional con un precio que él no fija en ningún punto del recorrido, contradiciendo la condición de la pregunta de investigación de automatizar «sin sacrificar el control del profesional sobre el proceso» (§1.3). El diseño adoptado evita ese resultado mediante el webhook POST /propuesta-enviar, invocado desde el tablero interno con la misma protección que el resto de las acciones internas: el lead calificado permanece en estado NUEVO y aparece en la sección «Propuestas por enviar», donde el profesional carga precio, plazo y alcance. El nodo Guardar Términos aplica una actualización condicional —UPDATE … WHERE estado = 'NUEVO' AND tier IN ('HOT','WARM')— del mismo tipo que la de la aceptación, de modo que repetir la petición no reabre una propuesta ya enviada, y a partir de ahí el flujo continúa por la cadena que ya existía. El presupuesto declarado se conserva intacto: sigue siendo la entrada del scoring y el registro de lo que el cliente dijo estar dispuesto a invertir, y el tablero lo muestra como referencia junto al campo de precio, pero no como valor por omisión.</w:t>
+        <w:t>Los términos de la propuesta los fija el profesional. Un diseño alternativo, descartado, consistía en generar y enviar la propuesta automáticamente en cuanto el scoring clasificara al lead como HOT o WARM, tomando el importe de la columna presupuesto, es decir del valor que el propio interesado elige en el control deslizante del formulario público. Ese valor se habría convertido después en el monto de la factura, en el importe del comprobante en PDF y en el precio de la preferencia de cobro de MercadoPago. De ese modo, el sistema habría comprometido al profesional con un precio que él no fija en ningún punto del recorrido, contradiciendo la condición de la pregunta de investigación de automatizar «sin sacrificar el control del profesional sobre el proceso» (§1.3). El diseño adoptado evita ese resultado mediante el webhook POST /propuesta-enviar, invocado desde el tablero interno con la misma protección que el resto de las acciones internas: el lead calificado permanece en estado NUEVO y aparece en la sección «Propuestas por enviar». Ahí el profesional carga precio, plazo y alcance. El nodo Guardar Términos aplica una actualización condicional —UPDATE … WHERE estado = 'NUEVO' AND tier IN ('HOT','WARM')— del mismo tipo que la de la aceptación, de modo que repetir la petición no reabre una propuesta ya enviada. A partir de ahí, el flujo continúa por la cadena que ya existía. El presupuesto declarado se conserva intacto: sigue siendo la entrada del scoring y el registro de lo que el cliente dijo estar dispuesto a invertir, y el tablero lo muestra como referencia junto al campo de precio, pero no como valor por omisión.</w:t>
       </w:r>
     </w:p>
     <w:p>
@@ -9880,7 +9787,7 @@
       <w:proofErr w:type="spellEnd"/>
       <w:r>
         <w:rPr/>
-        <w:t>Enviada la propuesta, el webhook /lead-acepta recibe el identificador del lead y el token. El nodo Validar Token comprueba la presencia de ambos parámetros y el nodo Buscar Lead consulta la tabla leads por identificador y por token de aceptación (accept_token), interpretado como valor de tipo UUID. Si el lead es válido, el nodo Marcar Aceptado lo actualiza al estado ACEPTADO y registra la fecha de aceptación; en caso contrario, se responde que el enlace ya fue procesado o es inválido, lo que impide la reutilización del token (OE3, RNF2). A partir de la aceptación, el flujo genera la página de confirmación que ve el cliente y, en paralelo, produce la factura en HTML, la convierte a PDF mediante el servicio Gotenberg (Figura 15, véase Anexo A), la envía por correo, la persiste con Insert Factura en la tabla facturas y actualiza el lead al estado FACTURADO. El evento se notifica por Telegram y se registra en Notion mediante peticiones HTTP a su API (Figura 9, véase Anexo A).</w:t>
+        <w:t>Enviada la propuesta, el webhook /lead-acepta recibe el identificador del lead y el token. El nodo Validar Token comprueba la presencia de ambos parámetros y el nodo Buscar Lead consulta la tabla leads por identificador y por token de aceptación (accept_token), interpretado como valor de tipo UUID. Si el lead es válido, el nodo Marcar Aceptado lo actualiza al estado ACEPTADO y registra la fecha de aceptación; en caso contrario, se responde que el enlace ya fue procesado o es inválido, lo que impide la reutilización del token (OE3, RNF2). A partir de la aceptación, el flujo genera la página de confirmación que ve el cliente y, en paralelo, produce la factura en HTML, la convierte a PDF mediante el servicio Gotenberg (Figura 15, véase Anexo A) y la envía por correo. Persiste la factura con Insert Factura en la tabla facturas y actualiza el lead al estado FACTURADO. El evento se notifica por Telegram y se registra en Notion mediante peticiones HTTP a su API (Figura 9, véase Anexo A).</w:t>
       </w:r>
     </w:p>
     <w:p>
@@ -10064,14 +9971,13 @@
           <w:b/>
           <w:i w:val="0"/>
         </w:rPr>
-        <w:t>Frontera transaccional.</w:t>
-      </w:r>
-      <w:r>
-        <w:rPr>
-          <w:b w:val="0"/>
-          <w:i w:val="0"/>
-        </w:rPr>
-        <w:t xml:space="preserve"> Esa atomicidad se limita, sin embargo, a un único nodo. Entre la transición a ACEPTADO y la persistencia de la factura median cuatro operaciones sobre servicios externos: la generación del HTML, la conversión a PDF por Gotenberg, el envío por correo y la inserción en la tabla </w:t>
+        <w:t>Frontera transaccional. Esa atomicidad se limita, sin embargo, a un único nodo. Entre la transición a ACEPTADO y la persistencia de la factura median cuatro operaciones sobre servicios externos: la generación del HTML, la conversión a PDF por Gotenberg, el envío por correo y la inserción en la tabla facturas. Ninguna de ellas participa de la transacción. Una falla intermedia deja el lead en ACEPTADO sin factura emitida y, por construcción del propio mecanismo de idempotencia, un reintento del cliente se deriva al nodo de operación nula: el resultado es una factura perdida sin recuperación automática. El sistema no implementa saga, compensación, reintento con retroceso exponencial ni cola de mensajes muertos; §4.3.6 solo prevé registrar el error y notificarlo por Telegram. La mitigación mínima —un proceso programado que detecte leads en ACEPTADO sin factura asociada y reintente la facturación de forma idempotente— se implementó el 27 de agosto de 2026 y se describe en §4.3.5. Conviene ser preciso sobre lo que cierra y lo que no: repara después de la falla en lugar de evitarla, de modo que la frontera transaccional sigue sin existir y la inconsistencia dura hasta media hora. Además, reemite el comprobante sin reenviar el correo con el PDF, que queda a cargo del proceso de recordatorios de pago en su siguiente pasada o del profesional, avisado por Telegram. La Figura 2 representa la secuencia completa y delimita el alcance de la transacción. El correo con el que la factura llega al cliente y el comprobante en PDF que lleva adjunto se reproducen en las Figuras 14 y 15 (véase Anexo A).</w:t>
+      </w:r>
+      <w:r>
+        <w:rPr>
+          <w:b w:val="0"/>
+          <w:i w:val="0"/>
+        </w:rPr>
       </w:r>
       <w:r>
         <w:rPr>
@@ -10079,21 +9985,18 @@
           <w:b w:val="0"/>
           <w:i w:val="0"/>
         </w:rPr>
-        <w:t>facturas</w:t>
-      </w:r>
-      <w:r>
-        <w:rPr>
-          <w:b w:val="0"/>
-          <w:i w:val="0"/>
-        </w:rPr>
-        <w:t>. Ninguna de ellas participa de la transacción. Una falla intermedia deja el lead en ACEPTADO sin factura emitida y, por construcción del propio mecanismo de idempotencia, un reintento del cliente se deriva al nodo de operación nula: el resultado es una factura perdida sin recuperación automática. El sistema no implementa saga, compensación, reintento con retroceso exponencial ni cola de mensajes muertos; §4.3.6 solo prevé registrar el error y notificarlo por Telegram. La mitigación mínima —un proceso programado que detecte leads en ACEPTADO sin factura asociada y reintente la facturación de forma idempotente— se implementó el 27 de agosto de 2026 y se describe en §4.3.5. Conviene ser preciso sobre lo que cierra y lo que no: repara después de la falla en lugar de evitarla, de modo que la frontera transaccional sigue sin existir y la inconsistencia dura hasta media hora; y reemite el comprobante sin reenviar el correo con el PDF, que queda a cargo del proceso de recordatorios de pago en su siguiente pasada o del profesional, avisado por Telegram. La Figura 2 representa la secuencia completa y delimita el alcance de la transacción.</w:t>
-      </w:r>
-      <w:r>
-        <w:rPr>
-          <w:b w:val="0"/>
-          <w:i w:val="0"/>
-        </w:rPr>
-        <w:t xml:space="preserve"> El correo con el que la factura llega al cliente y el comprobante en PDF que lleva adjunto se reproducen en las Figuras 14 y 15 (véase Anexo A).</w:t>
+      </w:r>
+      <w:r>
+        <w:rPr>
+          <w:b w:val="0"/>
+          <w:i w:val="0"/>
+        </w:rPr>
+      </w:r>
+      <w:r>
+        <w:rPr>
+          <w:b w:val="0"/>
+          <w:i w:val="0"/>
+        </w:rPr>
       </w:r>
     </w:p>
     <w:p>
@@ -10528,7 +10431,7 @@
           <w:b/>
           <w:i w:val="0"/>
         </w:rPr>
-        <w:t>Reconciliación de facturas (cada 30 minutos). Cierra la deuda S5 de la Tabla 11. Busca el lead más antiguo en estado ACEPTADO que no tenga factura asociada y cuya aceptación date de hace más de RECONCILIACION_GRACIA_MINUTOS —quince por defecto, para no pisar una aceptación todavía en curso—, y emite el comprobante que la cadena de facturación no llegó a persistir. Trabaja de a un lead por corrida, la misma unidad sobre la que razona la cadena de facturación normal. La emisión es idempotente por dos vías independientes: la inserción está condicionada a que no exista ya una factura para ese lead, y el identificador de la factura se deriva del propio lead, de modo que una segunda corrida chocaría además contra la restricción de unicidad. La factura recuperada no es de segunda categoría: nace PENDIENTE, lleva el precio que el profesional comprometió y el mismo enlace de pago que habría tenido de emitirse a tiempo, con lo que entra al proceso de recordatorios descrito más arriba. El proceso no depende del correo, y por eso sobrevive a una credencial de Gmail vencida: persiste, marca el lead como FACTURADO y avisa al profesional por Telegram.</w:t>
+        <w:t>Reconciliación de facturas (cada 30 minutos). Cierra la deuda S5 de la Tabla 11. Busca el lead más antiguo en estado ACEPTADO que no tenga factura asociada y cuya aceptación date de hace más de RECONCILIACION_GRACIA_MINUTOS —quince por defecto, para no pisar una aceptación todavía en curso—. Emite el comprobante que la cadena de facturación no llegó a persistir. Trabaja de a un lead por corrida, la misma unidad sobre la que razona la cadena de facturación normal. La emisión es idempotente por dos vías independientes: la inserción está condicionada a que no exista ya una factura para ese lead, y el identificador de la factura se deriva del propio lead, de modo que una segunda corrida chocaría además contra la restricción de unicidad. La factura recuperada no es de segunda categoría: nace PENDIENTE, lleva el precio que el profesional comprometió y el mismo enlace de pago que habría tenido de emitirse a tiempo, con lo que entra al proceso de recordatorios descrito más arriba. El proceso no depende del correo, y por eso sobrevive a una credencial de Gmail vencida: persiste, marca el lead como FACTURADO y avisa al profesional por Telegram.</w:t>
       </w:r>
     </w:p>
     <w:p>
@@ -20178,43 +20081,33 @@
     </w:p>
     <w:p>
       <w:r>
-        <w:t xml:space="preserve">Se destacan tres decisiones. Primera, el </w:t>
+        <w:t>Se destacan tres decisiones. Primera, el patrón de tres clientes de Supabase, que separa las responsabilidades de navegador, servidor y capa de proxy —esta última también en el entorno de Node.js, no en el borde (§4.2.3)—. Esto está en línea con el modelo de renderizado híbrido de Next.js. Segunda, la degradación defensiva ante la ausencia de variables de entorno, que privilegia la resiliencia del despliegue. Tercera, la elección de tiempo real por suscripción frente al sondeo periódico para el tablero, que reduce la latencia de actualización y el consumo innecesario de recursos.</w:t>
       </w:r>
       <w:r>
         <w:rPr>
           <w:b/>
         </w:rPr>
-        <w:t xml:space="preserve">patrón de tres clientes de </w:t>
       </w:r>
       <w:proofErr w:type="spellStart"/>
       <w:r>
         <w:rPr>
           <w:b/>
         </w:rPr>
-        <w:t>Supabase</w:t>
       </w:r>
       <w:proofErr w:type="spellEnd"/>
-      <w:r>
-        <w:t xml:space="preserve">, que separa las responsabilidades de navegador, servidor y capa de proxy —esta última también en el entorno de Node.js, no en el borde (§4.2.3)—, en línea con el modelo de renderizado híbrido de Next.js. Segunda, la </w:t>
-      </w:r>
+      <w:r/>
       <w:r>
         <w:rPr>
           <w:b/>
         </w:rPr>
-        <w:t>degradación defensiva</w:t>
-      </w:r>
-      <w:r>
-        <w:t xml:space="preserve"> ante la ausencia de variables de entorno, que privilegia la resiliencia del despliegue. Tercera, la elección de </w:t>
-      </w:r>
+      </w:r>
+      <w:r/>
       <w:r>
         <w:rPr>
           <w:b/>
         </w:rPr>
-        <w:t>tiempo real por suscripción</w:t>
-      </w:r>
-      <w:r>
-        <w:t xml:space="preserve"> frente al sondeo periódico para el tablero, que reduce la latencia de actualización y el consumo innecesario de recursos.</w:t>
-      </w:r>
+      </w:r>
+      <w:r/>
     </w:p>
     <w:p>
       <w:pPr>
@@ -22493,7 +22386,7 @@
       <w:proofErr w:type="spellStart"/>
       <w:proofErr w:type="spellEnd"/>
       <w:r>
-        <w:t>El escenario E14 merece una explicación aparte, porque su ejecución siguió un camino distinto del resto. El 27 de agosto de 2026 se intentó activar credenciales de prueba en el panel de desarrolladores de MercadoPago para la aplicación registrada del proyecto. La activación falló de forma consistente con un error 422 del propio backend del proveedor (endpoint interno testUserAutomation/create), sin devolver un motivo específico. Se descartó que fuera un problema de la cuenta o de la aplicación: el mismo error se reprodujo creando una cuenta de prueba vendedor nueva y probando desde la cuenta de un tercero independiente, y el patrón —una falla intermitente de la activación de usuarios de prueba en el entorno de sandbox— está documentado en reportes de otros desarrolladores en foros públicos de MercadoPago. La causa es, por lo tanto, del proveedor y no del artefacto.</w:t>
+        <w:t>El escenario E14 merece una explicación aparte, porque su ejecución siguió un camino distinto del resto. El 27 de agosto de 2026 se intentó activar credenciales de prueba en el panel de desarrolladores de MercadoPago para la aplicación registrada del proyecto. La activación falló de forma consistente con un error 422 del propio backend del proveedor (endpoint interno testUserAutomation/create), sin devolver un motivo específico. Se descartó que fuera un problema de la cuenta o de la aplicación: el mismo error se reprodujo creando una cuenta de prueba vendedor nueva y probando desde la cuenta de un tercero independiente. El patrón —una falla intermitente de la activación de usuarios de prueba en el entorno de sandbox— está documentado en reportes de otros desarrolladores en foros públicos de MercadoPago. La causa es, por lo tanto, del proveedor y no del artefacto.</w:t>
       </w:r>
     </w:p>
     <w:p>
@@ -24146,7 +24039,7 @@
         <w:rPr>
           <w:b/>
         </w:rPr>
-        <w:t>El sistema tenía deudas de seguridad conocidas; cuatro se cerraron o se mitigaron en el camino y las demás siguen abiertas. La Tabla 11 las enumera. La primera, por su consecuencia de negocio, era que el modo de desarrollo del webhook de pago seguía siendo alcanzable incluso con MercadoPago real configurado: permitía confirmar una factura como cobrada sin pago real de por medio (S2). Se cerró el 23-ago-2026 agregando una verificación que rechaza esa vía en cuanto hay credenciales de MercadoPago activas. La segunda fue el incidente de credenciales de Supabase (S7, §6.3), cerrado el 27-ago-2026 con la rotación de la service_role key y la deshabilitación de las claves JWT legacy. Las otras dos se cerraron el mismo 27 de agosto, y son las dos que la propia tabla declaraba junto con su remedio: la captación dejó de admitir envíos duplicados —deduplicación por correo dentro de una ventana configurable, más el bloqueo del envío en el formulario (S6)—, y la facturación dejó de perder comprobantes ante una falla intermedia, gracias a un proceso programado de reconciliación idempotente (S5). De esta última queda pendiente la frontera transaccional propiamente dicha, porque lo incorporado repara después de la falla en vez de evitarla. La deuda más amplia sigue abierta, aunque se redujo: seis de los trece webhooks no autentican el origen de la invocación. La proporción mejoró en el camino: el cierre de proyecto y el envío de la propuesta pasaron a ser acciones del tablero y adoptaron el Header Auth del resto del panel. Esta última no impide la demostración de viabilidad técnica, pero sí impide el uso con clientes reales.</w:t>
+        <w:t>El sistema tenía deudas de seguridad conocidas; cuatro se cerraron o se mitigaron en el camino y las demás siguen abiertas. La Tabla 11 las enumera. La primera, por su consecuencia de negocio, era que el modo de desarrollo del webhook de pago seguía siendo alcanzable incluso con MercadoPago real configurado: permitía confirmar una factura como cobrada sin pago real de por medio (S2). Se cerró el 23-ago-2026 agregando una verificación que rechaza esa vía en cuanto hay credenciales de MercadoPago activas. La segunda fue el incidente de credenciales de Supabase (S7, §6.3), cerrado el 27-ago-2026 con la rotación de la service_role key y la deshabilitación de las claves JWT legacy. Las otras dos se cerraron el mismo 27 de agosto, y son las dos que la propia tabla declaraba junto con su remedio: la captación dejó de admitir envíos duplicados —deduplicación por correo dentro de una ventana configurable, más el bloqueo del envío en el formulario (S6)—. Además, la facturación dejó de perder comprobantes ante una falla intermedia, gracias a un proceso programado de reconciliación idempotente (S5). De esta última queda pendiente la frontera transaccional propiamente dicha, porque lo incorporado repara después de la falla en vez de evitarla. La deuda más amplia sigue abierta, aunque se redujo: seis de los trece webhooks no autentican el origen de la invocación. La proporción mejoró en el camino: el cierre de proyecto y el envío de la propuesta pasaron a ser acciones del tablero y adoptaron el Header Auth del resto del panel. Esta última no impide la demostración de viabilidad técnica, pero sí impide el uso con clientes reales.</w:t>
       </w:r>
     </w:p>
     <w:p>
@@ -24157,7 +24050,7 @@
         <w:rPr>
           <w:b/>
         </w:rPr>
-        <w:t>El sistema opera fuera de dos marcos normativos aplicables. El comprobante que genera no cumple los requisitos del régimen de facturación electrónica argentino y el tratamiento de datos de contacto de personas identificables no contempla la Ley 25.326; la transferencia de esos datos a encargados domiciliados en países que la Disposición 60-E/2016 no reconoce como de protección adecuada agrega, sobre lo anterior, el régimen del art. 12 de esa ley (§2.9 y §1.7). Ambas dimensiones son directamente aplicables al artefacto y su omisión es una limitación del trabajo, no una decisión de alcance neutra: acota su validez a un entorno de prueba con datos ficticios y excluye la operación con clientes reales hasta que se satisfagan.</w:t>
+        <w:t>El sistema opera fuera de dos marcos normativos aplicables. El comprobante que genera no cumple los requisitos del régimen de facturación electrónica argentino y el tratamiento de datos de contacto de personas identificables no contempla la Ley 25.326. A eso se suma que la transferencia de esos datos a encargados domiciliados en países que la Disposición 60-E/2016 no reconoce como de protección adecuada agrega el régimen del art. 12 de esa ley (§2.9 y §1.7). Ambas dimensiones son directamente aplicables al artefacto y su omisión es una limitación del trabajo, no una decisión de alcance neutra: acota su validez a un entorno de prueba con datos ficticios y excluye la operación con clientes reales hasta que se satisfagan.</w:t>
       </w:r>
     </w:p>
     <w:p>
@@ -24405,16 +24298,13 @@
         <w:rPr>
           <w:b/>
         </w:rPr>
-        <w:t>OE5.</w:t>
-      </w:r>
-      <w:r>
-        <w:t xml:space="preserve"> Se incorporaron los procesos programados de seguimiento, recordatorio de pago y reporte diario. </w:t>
-      </w:r>
+        <w:t>OE5. Se incorporaron los procesos programados de seguimiento, recordatorio de pago y reporte diario. Cumplido. El seguimiento y los recordatorios de pago se ejercitaron manualmente el 23-ago-2026 (E11, E12), lo que reveló y permitió corregir tres defectos reales. El reporte diario (E13) se ejecutó el 28-ago-2026 contra el sistema real: la API de Telegram confirmó la entrega (ok = true, message_id = 594) y los indicadores del mensaje coinciden con los de la vista metrics_mensuales (Capítulo 5). Subsiste, dentro de los dos primeros, la cobertura parcial que declaran los requisitos RF8 y RF9: la transición a PERDIDO del tercer seguimiento y el escalón RECORDATORIO de los vencimientos no se ejercitaron por falta de datos de prueba en ese rango.</w:t>
+      </w:r>
+      <w:r/>
       <w:r>
         <w:rPr>
           <w:b/>
         </w:rPr>
-        <w:t>Cumplido. El seguimiento y los recordatorios de pago se ejercitaron manualmente el 23-ago-2026 (E11, E12), lo que reveló y permitió corregir tres defectos reales, y el reporte diario (E13) se ejecutó el 28-ago-2026 contra el sistema real: la API de Telegram confirmó la entrega (ok = true, message_id = 594) y los indicadores del mensaje coinciden con los de la vista metrics_mensuales (Capítulo 5). Subsiste, dentro de los dos primeros, la cobertura parcial que declaran los requisitos RF8 y RF9: la transición a PERDIDO del tercer seguimiento y el escalón RECORDATORIO de los vencimientos no se ejercitaron por falta de datos de prueba en ese rango.</w:t>
       </w:r>
     </w:p>
     <w:p>
@@ -24696,7 +24586,7 @@
         <w:rPr>
           <w:b/>
         </w:rPr>
-        <w:t>5. Completar el cumplimiento normativo. Es condición previa a operar con clientes reales, no una mejora opcional (§2.9). En materia de datos personales: incorporar al formulario el aviso del art. 6 de la Ley 25.326 —finalidad, destinatarios, identidad del responsable, carácter de cada respuesta y derechos de acceso, rectificación y supresión— con consentimiento expreso y separado para la cesión a terceros (art. 11) y para la transferencia internacional (art. 12), o bien suscribir las cláusulas contractuales tipo de la Disposición 60-E/2016 con cada encargado domiciliado fuera de los países de protección adecuada; definir una política de retención que opere la supresión que exige el art. 4.7; e inscribir la base ante la Agencia de Acceso a la Información Pública (art. 21). En materia fiscal: integrar el servicio web de ARCA para solicitar el CAE de cada comprobante y completar CUIT, punto de venta, tipo de comprobante y numeración correlativa, de modo que el documento deje de ser un comprobante interno y pase a tener validez fiscal.</w:t>
+        <w:t>5. Completar el cumplimiento normativo. Es condición previa a operar con clientes reales, no una mejora opcional (§2.9). En materia de datos personales, corresponde incorporar al formulario el aviso del art. 6 de la Ley 25.326 —finalidad, destinatarios, identidad del responsable, carácter de cada respuesta y derechos de acceso, rectificación y supresión— con consentimiento expreso y separado para la cesión a terceros (art. 11) y para la transferencia internacional (art. 12), o bien suscribir las cláusulas contractuales tipo de la Disposición 60-E/2016 con cada encargado domiciliado fuera de los países de protección adecuada. Falta además definir una política de retención que opere la supresión que exige el art. 4.7, e inscribir la base ante la Agencia de Acceso a la Información Pública (art. 21). En materia fiscal: integrar el servicio web de ARCA para solicitar el CAE de cada comprobante y completar CUIT, punto de venta, tipo de comprobante y numeración correlativa, de modo que el documento deje de ser un comprobante interno y pase a tener validez fiscal.</w:t>
       </w:r>
     </w:p>
     <w:p>
@@ -24705,7 +24595,7 @@
         <w:rPr>
           <w:b/>
         </w:rPr>
-        <w:t>6. Cerrar lo que queda de la integración de pagos. La pasarela de pago real ya está integrada (MercadoPago, §4.3.3) y su rama de cobro está verificada contra un doble de prueba (escenario E14). Quedan tres tareas: repetir esa verificación contra el servicio real cuando la activación de credenciales de prueba del proveedor vuelva a estar disponible, que es lo único que la corrida actual no puede acreditar; habilitar por defecto la validación de firma del webhook (MP_WEBHOOK_SECRET), hoy opcional; y evaluar el split de pagos vía la API de Marketplace de MercadoPago cuando el sistema pase a operar con más de un profesional cobrando a cuentas distintas (§4.5).</w:t>
+        <w:t>6. Cerrar lo que queda de la integración de pagos. La pasarela de pago real ya está integrada (MercadoPago, §4.3.3) y su rama de cobro está verificada contra un doble de prueba (escenario E14). Quedan tres tareas. La primera es repetir esa verificación contra el servicio real cuando la activación de credenciales de prueba del proveedor vuelva a estar disponible, que es lo único que la corrida actual no puede acreditar. Las otras dos son habilitar por defecto la validación de firma del webhook (MP_WEBHOOK_SECRET), hoy opcional, y evaluar el split de pagos vía la API de Marketplace de MercadoPago cuando el sistema pase a operar con más de un profesional cobrando a cuentas distintas (§4.5).</w:t>
       </w:r>
     </w:p>
     <w:p>

</xml_diff>

<commit_message>
docs(tesis): recapturar la Figura 17 a resolucion nativa (C12)
La Figura 17 estaba incrustada a 608x320 px sobre 13,21 cm de ancho (~117 DPI),
reescalada de un recorte de baja resolucion que solo mostraba el mensaje de
error sin contexto. El dictamen v2 la marca como ilegible.

Se recapturo sobre el formulario vigente con deviceScaleFactor 2: 2528x940 px
sobre el mismo ancho de 13,21 cm, es decir ~486 DPI. La captura ahora muestra el
mensaje de validacion junto a los campos que lo provocan.

Los datos de la captura respetan el protocolo de la Tabla 4 (nombre "A",
cliente.demo@ejemplo): no hay datos personales reales.

Se ajusto el alto del extent para conservar la relacion de aspecto y evitar que
Word deforme la imagen.
</commit_message>
<xml_diff>
--- a/FormularioLeads/tesis.docx
+++ b/FormularioLeads/tesis.docx
@@ -26872,7 +26872,7 @@
       <w:r>
         <w:drawing>
           <wp:inline xmlns:a="http://schemas.openxmlformats.org/drawingml/2006/main" xmlns:pic="http://schemas.openxmlformats.org/drawingml/2006/picture">
-            <wp:extent cx="4754880" cy="2502568"/>
+            <wp:extent cx="4754880" cy="1768033"/>
             <wp:docPr id="47" name="Picture 47"/>
             <wp:cNvGraphicFramePr>
               <a:graphicFrameLocks noChangeAspect="1"/>
@@ -26893,7 +26893,7 @@
                   <pic:spPr>
                     <a:xfrm>
                       <a:off x="0" y="0"/>
-                      <a:ext cx="4754880" cy="2502568"/>
+                      <a:ext cx="4754880" cy="1768033"/>
                     </a:xfrm>
                     <a:prstGeom prst="rect"/>
                   </pic:spPr>

</xml_diff>